<commit_message>
docs: memoria final, resumen ejecutivo y correcciones
</commit_message>
<xml_diff>
--- a/docs/Carlos_Calderon_Illescas_Modelado_Predictivo_Siniestros_Viales_Guatemala.docx
+++ b/docs/Carlos_Calderon_Illescas_Modelado_Predictivo_Siniestros_Viales_Guatemala.docx
@@ -42,23 +42,7 @@
               <w:rStyle w:val="ClarkdownMuted"/>
               <w:lang w:val="es-GT"/>
             </w:rPr>
-            <w:t xml:space="preserve">Trabajo Fin de Máster — Máster en Big Data, Data </w:t>
-          </w:r>
-          <w:proofErr w:type="spellStart"/>
-          <w:r>
-            <w:rPr>
-              <w:rStyle w:val="ClarkdownMuted"/>
-              <w:lang w:val="es-GT"/>
-            </w:rPr>
-            <w:t>Science</w:t>
-          </w:r>
-          <w:proofErr w:type="spellEnd"/>
-          <w:r>
-            <w:rPr>
-              <w:rStyle w:val="ClarkdownMuted"/>
-              <w:lang w:val="es-GT"/>
-            </w:rPr>
-            <w:t xml:space="preserve"> e Inteligencia Artificial</w:t>
+            <w:t>Trabajo Fin de Máster — Máster en Big Data, Data Science e Inteligencia Artificial</w:t>
           </w:r>
           <w:r>
             <w:rPr>
@@ -111,21 +95,11 @@
       </w:pPr>
       <w:bookmarkStart w:id="1" w:name="ndice_de_contenidos"/>
       <w:bookmarkStart w:id="2" w:name="_Toc240103720"/>
-      <w:proofErr w:type="spellStart"/>
-      <w:r>
-        <w:t>Índice</w:t>
-      </w:r>
-      <w:proofErr w:type="spellEnd"/>
-      <w:r>
-        <w:t xml:space="preserve"> de </w:t>
-      </w:r>
-      <w:proofErr w:type="spellStart"/>
-      <w:r>
-        <w:t>Contenidos</w:t>
+      <w:r>
+        <w:t>Índice de Contenidos</w:t>
       </w:r>
       <w:bookmarkEnd w:id="1"/>
       <w:bookmarkEnd w:id="2"/>
-      <w:proofErr w:type="spellEnd"/>
     </w:p>
     <w:p>
       <w:pPr>
@@ -220,7 +194,7 @@
             <w:rStyle w:val="Hipervnculo"/>
             <w:noProof/>
           </w:rPr>
-          <w:t xml:space="preserve">Resumen Ejecutivo</w:t>
+          <w:t>Resumen Ejecutivo</w:t>
         </w:r>
         <w:r>
           <w:rPr>
@@ -1784,7 +1758,7 @@
             <w:rStyle w:val="Hipervnculo"/>
             <w:noProof/>
           </w:rPr>
-          <w:t xml:space="preserve">5.3. Implicaciones para la toma de decisiones</w:t>
+          <w:t>5.3. Implicaciones para la toma de decisiones</w:t>
         </w:r>
         <w:r>
           <w:rPr>
@@ -2737,24 +2711,21 @@
           <w:lang w:val="es-GT"/>
         </w:rPr>
       </w:pPr>
-      <w:bookmarkStart w:id="3" w:name="captulo_1_introduccin_y_contexto_de_nego"/>
-      <w:bookmarkStart w:id="4" w:name="_Toc240103721"/>
-      <w:r xml:space="preserve">
-        <w:rPr>
-          <w:lang w:val="es-GT"/>
-        </w:rPr>
+      <w:r>
+        <w:rPr>
+          <w:lang w:val="es-GT"/>
+        </w:rPr>
+        <w:lastRenderedPageBreak/>
         <w:t>Resumen Ejecutivo</w:t>
       </w:r>
-      <w:bookmarkEnd w:id="3"/>
-      <w:bookmarkEnd w:id="4"/>
-    </w:p>
-    <w:p>
-      <w:pPr>
-        <w:rPr>
-          <w:lang w:val="es-GT"/>
-        </w:rPr>
-      </w:pPr>
-      <w:r xml:space="preserve">
+    </w:p>
+    <w:p>
+      <w:pPr>
+        <w:rPr>
+          <w:lang w:val="es-GT"/>
+        </w:rPr>
+      </w:pPr>
+      <w:r>
         <w:rPr>
           <w:lang w:val="es-GT"/>
         </w:rPr>
@@ -2767,20 +2738,26 @@
           <w:lang w:val="es-GT"/>
         </w:rPr>
       </w:pPr>
-      <w:r xml:space="preserve">
-        <w:rPr>
-          <w:lang w:val="es-GT"/>
-        </w:rPr>
-        <w:t>Qué se construyó. Un clasificador LightGBM entrenado sobre 2018–2023 y evaluado una sola vez sobre 2024, un año completo que no intervino en ninguna decisión de modelado. Sobre ese holdout: ROC-AUC 0.740, recall 67.8% sobre la clase fatal, precisión 35.7% y PR-AUC 0.469 frente a una tasa base de 19.1%. En términos operativos, el modelo identifica correctamente a dos de cada tres víctimas mortales sin necesidad de recolectar ninguna variable nueva.</w:t>
-      </w:r>
-    </w:p>
-    <w:p>
-      <w:pPr>
-        <w:rPr>
-          <w:lang w:val="es-GT"/>
-        </w:rPr>
-      </w:pPr>
-      <w:r xml:space="preserve">
+      <w:r>
+        <w:rPr>
+          <w:lang w:val="es-GT"/>
+        </w:rPr>
+        <w:t>El resultado, u</w:t>
+      </w:r>
+      <w:r>
+        <w:rPr>
+          <w:lang w:val="es-GT"/>
+        </w:rPr>
+        <w:t>n clasificador LightGBM entrenado sobre 2018–2023 y evaluado una sola vez sobre 2024, un año completo que no intervino en ninguna decisión de modelado. Sobre ese holdout: ROC-AUC 0.740, recall 67.8% sobre la clase fatal, precisión 35.7% y PR-AUC 0.469 frente a una tasa base de 19.1%. En términos operativos, el modelo identifica correctamente a dos de cada tres víctimas mortales sin necesidad de recolectar ninguna variable nueva.</w:t>
+      </w:r>
+    </w:p>
+    <w:p>
+      <w:pPr>
+        <w:rPr>
+          <w:lang w:val="es-GT"/>
+        </w:rPr>
+      </w:pPr>
+      <w:r>
         <w:rPr>
           <w:lang w:val="es-GT"/>
         </w:rPr>
@@ -2795,15 +2772,23 @@
           <w:numId w:val="1"/>
         </w:numPr>
         <w:rPr>
-          <w:lang w:val="es-GT"/>
-        </w:rPr>
-      </w:pPr>
-      <w:r xml:space="preserve">
-        <w:rPr>
-          <w:b/>
-          <w:lang w:val="es-GT"/>
-        </w:rPr>
-        <w:t>La prioridad no está donde está el volumen. El departamento de Guatemala concentra el mayor número de siniestros del país y registra la tasa de fatalidad más baja (12.9%); Petén (34.6%), Izabal (34.2%) y Zacapa (27.4%) casi la triplican. Asignar recursos por tasa en lugar de por volumen reordena por completo el mapa de la prevención.</w:t>
+          <w:bCs/>
+          <w:lang w:val="es-GT"/>
+        </w:rPr>
+      </w:pPr>
+      <w:r>
+        <w:rPr>
+          <w:b/>
+          <w:lang w:val="es-GT"/>
+        </w:rPr>
+        <w:t>La prioridad no está donde está el volumen.</w:t>
+      </w:r>
+      <w:r>
+        <w:rPr>
+          <w:bCs/>
+          <w:lang w:val="es-GT"/>
+        </w:rPr>
+        <w:t xml:space="preserve"> El departamento de Guatemala concentra el mayor número de siniestros del país y registra la tasa de fatalidad más baja (12.9%); Petén (34.6%), Izabal (34.2%) y Zacapa (27.4%) casi la triplican. Asignar recursos por tasa en lugar de por volumen reordena por completo el mapa de la prevención.</w:t>
       </w:r>
     </w:p>
     <w:p>
@@ -2814,15 +2799,23 @@
           <w:numId w:val="1"/>
         </w:numPr>
         <w:rPr>
-          <w:lang w:val="es-GT"/>
-        </w:rPr>
-      </w:pPr>
-      <w:r xml:space="preserve">
-        <w:rPr>
-          <w:b/>
-          <w:lang w:val="es-GT"/>
-        </w:rPr>
-        <w:t>El evento más frecuente es el menos letal. La colisión —38,403 casos— termina en fallecimiento en el 14.0% de los casos, frente al 26.5% del atropello y el 30.1% del derrape: en una colisión el otro vehículo absorbe parte del impacto, mientras que el peatón queda desprotegido.</w:t>
+          <w:bCs/>
+          <w:lang w:val="es-GT"/>
+        </w:rPr>
+      </w:pPr>
+      <w:r>
+        <w:rPr>
+          <w:b/>
+          <w:lang w:val="es-GT"/>
+        </w:rPr>
+        <w:t>El evento más frecuente es el menos letal</w:t>
+      </w:r>
+      <w:r>
+        <w:rPr>
+          <w:bCs/>
+          <w:lang w:val="es-GT"/>
+        </w:rPr>
+        <w:t>. La colisión —38,403 casos— termina en fallecimiento en el 14.0% de los casos, frente al 26.5% del atropello y el 30.1% del derrape: en una colisión el otro vehículo absorbe parte del impacto, mientras que el peatón queda desprotegido.</w:t>
       </w:r>
     </w:p>
     <w:p>
@@ -2833,24 +2826,32 @@
           <w:numId w:val="1"/>
         </w:numPr>
         <w:rPr>
-          <w:lang w:val="es-GT"/>
-        </w:rPr>
-      </w:pPr>
-      <w:r xml:space="preserve">
-        <w:rPr>
-          <w:b/>
-          <w:lang w:val="es-GT"/>
-        </w:rPr>
-        <w:t>La motocicleta no es el vehículo más letal, pero sí el que más muertes acumula. Su tasa por siniestro (~18%) está por debajo de la del camión (~28%) y el automóvil (~20%), y aun así concentra el 51.1% de todos los fallecidos. Es exposición, no letalidad unitaria; confundir ambas cifras lleva a políticas equivocadas.</w:t>
-      </w:r>
-    </w:p>
-    <w:p>
-      <w:pPr>
-        <w:rPr>
-          <w:lang w:val="es-GT"/>
-        </w:rPr>
-      </w:pPr>
-      <w:r xml:space="preserve">
+          <w:bCs/>
+          <w:lang w:val="es-GT"/>
+        </w:rPr>
+      </w:pPr>
+      <w:r>
+        <w:rPr>
+          <w:b/>
+          <w:lang w:val="es-GT"/>
+        </w:rPr>
+        <w:t>La motocicleta no es el vehículo más letal,</w:t>
+      </w:r>
+      <w:r>
+        <w:rPr>
+          <w:bCs/>
+          <w:lang w:val="es-GT"/>
+        </w:rPr>
+        <w:t xml:space="preserve"> pero sí el que más muertes acumula. Su tasa por siniestro (~18%) está por debajo de la del camión (~28%) y el automóvil (~20%), y aun así concentra el 51.1% de todos los fallecidos. Es exposición, no letalidad unitaria; confundir ambas cifras lleva a políticas equivocadas.</w:t>
+      </w:r>
+    </w:p>
+    <w:p>
+      <w:pPr>
+        <w:rPr>
+          <w:lang w:val="es-GT"/>
+        </w:rPr>
+      </w:pPr>
+      <w:r>
         <w:rPr>
           <w:lang w:val="es-GT"/>
         </w:rPr>
@@ -2863,7 +2864,7 @@
           <w:lang w:val="es-GT"/>
         </w:rPr>
       </w:pPr>
-      <w:r xml:space="preserve">
+      <w:r>
         <w:rPr>
           <w:lang w:val="es-GT"/>
         </w:rPr>
@@ -2876,7 +2877,7 @@
           <w:lang w:val="es-GT"/>
         </w:rPr>
       </w:pPr>
-      <w:r xml:space="preserve">
+      <w:r>
         <w:rPr>
           <w:lang w:val="es-GT"/>
         </w:rPr>
@@ -2896,7 +2897,6 @@
         <w:rPr>
           <w:lang w:val="es-GT"/>
         </w:rPr>
-        <w:lastRenderedPageBreak/>
         <w:t>Capítulo 1: Introducción y Contexto de Negocio</w:t>
       </w:r>
       <w:bookmarkEnd w:id="3"/>
@@ -2926,20 +2926,27 @@
           <w:lang w:val="es-GT"/>
         </w:rPr>
       </w:pPr>
-      <w:r xml:space="preserve">
-        <w:rPr>
-          <w:lang w:val="es-GT"/>
-        </w:rPr>
-        <w:t>La siniestralidad vial es una de las principales problemáticas de salud pública, seguridad ciudadana y exposición económica en Guatemala. El parque vehicular ha crecido con un desplazamiento marcado hacia los vehículos de dos ruedas: según la SAT, en mayo de 2024 había 5,497,829 vehículos activos, de los cuales 2,615,117 —el 47.6%— eran motocicletas, que ya superan en número a los de cuatro ruedas (SAT, 2024). Ese perfil de movilidad, combinado con limitaciones de infraestructura y conductas de riesgo, sitúa a los accidentes de tránsito entre las causas más frecuentes de lesiones graves y mortales del país.</w:t>
-      </w:r>
-    </w:p>
-    <w:p>
-      <w:pPr>
-        <w:rPr>
-          <w:lang w:val="es-GT"/>
-        </w:rPr>
-      </w:pPr>
-      <w:r xml:space="preserve">
+      <w:r>
+        <w:rPr>
+          <w:lang w:val="es-GT"/>
+        </w:rPr>
+        <w:t xml:space="preserve">La siniestralidad vial es una de las principales problemáticas de salud pública, seguridad ciudadana y exposición económica en Guatemala. El parque vehicular ha crecido con un desplazamiento marcado hacia los vehículos de dos ruedas: según la SAT, en mayo de 2024 había 5,497,829 vehículos activos, de los cuales 2,615,117 —el 47.6%— eran motocicletas, que </w:t>
+      </w:r>
+      <w:r>
+        <w:rPr>
+          <w:lang w:val="es-GT"/>
+        </w:rPr>
+        <w:lastRenderedPageBreak/>
+        <w:t>ya superan en número a los de cuatro ruedas (SAT, 2024). Ese perfil de movilidad, combinado con limitaciones de infraestructura y conductas de riesgo, sitúa a los accidentes de tránsito entre las causas más frecuentes de lesiones graves y mortales del país.</w:t>
+      </w:r>
+    </w:p>
+    <w:p>
+      <w:pPr>
+        <w:rPr>
+          <w:lang w:val="es-GT"/>
+        </w:rPr>
+      </w:pPr>
+      <w:r>
         <w:rPr>
           <w:lang w:val="es-GT"/>
         </w:rPr>
@@ -3107,8 +3114,6 @@
         </w:rPr>
         <w:t>Ese potencial privado no se limita a la suscripción tradicional de pólizas. El mercado asegurador vehicular guatemalteco tarifica hoy por edad del conductor, historial de siniestros, valor y uso del vehículo y presencia de rastreador GPS, pero no por ubicación de manejo ni por marca o modelo (Cuánto Me Cuesta, 2026) — a diferencia de mercados más maduros, que ya incorporan tarificación por geolocalización o telemática. Un score de probabilidad de fatalidad sienta las bases para explorar esa vía, y resulta igualmente relevante para las empresas de renta de vehículos, que podrían dimensionar su exposición al entregar una unidad. Este trabajo no calcula impacto económico en moneda —eso exigiría curvas de costo por siniestro (Capítulo 7.3)—, pero la probabilidad y el nivel de riesgo que sí produce (Capítulo 6.2) son el insumo directo de ese cálculo.</w:t>
       </w:r>
-      <w:proofErr w:type="spellStart"/>
-      <w:proofErr w:type="spellEnd"/>
     </w:p>
     <w:p>
       <w:pPr>
@@ -3123,7 +3128,6 @@
         <w:rPr>
           <w:lang w:val="es-GT"/>
         </w:rPr>
-        <w:lastRenderedPageBreak/>
         <w:t>1.3. Objetivos del TFM</w:t>
       </w:r>
       <w:bookmarkEnd w:id="9"/>
@@ -3150,33 +3154,11 @@
       </w:r>
     </w:p>
     <w:p>
-      <w:proofErr w:type="spellStart"/>
-      <w:r>
-        <w:rPr>
-          <w:b/>
-        </w:rPr>
-        <w:t>Objetivos</w:t>
-      </w:r>
-      <w:proofErr w:type="spellEnd"/>
-      <w:r>
-        <w:rPr>
-          <w:b/>
-        </w:rPr>
-        <w:t xml:space="preserve"> </w:t>
-      </w:r>
-      <w:proofErr w:type="spellStart"/>
-      <w:r>
-        <w:rPr>
-          <w:b/>
-        </w:rPr>
-        <w:t>Específicos</w:t>
-      </w:r>
-      <w:proofErr w:type="spellEnd"/>
-      <w:r>
-        <w:rPr>
-          <w:b/>
-        </w:rPr>
-        <w:t>:</w:t>
+      <w:r>
+        <w:rPr>
+          <w:b/>
+        </w:rPr>
+        <w:t>Objetivos Específicos:</w:t>
       </w:r>
     </w:p>
     <w:p>
@@ -3248,6 +3230,7 @@
         <w:rPr>
           <w:lang w:val="es-GT"/>
         </w:rPr>
+        <w:lastRenderedPageBreak/>
         <w:t>Aplicar técnicas de Inteligencia Artificial Explicable (XAI) mediante valores SHAP para interpretar los factores determinantes en la gravedad del evento.</w:t>
       </w:r>
     </w:p>
@@ -3266,21 +3249,7 @@
         <w:rPr>
           <w:lang w:val="es-GT"/>
         </w:rPr>
-        <w:t xml:space="preserve">Explorar el diseño de una herramienta interactiva de simulación de riesgo como línea de trabajo de </w:t>
-      </w:r>
-      <w:proofErr w:type="spellStart"/>
-      <w:r>
-        <w:rPr>
-          <w:lang w:val="es-GT"/>
-        </w:rPr>
-        <w:t>productivización</w:t>
-      </w:r>
-      <w:proofErr w:type="spellEnd"/>
-      <w:r>
-        <w:rPr>
-          <w:lang w:val="es-GT"/>
-        </w:rPr>
-        <w:t>.</w:t>
+        <w:t>Explorar el diseño de una herramienta interactiva de simulación de riesgo como línea de trabajo de productivización.</w:t>
       </w:r>
     </w:p>
     <w:p>
@@ -3375,7 +3344,7 @@
           <w:lang w:val="es-GT"/>
         </w:rPr>
       </w:pPr>
-      <w:r xml:space="preserve">
+      <w:r>
         <w:rPr>
           <w:b/>
           <w:lang w:val="es-GT"/>
@@ -3476,17 +3445,8 @@
           <w:b/>
           <w:lang w:val="es-GT"/>
         </w:rPr>
-        <w:t xml:space="preserve">Creative Commons </w:t>
-      </w:r>
-      <w:proofErr w:type="spellStart"/>
-      <w:r>
-        <w:rPr>
-          <w:b/>
-          <w:lang w:val="es-GT"/>
-        </w:rPr>
-        <w:t>Attribution</w:t>
-      </w:r>
-      <w:proofErr w:type="spellEnd"/>
+        <w:t>Creative Commons Attribution</w:t>
+      </w:r>
       <w:r>
         <w:rPr>
           <w:lang w:val="es-GT"/>
@@ -3498,17 +3458,8 @@
           <w:i/>
           <w:lang w:val="es-GT"/>
         </w:rPr>
-        <w:t xml:space="preserve">Open </w:t>
-      </w:r>
-      <w:proofErr w:type="spellStart"/>
-      <w:r>
-        <w:rPr>
-          <w:i/>
-          <w:lang w:val="es-GT"/>
-        </w:rPr>
-        <w:t>Definition</w:t>
-      </w:r>
-      <w:proofErr w:type="spellEnd"/>
+        <w:t>Open Definition</w:t>
+      </w:r>
       <w:r>
         <w:rPr>
           <w:lang w:val="es-GT"/>
@@ -3526,33 +3477,7 @@
         <w:rPr>
           <w:lang w:val="es-GT"/>
         </w:rPr>
-        <w:t xml:space="preserve">Cada archivo trae variables agrupadas en tres dimensiones: información espacio-temporal (año, mes, día, día de la semana, hora, departamento, municipio), características del siniestro y el vehículo (tipo de evento, tipo de vehículo, marca, color), y datos del involucrado (edad, sexo). La correspondencia entre los códigos numéricos de cada variable y su significado se tomó del diccionario oficial de variables que acompaña la publicación del INE, evitando así etiquetas manuales propensas a error.</w:t>
-      </w:r>
-      <w:proofErr w:type="gramStart"/>
-      <w:r>
-        <w:rPr>
-          <w:lang w:val="es-GT"/>
-        </w:rPr>
-        <w:t/>
-      </w:r>
-      <w:proofErr w:type="gramEnd"/>
-      <w:r>
-        <w:rPr>
-          <w:lang w:val="es-GT"/>
-        </w:rPr>
-        <w:t xml:space="preserve"/>
-      </w:r>
-      <w:r>
-        <w:rPr>
-          <w:lang w:val="es-GT"/>
-        </w:rPr>
-        <w:t/>
-      </w:r>
-      <w:r>
-        <w:rPr>
-          <w:lang w:val="es-GT"/>
-        </w:rPr>
-        <w:t xml:space="preserve"/>
+        <w:t>Cada archivo trae variables agrupadas en tres dimensiones: información espacio-temporal (año, mes, día, día de la semana, hora, departamento, municipio), características del siniestro y el vehículo (tipo de evento, tipo de vehículo, marca, color), y datos del involucrado (edad, sexo). La correspondencia entre los códigos numéricos de cada variable y su significado se tomó del diccionario oficial de variables que acompaña la publicación del INE, evitando así etiquetas manuales propensas a error.</w:t>
       </w:r>
     </w:p>
     <w:p>
@@ -3640,43 +3565,13 @@
           <w:b/>
           <w:lang w:val="es-GT"/>
         </w:rPr>
-        <w:t xml:space="preserve">Consolidación del </w:t>
-      </w:r>
-      <w:proofErr w:type="spellStart"/>
-      <w:r>
-        <w:rPr>
-          <w:b/>
-          <w:lang w:val="es-GT"/>
-        </w:rPr>
-        <w:t>dataset</w:t>
-      </w:r>
-      <w:proofErr w:type="spellEnd"/>
-      <w:r>
-        <w:rPr>
-          <w:b/>
-          <w:lang w:val="es-GT"/>
-        </w:rPr>
-        <w:t xml:space="preserve"> maestro:</w:t>
-      </w:r>
-      <w:r>
-        <w:rPr>
-          <w:lang w:val="es-GT"/>
-        </w:rPr>
-        <w:t xml:space="preserve"> concatenación de los siete archivos individuales en un único </w:t>
-      </w:r>
-      <w:proofErr w:type="spellStart"/>
-      <w:r>
-        <w:rPr>
-          <w:lang w:val="es-GT"/>
-        </w:rPr>
-        <w:t>DataFrame</w:t>
-      </w:r>
-      <w:proofErr w:type="spellEnd"/>
-      <w:r>
-        <w:rPr>
-          <w:lang w:val="es-GT"/>
-        </w:rPr>
-        <w:t>, conservando el año de cada registro para permitir después la partición temporal.</w:t>
+        <w:t>Consolidación del dataset maestro:</w:t>
+      </w:r>
+      <w:r>
+        <w:rPr>
+          <w:lang w:val="es-GT"/>
+        </w:rPr>
+        <w:t xml:space="preserve"> concatenación de los siete archivos individuales en un único DataFrame, conservando el año de cada registro para permitir después la partición temporal.</w:t>
       </w:r>
     </w:p>
     <w:p>
@@ -3690,7 +3585,7 @@
           <w:lang w:val="es-GT"/>
         </w:rPr>
       </w:pPr>
-      <w:r xml:space="preserve">
+      <w:r>
         <w:rPr>
           <w:b/>
           <w:lang w:val="es-GT"/>
@@ -3726,7 +3621,7 @@
         <w:rPr>
           <w:lang w:val="es-GT"/>
         </w:rPr>
-        <w:t>Antes de cualquier análisis se ejecutó una auditoría sistemática de calidad de datos, comparando los valores presentes contra los rangos válidos y los códigos de "Ignorado" (99, 9, 999, según la variable) documentados en el diccionario del INE:</w:t>
+        <w:t>Antes de cualquier análisis se ejecutó una auditoría de calidad de datos, comparando los valores presentes contra los rangos válidos y los códigos de "Ignorado" (99, 9, 999, según la variable) documentados en el diccionario del INE:</w:t>
       </w:r>
     </w:p>
     <w:tbl>
@@ -3780,30 +3675,8 @@
               <w:rPr>
                 <w:b/>
               </w:rPr>
-              <w:t xml:space="preserve">Presentes </w:t>
+              <w:t>Presentes pero inválidos</w:t>
             </w:r>
-            <w:proofErr w:type="spellStart"/>
-            <w:r>
-              <w:rPr>
-                <w:b/>
-              </w:rPr>
-              <w:t>pero</w:t>
-            </w:r>
-            <w:proofErr w:type="spellEnd"/>
-            <w:r>
-              <w:rPr>
-                <w:b/>
-              </w:rPr>
-              <w:t xml:space="preserve"> </w:t>
-            </w:r>
-            <w:proofErr w:type="spellStart"/>
-            <w:r>
-              <w:rPr>
-                <w:b/>
-              </w:rPr>
-              <w:t>inválidos</w:t>
-            </w:r>
-            <w:proofErr w:type="spellEnd"/>
           </w:p>
         </w:tc>
       </w:tr>
@@ -3845,11 +3718,9 @@
             <w:tcW w:w="0" w:type="auto"/>
           </w:tcPr>
           <w:p>
-            <w:proofErr w:type="spellStart"/>
             <w:r>
               <w:t>edad</w:t>
             </w:r>
-            <w:proofErr w:type="spellEnd"/>
           </w:p>
         </w:tc>
         <w:tc>
@@ -3879,11 +3750,9 @@
             <w:tcW w:w="0" w:type="auto"/>
           </w:tcPr>
           <w:p>
-            <w:proofErr w:type="spellStart"/>
             <w:r>
               <w:t>mes</w:t>
             </w:r>
-            <w:proofErr w:type="spellEnd"/>
           </w:p>
         </w:tc>
         <w:tc>
@@ -3913,11 +3782,9 @@
             <w:tcW w:w="0" w:type="auto"/>
           </w:tcPr>
           <w:p>
-            <w:proofErr w:type="spellStart"/>
             <w:r>
               <w:t>dia</w:t>
             </w:r>
-            <w:proofErr w:type="spellEnd"/>
           </w:p>
         </w:tc>
         <w:tc>
@@ -3947,12 +3814,10 @@
             <w:tcW w:w="0" w:type="auto"/>
           </w:tcPr>
           <w:p>
-            <w:proofErr w:type="spellStart"/>
             <w:r>
               <w:lastRenderedPageBreak/>
               <w:t>dia_semana</w:t>
             </w:r>
-            <w:proofErr w:type="spellEnd"/>
           </w:p>
         </w:tc>
         <w:tc>
@@ -3983,22 +3848,20 @@
           <w:lang w:val="es-GT"/>
         </w:rPr>
       </w:pPr>
-      <w:r xml:space="preserve">
+      <w:r>
         <w:rPr>
           <w:lang w:val="es-GT"/>
         </w:rPr>
         <w:t>Los valores "presentes pero inválidos" (hora = 99 o edad = 999, el código de "Ignorado" del INE) se recodificaron como nulos antes de cualquier imputación o gráfico, para no contaminar medias ni ejes. Se filtró además un registro con año = 3, error de captura del archivo crudo de 2018. Tras la depuración quedaron 71,941 registros (10 descartados).</w:t>
       </w:r>
-      <w:proofErr w:type="spellStart"/>
-      <w:proofErr w:type="spellEnd"/>
-    </w:p>
-    <w:p>
-      <w:pPr>
-        <w:rPr>
-          <w:lang w:val="es-GT"/>
-        </w:rPr>
-      </w:pPr>
-      <w:r xml:space="preserve">
+    </w:p>
+    <w:p>
+      <w:pPr>
+        <w:rPr>
+          <w:lang w:val="es-GT"/>
+        </w:rPr>
+      </w:pPr>
+      <w:r>
         <w:rPr>
           <w:lang w:val="es-GT"/>
         </w:rPr>
@@ -4018,35 +3881,7 @@
         <w:rPr>
           <w:lang w:val="es-GT"/>
         </w:rPr>
-        <w:t>2.4. Estrategia de particionamiento temporal (</w:t>
-      </w:r>
-      <w:proofErr w:type="spellStart"/>
-      <w:r>
-        <w:rPr>
-          <w:lang w:val="es-GT"/>
-        </w:rPr>
-        <w:t>Out</w:t>
-      </w:r>
-      <w:proofErr w:type="spellEnd"/>
-      <w:r>
-        <w:rPr>
-          <w:lang w:val="es-GT"/>
-        </w:rPr>
-        <w:t>-</w:t>
-      </w:r>
-      <w:proofErr w:type="spellStart"/>
-      <w:r>
-        <w:rPr>
-          <w:lang w:val="es-GT"/>
-        </w:rPr>
-        <w:t>of</w:t>
-      </w:r>
-      <w:proofErr w:type="spellEnd"/>
-      <w:r>
-        <w:rPr>
-          <w:lang w:val="es-GT"/>
-        </w:rPr>
-        <w:t>-Time Split)</w:t>
+        <w:t>2.4. Estrategia de particionamiento temporal (Out-of-Time Split)</w:t>
       </w:r>
       <w:bookmarkEnd w:id="21"/>
       <w:bookmarkEnd w:id="22"/>
@@ -4099,15 +3934,7 @@
         <w:t xml:space="preserve"> 60,669 registros, usados para el análisis exploratorio, la ingeniería de características, la selección de variables y la validación cruzada estratificada. </w:t>
       </w:r>
       <w:r>
-        <w:t xml:space="preserve">Tasa de </w:t>
-      </w:r>
-      <w:proofErr w:type="spellStart"/>
-      <w:r>
-        <w:t>fatalidad</w:t>
-      </w:r>
-      <w:proofErr w:type="spellEnd"/>
-      <w:r>
-        <w:t>: 18.75%.</w:t>
+        <w:t>Tasa de fatalidad: 18.75%.</w:t>
       </w:r>
     </w:p>
     <w:p>
@@ -4145,21 +3972,7 @@
         <w:rPr>
           <w:lang w:val="es-GT"/>
         </w:rPr>
-        <w:t xml:space="preserve">La tendencia anual (Anexo B) —de 15.6% en 2018 a 21.0% en 2024— es la razón por la que 2024 se aísla como </w:t>
-      </w:r>
-      <w:proofErr w:type="spellStart"/>
-      <w:r>
-        <w:rPr>
-          <w:lang w:val="es-GT"/>
-        </w:rPr>
-        <w:t>holdout</w:t>
-      </w:r>
-      <w:proofErr w:type="spellEnd"/>
-      <w:r>
-        <w:rPr>
-          <w:lang w:val="es-GT"/>
-        </w:rPr>
-        <w:t xml:space="preserve"> en vez de mezclarse al azar: un modelo entrenado solo sobre 2018–2023 podría subestimar el riesgo si esa tendencia continúa, algo que solo la partición temporal permite detectar (Capítulo 7.1).</w:t>
+        <w:t>La tendencia anual (Anexo B) —de 15.6% en 2018 a 21.0% en 2024— es la razón por la que 2024 se aísla como holdout en vez de mezclarse al azar: un modelo entrenado solo sobre 2018–2023 podría subestimar el riesgo si esa tendencia continúa, algo que solo la partición temporal permite detectar (Capítulo 7.1).</w:t>
       </w:r>
     </w:p>
     <w:p>
@@ -4272,21 +4085,7 @@
         <w:rPr>
           <w:lang w:val="es-GT"/>
         </w:rPr>
-        <w:t xml:space="preserve"> a fallecidos (clase 1) sobre el total 2018–2024; restringido al periodo de entrenamiento y validación (2018–2023, 60,669 registros) el reparto es 81.3% / 18.7%. Esta asimetría condiciona directamente la selección de métricas en la fase de modelado (Capítulo 4), priorizando el </w:t>
-      </w:r>
-      <w:proofErr w:type="spellStart"/>
-      <w:r>
-        <w:rPr>
-          <w:lang w:val="es-GT"/>
-        </w:rPr>
-        <w:t>recall</w:t>
-      </w:r>
-      <w:proofErr w:type="spellEnd"/>
-      <w:r>
-        <w:rPr>
-          <w:lang w:val="es-GT"/>
-        </w:rPr>
-        <w:t xml:space="preserve"> y el F1 sobre la clase fatal por encima de la exactitud global (figura en el Anexo B).</w:t>
+        <w:t xml:space="preserve"> a fallecidos (clase 1) sobre el total 2018–2024; restringido al periodo de entrenamiento y validación (2018–2023, 60,669 registros) el reparto es 81.3% / 18.7%. Esta asimetría condiciona directamente la selección de métricas en la fase de modelado (Capítulo 4), priorizando el recall y el F1 sobre la clase fatal por encima de la exactitud global (figura en el Anexo B).</w:t>
       </w:r>
     </w:p>
     <w:p>
@@ -4539,17 +4338,13 @@
           <w:lang w:val="es-GT"/>
         </w:rPr>
       </w:pPr>
-      <w:r xml:space="preserve">
+      <w:r>
         <w:rPr>
           <w:b/>
           <w:lang w:val="es-GT"/>
         </w:rPr>
         <w:t>Geografía: el departamento de Guatemala concentra el mayor volumen absoluto de siniestros pero registra la tasa de fatalidad más baja del país (12.9%); Petén (34.6%), Izabal (34.2%) y Zacapa (27.4%) casi la triplican. El dato está medido; la explicación no: la hipótesis más plausible —corredores de carretera de alta velocidad y mayores tiempos de traslado a un centro asistencial— no puede contrastarse con estos microdatos, y es lo que las variables del Capítulo 7.4 permitirían verificar. A nivel municipal el patrón se acentúa: entre los municipios con al menos 100 siniestros, Livingston (Izabal) encabeza con cerca del 47%, seguido de Raxruhá y Sayaxché por encima del 40%.</w:t>
       </w:r>
-      <w:proofErr w:type="spellStart"/>
-      <w:proofErr w:type="spellEnd"/>
-      <w:proofErr w:type="spellStart"/>
-      <w:proofErr w:type="spellEnd"/>
     </w:p>
     <w:p>
       <w:pPr>
@@ -4666,35 +4461,7 @@
         <w:rPr>
           <w:lang w:val="es-GT"/>
         </w:rPr>
-        <w:t>3.3. Ingeniería y selección de variables (</w:t>
-      </w:r>
-      <w:proofErr w:type="spellStart"/>
-      <w:r>
-        <w:rPr>
-          <w:lang w:val="es-GT"/>
-        </w:rPr>
-        <w:t>Feature</w:t>
-      </w:r>
-      <w:proofErr w:type="spellEnd"/>
-      <w:r>
-        <w:rPr>
-          <w:lang w:val="es-GT"/>
-        </w:rPr>
-        <w:t xml:space="preserve"> </w:t>
-      </w:r>
-      <w:proofErr w:type="spellStart"/>
-      <w:r>
-        <w:rPr>
-          <w:lang w:val="es-GT"/>
-        </w:rPr>
-        <w:t>Engineering</w:t>
-      </w:r>
-      <w:proofErr w:type="spellEnd"/>
-      <w:r>
-        <w:rPr>
-          <w:lang w:val="es-GT"/>
-        </w:rPr>
-        <w:t>)</w:t>
+        <w:t>3.3. Ingeniería y selección de variables (Feature Engineering)</w:t>
       </w:r>
       <w:bookmarkEnd w:id="29"/>
       <w:bookmarkEnd w:id="30"/>
@@ -4749,6 +4516,9 @@
         </w:rPr>
         <w:t xml:space="preserve"> (entre semana, fin de semana, desconocido) en vez de dos, porque el 31.2% de los registros no trae día de la semana y tratarlo como "no es fin de semana" introduciría un sesgo; y codificación cíclica seno/coseno de la hora y el mes, que preserva la continuidad entre las 23:00 y las 00:00 (y entre diciembre y enero) que una codificación lineal rompería.</w:t>
       </w:r>
+      <w:r xml:space="preserve">
+        <w:t xml:space="preserve"> Se añadió además un indicador de horario crítico, que marca la intersección de madrugada y fin de semana — la combinación con mayor tasa observada en el EDA.</w:t>
+      </w:r>
     </w:p>
     <w:p>
       <w:pPr>
@@ -4797,21 +4567,7 @@
         <w:rPr>
           <w:lang w:val="es-GT"/>
         </w:rPr>
-        <w:t xml:space="preserve"> dos indicadores binarios calculados de año/mes/día sin ninguna fuente externa — feriado oficial, y temporada alta vial (Semana Santa, con el algoritmo de </w:t>
-      </w:r>
-      <w:proofErr w:type="spellStart"/>
-      <w:r>
-        <w:rPr>
-          <w:lang w:val="es-GT"/>
-        </w:rPr>
-        <w:t>Meeus</w:t>
-      </w:r>
-      <w:proofErr w:type="spellEnd"/>
-      <w:r>
-        <w:rPr>
-          <w:lang w:val="es-GT"/>
-        </w:rPr>
-        <w:t>/Jones/Butcher para la fecha de Pascua, y fin de año). Se probaron porque la literatura de seguridad vial los señala como relevantes.</w:t>
+        <w:t xml:space="preserve"> dos indicadores binarios calculados de año/mes/día sin ninguna fuente externa — feriado oficial, y temporada alta vial (Semana Santa, con el algoritmo de Meeus/Jones/Butcher para la fecha de Pascua, y fin de año). Se probaron porque la literatura de seguridad vial los señala como relevantes.</w:t>
       </w:r>
     </w:p>
     <w:p>
@@ -4836,21 +4592,7 @@
         <w:rPr>
           <w:lang w:val="es-GT"/>
         </w:rPr>
-        <w:t xml:space="preserve"> las de baja cardinalidad con One-Hot </w:t>
-      </w:r>
-      <w:proofErr w:type="spellStart"/>
-      <w:r>
-        <w:rPr>
-          <w:lang w:val="es-GT"/>
-        </w:rPr>
-        <w:t>Encoding</w:t>
-      </w:r>
-      <w:proofErr w:type="spellEnd"/>
-      <w:r>
-        <w:rPr>
-          <w:lang w:val="es-GT"/>
-        </w:rPr>
-        <w:t xml:space="preserve">. Municipio (339 valores) y marca de vehículo (141) mediante </w:t>
+        <w:t xml:space="preserve"> las de baja cardinalidad con One-Hot Encoding. Municipio (339 valores) y marca de vehículo (141) mediante </w:t>
       </w:r>
       <w:r>
         <w:rPr>
@@ -4870,109 +4612,21 @@
           <w:lang w:val="es-GT"/>
         </w:rPr>
         <w:lastRenderedPageBreak/>
-        <w:t xml:space="preserve">sobre 2018–2023 y reutilizada en 2024— en vez de One-Hot: codificarlas directamente habría añadido 480 columnas al modelo, complicando el entrenamiento y la lectura de los gráficos del Capítulo 5. La contrapartida de esta codificación es que pierde la identidad de la categoría —dos municipios con la misma frecuencia se vuelven indistinguibles para el modelo— y que debe calcularse solo sobre el periodo de entrenamiento para no filtrar información del </w:t>
-      </w:r>
-      <w:proofErr w:type="spellStart"/>
-      <w:r>
-        <w:rPr>
-          <w:lang w:val="es-GT"/>
-        </w:rPr>
-        <w:t>holdout</w:t>
-      </w:r>
-      <w:proofErr w:type="spellEnd"/>
-      <w:r>
-        <w:rPr>
-          <w:lang w:val="es-GT"/>
-        </w:rPr>
-        <w:t>.</w:t>
-      </w:r>
-    </w:p>
-    <w:p>
-      <w:pPr>
-        <w:rPr>
-          <w:lang w:val="es-GT"/>
-        </w:rPr>
-      </w:pPr>
-      <w:r>
-        <w:rPr>
-          <w:b/>
-          <w:lang w:val="es-GT"/>
-        </w:rPr>
-        <w:t xml:space="preserve">Selección de variables categóricas. Para la selección de variables categóricas se calculó la V de Cramér (asociación basada en chi-cuadrado) entre cada candidata y la severidad:</w:t>
-      </w:r>
-      <w:r>
-        <w:rPr>
-          <w:lang w:val="es-GT"/>
-        </w:rPr>
-        <w:t xml:space="preserve"/>
-      </w:r>
-      <w:r>
-        <w:rPr>
-          <w:lang w:val="es-GT"/>
-        </w:rPr>
-        <w:t xml:space="preserve"/>
-      </w:r>
-      <w:proofErr w:type="spellStart"/>
-      <w:proofErr w:type="gramStart"/>
-      <w:r>
-        <w:rPr>
-          <w:lang w:val="es-GT"/>
-        </w:rPr>
-        <w:t/>
-      </w:r>
-      <w:r>
-        <w:rPr>
-          <w:lang w:val="es-GT"/>
-        </w:rPr>
-        <w:t/>
-      </w:r>
-      <w:r>
-        <w:rPr>
-          <w:lang w:val="es-GT"/>
-        </w:rPr>
-        <w:t/>
-      </w:r>
-      <w:proofErr w:type="spellEnd"/>
-      <w:proofErr w:type="gramEnd"/>
-      <w:r>
-        <w:rPr>
-          <w:lang w:val="es-GT"/>
-        </w:rPr>
-        <w:t xml:space="preserve"/>
-      </w:r>
-      <w:proofErr w:type="gramStart"/>
-      <w:r>
-        <w:rPr>
-          <w:lang w:val="es-GT"/>
-        </w:rPr>
-        <w:t xml:space="preserve"/>
-      </w:r>
-      <w:r>
-        <w:rPr>
-          <w:lang w:val="es-GT"/>
-        </w:rPr>
-        <w:t xml:space="preserve"/>
-      </w:r>
-      <w:proofErr w:type="gramEnd"/>
-      <w:r>
-        <w:rPr>
-          <w:lang w:val="es-GT"/>
-        </w:rPr>
-        <w:t xml:space="preserve"/>
-      </w:r>
-      <w:proofErr w:type="spellStart"/>
-      <w:r>
-        <w:rPr>
-          <w:lang w:val="es-GT"/>
-        </w:rPr>
-        <w:t/>
-      </w:r>
-      <w:proofErr w:type="spellEnd"/>
-      <w:r>
-        <w:rPr>
-          <w:lang w:val="es-GT"/>
-        </w:rPr>
-        <w:t xml:space="preserve"/>
+        <w:t>sobre 2018–2023 y reutilizada en 2024— en vez de One-Hot: codificarlas directamente habría añadido 480 columnas al modelo, complicando el entrenamiento y la lectura de los gráficos del Capítulo 5. La contrapartida de esta codificación es que pierde la identidad de la categoría —dos municipios con la misma frecuencia se vuelven indistinguibles para el modelo— y que debe calcularse solo sobre el periodo de entrenamiento para no filtrar información del holdout.</w:t>
+      </w:r>
+    </w:p>
+    <w:p>
+      <w:pPr>
+        <w:rPr>
+          <w:lang w:val="es-GT"/>
+        </w:rPr>
+      </w:pPr>
+      <w:r>
+        <w:rPr>
+          <w:b/>
+          <w:lang w:val="es-GT"/>
+        </w:rPr>
+        <w:t>Selección de variables categóricas. Para la selección de variables categóricas se calculó la V de Cramér (asociación basada en chi-cuadrado) entre cada candidata y la severidad:</w:t>
       </w:r>
     </w:p>
     <w:tbl>
@@ -5071,11 +4725,9 @@
             <w:tcW w:w="0" w:type="auto"/>
           </w:tcPr>
           <w:p>
-            <w:proofErr w:type="spellStart"/>
             <w:r>
               <w:t>color_vehiculo</w:t>
             </w:r>
-            <w:proofErr w:type="spellEnd"/>
           </w:p>
         </w:tc>
         <w:tc>
@@ -5095,11 +4747,9 @@
             <w:tcW w:w="0" w:type="auto"/>
           </w:tcPr>
           <w:p>
-            <w:proofErr w:type="spellStart"/>
             <w:r>
               <w:t>tipo_vehiculo</w:t>
             </w:r>
-            <w:proofErr w:type="spellEnd"/>
           </w:p>
         </w:tc>
         <w:tc>
@@ -5117,11 +4767,9 @@
             <w:tcW w:w="0" w:type="auto"/>
           </w:tcPr>
           <w:p>
-            <w:proofErr w:type="spellStart"/>
             <w:r>
               <w:t>franja_horaria</w:t>
             </w:r>
-            <w:proofErr w:type="spellEnd"/>
           </w:p>
         </w:tc>
         <w:tc>
@@ -5141,11 +4789,9 @@
             <w:tcW w:w="0" w:type="auto"/>
           </w:tcPr>
           <w:p>
-            <w:proofErr w:type="spellStart"/>
             <w:r>
               <w:t>marca_vehiculo</w:t>
             </w:r>
-            <w:proofErr w:type="spellEnd"/>
           </w:p>
         </w:tc>
         <w:tc>
@@ -5163,11 +4809,9 @@
             <w:tcW w:w="0" w:type="auto"/>
           </w:tcPr>
           <w:p>
-            <w:proofErr w:type="spellStart"/>
             <w:r>
               <w:t>edad_vulnerable</w:t>
             </w:r>
-            <w:proofErr w:type="spellEnd"/>
           </w:p>
         </w:tc>
         <w:tc>
@@ -5187,11 +4831,9 @@
             <w:tcW w:w="0" w:type="auto"/>
           </w:tcPr>
           <w:p>
-            <w:proofErr w:type="spellStart"/>
             <w:r>
               <w:t>tipo_evento</w:t>
             </w:r>
-            <w:proofErr w:type="spellEnd"/>
           </w:p>
         </w:tc>
         <w:tc>
@@ -5209,11 +4851,9 @@
             <w:tcW w:w="0" w:type="auto"/>
           </w:tcPr>
           <w:p>
-            <w:proofErr w:type="spellStart"/>
             <w:r>
               <w:t>vehiculo_vulnerable</w:t>
             </w:r>
-            <w:proofErr w:type="spellEnd"/>
           </w:p>
         </w:tc>
         <w:tc>
@@ -5233,11 +4873,9 @@
             <w:tcW w:w="0" w:type="auto"/>
           </w:tcPr>
           <w:p>
-            <w:proofErr w:type="spellStart"/>
             <w:r>
               <w:t>departamento</w:t>
             </w:r>
-            <w:proofErr w:type="spellEnd"/>
           </w:p>
         </w:tc>
         <w:tc>
@@ -5255,11 +4893,9 @@
             <w:tcW w:w="0" w:type="auto"/>
           </w:tcPr>
           <w:p>
-            <w:proofErr w:type="spellStart"/>
             <w:r>
               <w:t>es_fin_de_semana</w:t>
             </w:r>
-            <w:proofErr w:type="spellEnd"/>
           </w:p>
         </w:tc>
         <w:tc>
@@ -5279,11 +4915,9 @@
             <w:tcW w:w="0" w:type="auto"/>
           </w:tcPr>
           <w:p>
-            <w:proofErr w:type="spellStart"/>
             <w:r>
               <w:t>sexo</w:t>
             </w:r>
-            <w:proofErr w:type="spellEnd"/>
           </w:p>
         </w:tc>
         <w:tc>
@@ -5301,11 +4935,9 @@
             <w:tcW w:w="0" w:type="auto"/>
           </w:tcPr>
           <w:p>
-            <w:proofErr w:type="spellStart"/>
             <w:r>
               <w:t>es_feriado</w:t>
             </w:r>
-            <w:proofErr w:type="spellEnd"/>
           </w:p>
         </w:tc>
         <w:tc>
@@ -5345,11 +4977,9 @@
             <w:tcW w:w="0" w:type="auto"/>
           </w:tcPr>
           <w:p>
-            <w:proofErr w:type="spellStart"/>
             <w:r>
               <w:t>es_temporada_alta_vial</w:t>
             </w:r>
-            <w:proofErr w:type="spellEnd"/>
           </w:p>
         </w:tc>
         <w:tc>
@@ -5376,54 +5006,18 @@
         </w:rPr>
         <w:t>Todos los valores caen en el rango de asociación pequeña a moderada de la escala convencional de Cramér, coherente con la naturaleza del dataset: son variables administrativas del siniestro y no de causalidad. La distinción es verificable en el diccionario oficial del INE — todas las variables publicadas describen el registro del hecho (quién, dónde, cuándo, con qué vehículo) y ninguna mide un mecanismo que produzca la severidad (velocidad, alcohol, clima, estado de la vía). Es una limitación del dataset, no del método (Capítulo 7.2). Conviene señalar un resultado explícitamente: feriado y temporada alta vial resultaron las asociaciones más débiles de toda la tabla, por debajo incluso de "es_fin_de_semana". Es un resultado legítimo, no un error de cálculo, y su efecto nulo sobre el desempeño final se confirma en el Capítulo 4.3.</w:t>
       </w:r>
-      <w:proofErr w:type="spellStart"/>
-      <w:proofErr w:type="spellEnd"/>
-      <w:proofErr w:type="spellStart"/>
-      <w:proofErr w:type="spellEnd"/>
-      <w:proofErr w:type="spellStart"/>
-      <w:proofErr w:type="spellEnd"/>
-      <w:proofErr w:type="spellStart"/>
-      <w:proofErr w:type="spellEnd"/>
-    </w:p>
-    <w:p>
-      <w:pPr>
-        <w:rPr>
-          <w:lang w:val="es-GT"/>
-        </w:rPr>
-      </w:pPr>
-      <w:r>
-        <w:rPr>
-          <w:lang w:val="es-GT"/>
-        </w:rPr>
-        <w:t>Como verificación de higiene de datos se calculó además la correlación de Pearson entre las numéricas candidatas, descartando pares con |r| ≥ 0.80–0.90. Ninguno supera el umbral: los más altos son hora/</w:t>
-      </w:r>
-      <w:proofErr w:type="spellStart"/>
-      <w:r>
-        <w:rPr>
-          <w:lang w:val="es-GT"/>
-        </w:rPr>
-        <w:t>hora_sin</w:t>
-      </w:r>
-      <w:proofErr w:type="spellEnd"/>
-      <w:r>
-        <w:rPr>
-          <w:lang w:val="es-GT"/>
-        </w:rPr>
-        <w:t xml:space="preserve"> (~0.77) y mes/</w:t>
-      </w:r>
-      <w:proofErr w:type="spellStart"/>
-      <w:r>
-        <w:rPr>
-          <w:lang w:val="es-GT"/>
-        </w:rPr>
-        <w:t>mes_sin</w:t>
-      </w:r>
-      <w:proofErr w:type="spellEnd"/>
-      <w:r>
-        <w:rPr>
-          <w:lang w:val="es-GT"/>
-        </w:rPr>
-        <w:t xml:space="preserve"> (~0.75), esperable porque cada una deriva de la otra. Para las categóricas el criterio pesa menos: los modelos de árboles usados aquí son en la práctica invariantes a variables correlacionadas entre sí, a diferencia de un modelo lineal.</w:t>
+    </w:p>
+    <w:p>
+      <w:pPr>
+        <w:rPr>
+          <w:lang w:val="es-GT"/>
+        </w:rPr>
+      </w:pPr>
+      <w:r>
+        <w:rPr>
+          <w:lang w:val="es-GT"/>
+        </w:rPr>
+        <w:t>Como verificación de higiene de datos se calculó además la correlación de Pearson entre las numéricas candidatas, descartando pares con |r| ≥ 0.80–0.90. Ninguno supera el umbral: los más altos son hora/hora_sin (~0.77) y mes/mes_sin (~0.75), esperable porque cada una deriva de la otra. Para las categóricas el criterio pesa menos: los modelos de árboles usados aquí son en la práctica invariantes a variables correlacionadas entre sí, a diferencia de un modelo lineal.</w:t>
       </w:r>
     </w:p>
     <w:p>
@@ -5486,21 +5080,7 @@
         <w:rPr>
           <w:lang w:val="es-GT"/>
         </w:rPr>
-        <w:t xml:space="preserve">El problema se formaliza como la estimación de la probabilidad condicional </w:t>
-      </w:r>
-      <w:proofErr w:type="gramStart"/>
-      <w:r>
-        <w:rPr>
-          <w:lang w:val="es-GT"/>
-        </w:rPr>
-        <w:t>P(</w:t>
-      </w:r>
-      <w:proofErr w:type="gramEnd"/>
-      <w:r>
-        <w:rPr>
-          <w:lang w:val="es-GT"/>
-        </w:rPr>
-        <w:t>Y=1 | X), donde Y=1 denota un siniestro con desenlace fatal y X el vector de características descrito en el Capítulo 3. El objetivo es maximizar la capacidad de discriminación entre eventos de alta y baja severidad.</w:t>
+        <w:t>El problema se formaliza como la estimación de la probabilidad condicional P(Y=1 | X), donde Y=1 denota un siniestro con desenlace fatal y X el vector de características descrito en el Capítulo 3. El objetivo es maximizar la capacidad de discriminación entre eventos de alta y baja severidad.</w:t>
       </w:r>
     </w:p>
     <w:p>
@@ -5534,21 +5114,13 @@
           <w:lang w:val="es-GT"/>
         </w:rPr>
       </w:pPr>
-      <w:r xml:space="preserve">
+      <w:r>
         <w:rPr>
           <w:b/>
           <w:lang w:val="es-GT"/>
         </w:rPr>
         <w:t>Naturaleza tabular del problema: cerca de 60,000 registros y variables mayoritariamente categóricas de cardinalidad moderada — el régimen en el que la literatura reciente (Grinsztajn et al., 2022) documenta que los ensambles de árboles superan de forma consistente a las redes profundas. Por eso el deep learning se descartó desde el planteamiento (Capítulo 1.4).</w:t>
       </w:r>
-      <w:proofErr w:type="spellStart"/>
-      <w:proofErr w:type="spellEnd"/>
-      <w:proofErr w:type="spellStart"/>
-      <w:proofErr w:type="spellEnd"/>
-      <w:proofErr w:type="spellStart"/>
-      <w:proofErr w:type="spellEnd"/>
-      <w:proofErr w:type="spellStart"/>
-      <w:proofErr w:type="spellEnd"/>
     </w:p>
     <w:p>
       <w:pPr>
@@ -5566,23 +5138,7 @@
           <w:b/>
           <w:lang w:val="es-GT"/>
         </w:rPr>
-        <w:t xml:space="preserve">Un </w:t>
-      </w:r>
-      <w:proofErr w:type="spellStart"/>
-      <w:r>
-        <w:rPr>
-          <w:b/>
-          <w:lang w:val="es-GT"/>
-        </w:rPr>
-        <w:t>baseline</w:t>
-      </w:r>
-      <w:proofErr w:type="spellEnd"/>
-      <w:r>
-        <w:rPr>
-          <w:b/>
-          <w:lang w:val="es-GT"/>
-        </w:rPr>
-        <w:t xml:space="preserve"> lineal e interpretable:</w:t>
+        <w:t>Un baseline lineal e interpretable:</w:t>
       </w:r>
       <w:r>
         <w:rPr>
@@ -5607,23 +5163,7 @@
           <w:b/>
           <w:lang w:val="es-GT"/>
         </w:rPr>
-        <w:t xml:space="preserve">Tres implementaciones de </w:t>
-      </w:r>
-      <w:proofErr w:type="spellStart"/>
-      <w:r>
-        <w:rPr>
-          <w:b/>
-          <w:lang w:val="es-GT"/>
-        </w:rPr>
-        <w:t>boosting</w:t>
-      </w:r>
-      <w:proofErr w:type="spellEnd"/>
-      <w:r>
-        <w:rPr>
-          <w:b/>
-          <w:lang w:val="es-GT"/>
-        </w:rPr>
-        <w:t>, no solo una:</w:t>
+        <w:t>Tres implementaciones de boosting, no solo una:</w:t>
       </w:r>
       <w:r>
         <w:rPr>
@@ -5643,15 +5183,13 @@
           <w:lang w:val="es-GT"/>
         </w:rPr>
       </w:pPr>
-      <w:r xml:space="preserve">
+      <w:r>
         <w:rPr>
           <w:b/>
           <w:lang w:val="es-GT"/>
         </w:rPr>
         <w:t>Compatibilidad con explicabilidad y costo acorde al alcance: las cinco familias son compatibles con SHAP —requisito del Capítulo 5.1— y entrenan en minutos sobre una laptop estándar.</w:t>
       </w:r>
-      <w:proofErr w:type="spellStart"/>
-      <w:proofErr w:type="spellEnd"/>
     </w:p>
     <w:p>
       <w:pPr>
@@ -5683,85 +5221,18 @@
         </w:rPr>
         <w:t>Para abordar la asimetría 81/19 entre clases se utilizó ponderación de clases (</w:t>
       </w:r>
-      <w:proofErr w:type="spellStart"/>
       <w:r>
         <w:rPr>
           <w:rStyle w:val="ClarkdownCode"/>
           <w:lang w:val="es-GT"/>
         </w:rPr>
-        <w:t>class_weight</w:t>
-      </w:r>
-      <w:proofErr w:type="spellEnd"/>
-      <w:r>
-        <w:rPr>
-          <w:rStyle w:val="ClarkdownCode"/>
-          <w:lang w:val="es-GT"/>
-        </w:rPr>
-        <w:t>="</w:t>
-      </w:r>
-      <w:proofErr w:type="spellStart"/>
-      <w:r>
-        <w:rPr>
-          <w:rStyle w:val="ClarkdownCode"/>
-          <w:lang w:val="es-GT"/>
-        </w:rPr>
-        <w:t>balanced</w:t>
-      </w:r>
-      <w:proofErr w:type="spellEnd"/>
-      <w:r>
-        <w:rPr>
-          <w:rStyle w:val="ClarkdownCode"/>
-          <w:lang w:val="es-GT"/>
-        </w:rPr>
-        <w:t>"</w:t>
-      </w:r>
-      <w:r>
-        <w:rPr>
-          <w:lang w:val="es-GT"/>
-        </w:rPr>
-        <w:t xml:space="preserve"> en Regresión Logística y Random Forest; pesos de muestra proporcionales al desbalance en el modelo de </w:t>
-      </w:r>
-      <w:proofErr w:type="spellStart"/>
-      <w:r>
-        <w:rPr>
-          <w:lang w:val="es-GT"/>
-        </w:rPr>
-        <w:t>boosting</w:t>
-      </w:r>
-      <w:proofErr w:type="spellEnd"/>
-      <w:r>
-        <w:rPr>
-          <w:lang w:val="es-GT"/>
-        </w:rPr>
-        <w:t xml:space="preserve">), en vez de </w:t>
-      </w:r>
-      <w:proofErr w:type="spellStart"/>
-      <w:r>
-        <w:rPr>
-          <w:lang w:val="es-GT"/>
-        </w:rPr>
-        <w:t>sobremuestreo</w:t>
-      </w:r>
-      <w:proofErr w:type="spellEnd"/>
-      <w:r>
-        <w:rPr>
-          <w:lang w:val="es-GT"/>
-        </w:rPr>
-        <w:t xml:space="preserve"> sintético (SMOTE): con series temporales de conteos administrativos, generar observaciones sintéticas es más difícil de justificar metodológicamente que ajustar el peso de la función de pérdida, y esta última es la práctica estándar recomendada para </w:t>
-      </w:r>
-      <w:proofErr w:type="spellStart"/>
-      <w:r>
-        <w:rPr>
-          <w:lang w:val="es-GT"/>
-        </w:rPr>
-        <w:t>boosting</w:t>
-      </w:r>
-      <w:proofErr w:type="spellEnd"/>
-      <w:r>
-        <w:rPr>
-          <w:lang w:val="es-GT"/>
-        </w:rPr>
-        <w:t xml:space="preserve"> sobre datos tabulares desbalanceados.</w:t>
+        <w:t>class_weight="balanced"</w:t>
+      </w:r>
+      <w:r>
+        <w:rPr>
+          <w:lang w:val="es-GT"/>
+        </w:rPr>
+        <w:t xml:space="preserve"> en Regresión Logística y Random Forest; pesos de muestra proporcionales al desbalance en el modelo de boosting), en vez de sobremuestreo sintético (SMOTE): con series temporales de conteos administrativos, generar observaciones sintéticas es más difícil de justificar metodológicamente que ajustar el peso de la función de pérdida, y esta última es la práctica estándar recomendada para boosting sobre datos tabulares desbalanceados.</w:t>
       </w:r>
     </w:p>
     <w:p>
@@ -5781,33 +5252,8 @@
           <w:b/>
           <w:lang w:val="es-GT"/>
         </w:rPr>
-        <w:t xml:space="preserve">5-fold </w:t>
-      </w:r>
-      <w:proofErr w:type="spellStart"/>
-      <w:r>
-        <w:rPr>
-          <w:b/>
-          <w:lang w:val="es-GT"/>
-        </w:rPr>
-        <w:t>Stratified</w:t>
-      </w:r>
-      <w:proofErr w:type="spellEnd"/>
-      <w:r>
-        <w:rPr>
-          <w:b/>
-          <w:lang w:val="es-GT"/>
-        </w:rPr>
-        <w:t xml:space="preserve"> Cross-</w:t>
-      </w:r>
-      <w:proofErr w:type="spellStart"/>
-      <w:r>
-        <w:rPr>
-          <w:b/>
-          <w:lang w:val="es-GT"/>
-        </w:rPr>
-        <w:t>Validation</w:t>
-      </w:r>
-      <w:proofErr w:type="spellEnd"/>
+        <w:t>5-fold Stratified Cross-Validation</w:t>
+      </w:r>
       <w:r>
         <w:rPr>
           <w:lang w:val="es-GT"/>
@@ -5871,7 +5317,6 @@
         </w:rPr>
         <w:t xml:space="preserve"> (ensamble por </w:t>
       </w:r>
-      <w:proofErr w:type="spellStart"/>
       <w:r>
         <w:rPr>
           <w:i/>
@@ -5879,28 +5324,12 @@
         </w:rPr>
         <w:t>bagging</w:t>
       </w:r>
-      <w:proofErr w:type="spellEnd"/>
-      <w:r>
-        <w:rPr>
-          <w:lang w:val="es-GT"/>
-        </w:rPr>
-        <w:t xml:space="preserve">) y tres implementaciones de </w:t>
-      </w:r>
-      <w:proofErr w:type="spellStart"/>
-      <w:r>
-        <w:rPr>
-          <w:lang w:val="es-GT"/>
-        </w:rPr>
-        <w:t>boosting</w:t>
-      </w:r>
-      <w:proofErr w:type="spellEnd"/>
-      <w:r>
-        <w:rPr>
-          <w:lang w:val="es-GT"/>
-        </w:rPr>
-        <w:t xml:space="preserve"> sobre árboles — </w:t>
-      </w:r>
-      <w:proofErr w:type="spellStart"/>
+      <w:r>
+        <w:rPr>
+          <w:lang w:val="es-GT"/>
+        </w:rPr>
+        <w:t xml:space="preserve">) y tres implementaciones de boosting sobre árboles — </w:t>
+      </w:r>
       <w:r>
         <w:rPr>
           <w:b/>
@@ -5908,28 +5337,12 @@
         </w:rPr>
         <w:t>HistGradientBoostingClassifier</w:t>
       </w:r>
-      <w:proofErr w:type="spellEnd"/>
-      <w:r>
-        <w:rPr>
-          <w:lang w:val="es-GT"/>
-        </w:rPr>
-        <w:t xml:space="preserve"> (</w:t>
-      </w:r>
-      <w:proofErr w:type="spellStart"/>
-      <w:r>
-        <w:rPr>
-          <w:lang w:val="es-GT"/>
-        </w:rPr>
-        <w:t>scikit-learn</w:t>
-      </w:r>
-      <w:proofErr w:type="spellEnd"/>
-      <w:r>
-        <w:rPr>
-          <w:lang w:val="es-GT"/>
-        </w:rPr>
-        <w:t xml:space="preserve">), </w:t>
-      </w:r>
-      <w:proofErr w:type="spellStart"/>
+      <w:r>
+        <w:rPr>
+          <w:lang w:val="es-GT"/>
+        </w:rPr>
+        <w:t xml:space="preserve"> (scikit-learn), </w:t>
+      </w:r>
       <w:r>
         <w:rPr>
           <w:b/>
@@ -5937,14 +5350,12 @@
         </w:rPr>
         <w:t>XGBoost</w:t>
       </w:r>
-      <w:proofErr w:type="spellEnd"/>
       <w:r>
         <w:rPr>
           <w:lang w:val="es-GT"/>
         </w:rPr>
         <w:t xml:space="preserve"> y </w:t>
       </w:r>
-      <w:proofErr w:type="spellStart"/>
       <w:r>
         <w:rPr>
           <w:b/>
@@ -5952,7 +5363,6 @@
         </w:rPr>
         <w:t>LightGBM</w:t>
       </w:r>
-      <w:proofErr w:type="spellEnd"/>
       <w:r>
         <w:rPr>
           <w:lang w:val="es-GT"/>
@@ -5998,14 +5408,12 @@
             <w:tcW w:w="0" w:type="auto"/>
           </w:tcPr>
           <w:p>
-            <w:proofErr w:type="spellStart"/>
             <w:r>
               <w:rPr>
                 <w:b/>
               </w:rPr>
               <w:t>Algoritmo</w:t>
             </w:r>
-            <w:proofErr w:type="spellEnd"/>
           </w:p>
         </w:tc>
         <w:tc>
@@ -6043,21 +5451,7 @@
               <w:rPr>
                 <w:b/>
               </w:rPr>
-              <w:t>Recall (</w:t>
-            </w:r>
-            <w:proofErr w:type="spellStart"/>
-            <w:r>
-              <w:rPr>
-                <w:b/>
-              </w:rPr>
-              <w:t>Fallecido</w:t>
-            </w:r>
-            <w:proofErr w:type="spellEnd"/>
-            <w:r>
-              <w:rPr>
-                <w:b/>
-              </w:rPr>
-              <w:t>)</w:t>
+              <w:t>Recall (Fallecido)</w:t>
             </w:r>
           </w:p>
         </w:tc>
@@ -6070,21 +5464,7 @@
               <w:rPr>
                 <w:b/>
               </w:rPr>
-              <w:t>Precision (</w:t>
-            </w:r>
-            <w:proofErr w:type="spellStart"/>
-            <w:r>
-              <w:rPr>
-                <w:b/>
-              </w:rPr>
-              <w:t>Fallecido</w:t>
-            </w:r>
-            <w:proofErr w:type="spellEnd"/>
-            <w:r>
-              <w:rPr>
-                <w:b/>
-              </w:rPr>
-              <w:t>)</w:t>
+              <w:t>Precision (Fallecido)</w:t>
             </w:r>
           </w:p>
         </w:tc>
@@ -6097,21 +5477,7 @@
               <w:rPr>
                 <w:b/>
               </w:rPr>
-              <w:t>F1 (</w:t>
-            </w:r>
-            <w:proofErr w:type="spellStart"/>
-            <w:r>
-              <w:rPr>
-                <w:b/>
-              </w:rPr>
-              <w:t>Fallecido</w:t>
-            </w:r>
-            <w:proofErr w:type="spellEnd"/>
-            <w:r>
-              <w:rPr>
-                <w:b/>
-              </w:rPr>
-              <w:t>)</w:t>
+              <w:t>F1 (Fallecido)</w:t>
             </w:r>
           </w:p>
         </w:tc>
@@ -6122,19 +5488,9 @@
             <w:tcW w:w="0" w:type="auto"/>
           </w:tcPr>
           <w:p>
-            <w:proofErr w:type="spellStart"/>
             <w:r>
-              <w:t>Regresión</w:t>
+              <w:t>Regresión Logística</w:t>
             </w:r>
-            <w:proofErr w:type="spellEnd"/>
-            <w:r>
-              <w:t xml:space="preserve"> </w:t>
-            </w:r>
-            <w:proofErr w:type="spellStart"/>
-            <w:r>
-              <w:t>Logística</w:t>
-            </w:r>
-            <w:proofErr w:type="spellEnd"/>
           </w:p>
         </w:tc>
         <w:tc>
@@ -6256,12 +5612,10 @@
             <w:tcW w:w="0" w:type="auto"/>
           </w:tcPr>
           <w:p>
-            <w:proofErr w:type="spellStart"/>
             <w:r>
               <w:lastRenderedPageBreak/>
               <w:t>HistGradientBoosting</w:t>
             </w:r>
-            <w:proofErr w:type="spellEnd"/>
           </w:p>
         </w:tc>
         <w:tc>
@@ -6321,11 +5675,9 @@
             <w:tcW w:w="0" w:type="auto"/>
           </w:tcPr>
           <w:p>
-            <w:proofErr w:type="spellStart"/>
             <w:r>
               <w:t>XGBoost</w:t>
             </w:r>
-            <w:proofErr w:type="spellEnd"/>
           </w:p>
         </w:tc>
         <w:tc>
@@ -6392,14 +5744,12 @@
             <w:shd w:val="clear" w:color="auto" w:fill="EAF2FB"/>
           </w:tcPr>
           <w:p>
-            <w:proofErr w:type="spellStart"/>
             <w:r>
               <w:rPr>
                 <w:b/>
               </w:rPr>
               <w:t>LightGBM</w:t>
             </w:r>
-            <w:proofErr w:type="spellEnd"/>
           </w:p>
         </w:tc>
         <w:tc>
@@ -6472,23 +5822,8 @@
         <w:rPr>
           <w:lang w:val="es-GT"/>
         </w:rPr>
-        <w:t xml:space="preserve">Los tres modelos de </w:t>
-      </w:r>
-      <w:proofErr w:type="spellStart"/>
-      <w:r>
-        <w:rPr>
-          <w:lang w:val="es-GT"/>
-        </w:rPr>
-        <w:t>boosting</w:t>
-      </w:r>
-      <w:proofErr w:type="spellEnd"/>
-      <w:r>
-        <w:rPr>
-          <w:lang w:val="es-GT"/>
-        </w:rPr>
-        <w:t xml:space="preserve"> quedan prácticamente empatados — 0.004 de diferencia en ROC-AUC entre el mejor y el peor de los tres —, muy por encima de la Regresión Logística y ligeramente por encima de Random Forest. Se selecciona </w:t>
-      </w:r>
-      <w:proofErr w:type="spellStart"/>
+        <w:t xml:space="preserve">Los tres modelos de boosting quedan prácticamente empatados — 0.004 de diferencia en ROC-AUC entre el mejor y el peor de los tres —, muy por encima de la Regresión Logística y ligeramente por encima de Random Forest. Se selecciona </w:t>
+      </w:r>
       <w:r>
         <w:rPr>
           <w:b/>
@@ -6496,40 +5831,11 @@
         </w:rPr>
         <w:t>LightGBM</w:t>
       </w:r>
-      <w:proofErr w:type="spellEnd"/>
-      <w:r>
-        <w:rPr>
-          <w:lang w:val="es-GT"/>
-        </w:rPr>
-        <w:t xml:space="preserve"> por tener, por un margen mínimo sobre </w:t>
-      </w:r>
-      <w:proofErr w:type="spellStart"/>
-      <w:r>
-        <w:rPr>
-          <w:lang w:val="es-GT"/>
-        </w:rPr>
-        <w:t>XGBoost</w:t>
-      </w:r>
-      <w:proofErr w:type="spellEnd"/>
-      <w:r>
-        <w:rPr>
-          <w:lang w:val="es-GT"/>
-        </w:rPr>
-        <w:t xml:space="preserve"> (0.7720 vs. 0.7715), el mejor ROC-AUC en validación cruzada: el único criterio admisible en este punto, porque el </w:t>
-      </w:r>
-      <w:proofErr w:type="spellStart"/>
-      <w:r>
-        <w:rPr>
-          <w:lang w:val="es-GT"/>
-        </w:rPr>
-        <w:t>holdout</w:t>
-      </w:r>
-      <w:proofErr w:type="spellEnd"/>
-      <w:r>
-        <w:rPr>
-          <w:lang w:val="es-GT"/>
-        </w:rPr>
-        <w:t xml:space="preserve"> de 2024 todavía no se ha mirado. La salida completa por pliegue está en el Anexo A.</w:t>
+      <w:r>
+        <w:rPr>
+          <w:lang w:val="es-GT"/>
+        </w:rPr>
+        <w:t xml:space="preserve"> por tener, por un margen mínimo sobre XGBoost (0.7720 vs. 0.7715), el mejor ROC-AUC en validación cruzada: el único criterio admisible en este punto, porque el holdout de 2024 todavía no se ha mirado. La salida completa por pliegue está en el Anexo A.</w:t>
       </w:r>
     </w:p>
     <w:p>
@@ -6546,53 +5852,8 @@
         </w:rPr>
         <w:t xml:space="preserve"> Ante la pregunta legítima de si se puede seguir ajustando el modelo para mejorar el porcentaje, se diseñaron cinco pruebas independientes entre sí. </w:t>
       </w:r>
-      <w:proofErr w:type="spellStart"/>
-      <w:r>
-        <w:t>Ninguna</w:t>
-      </w:r>
-      <w:proofErr w:type="spellEnd"/>
-      <w:r>
-        <w:t xml:space="preserve"> </w:t>
-      </w:r>
-      <w:proofErr w:type="spellStart"/>
-      <w:r>
-        <w:t>logró</w:t>
-      </w:r>
-      <w:proofErr w:type="spellEnd"/>
-      <w:r>
-        <w:t xml:space="preserve"> </w:t>
-      </w:r>
-      <w:proofErr w:type="spellStart"/>
-      <w:r>
-        <w:t>una</w:t>
-      </w:r>
-      <w:proofErr w:type="spellEnd"/>
-      <w:r>
-        <w:t xml:space="preserve"> </w:t>
-      </w:r>
-      <w:proofErr w:type="spellStart"/>
-      <w:r>
-        <w:t>mejora</w:t>
-      </w:r>
-      <w:proofErr w:type="spellEnd"/>
-      <w:r>
-        <w:t xml:space="preserve"> </w:t>
-      </w:r>
-      <w:proofErr w:type="spellStart"/>
-      <w:r>
-        <w:t>apreciable</w:t>
-      </w:r>
-      <w:proofErr w:type="spellEnd"/>
-      <w:r>
-        <w:t xml:space="preserve"> </w:t>
-      </w:r>
-      <w:proofErr w:type="spellStart"/>
-      <w:r>
-        <w:t>sobre</w:t>
-      </w:r>
-      <w:proofErr w:type="spellEnd"/>
-      <w:r>
-        <w:t xml:space="preserve"> el holdout real:</w:t>
+      <w:r>
+        <w:t>Ninguna logró una mejora apreciable sobre el holdout real:</w:t>
       </w:r>
     </w:p>
     <w:tbl>
@@ -6616,14 +5877,12 @@
             <w:tcW w:w="0" w:type="auto"/>
           </w:tcPr>
           <w:p>
-            <w:proofErr w:type="spellStart"/>
             <w:r>
               <w:rPr>
                 <w:b/>
               </w:rPr>
               <w:t>Verificación</w:t>
             </w:r>
-            <w:proofErr w:type="spellEnd"/>
           </w:p>
         </w:tc>
         <w:tc>
@@ -6631,14 +5890,12 @@
             <w:tcW w:w="0" w:type="auto"/>
           </w:tcPr>
           <w:p>
-            <w:proofErr w:type="spellStart"/>
             <w:r>
               <w:rPr>
                 <w:b/>
               </w:rPr>
               <w:t>Variación</w:t>
             </w:r>
-            <w:proofErr w:type="spellEnd"/>
           </w:p>
         </w:tc>
         <w:tc>
@@ -6646,33 +5903,11 @@
             <w:tcW w:w="0" w:type="auto"/>
           </w:tcPr>
           <w:p>
-            <w:proofErr w:type="spellStart"/>
             <w:r>
               <w:rPr>
                 <w:b/>
               </w:rPr>
-              <w:t>Resultado</w:t>
-            </w:r>
-            <w:proofErr w:type="spellEnd"/>
-            <w:r>
-              <w:rPr>
-                <w:b/>
-              </w:rPr>
-              <w:t xml:space="preserve"> </w:t>
-            </w:r>
-            <w:proofErr w:type="spellStart"/>
-            <w:r>
-              <w:rPr>
-                <w:b/>
-              </w:rPr>
-              <w:t>sobre</w:t>
-            </w:r>
-            <w:proofErr w:type="spellEnd"/>
-            <w:r>
-              <w:rPr>
-                <w:b/>
-              </w:rPr>
-              <w:t xml:space="preserve"> el holdout 2024</w:t>
+              <w:t>Resultado sobre el holdout 2024</w:t>
             </w:r>
           </w:p>
         </w:tc>
@@ -6684,44 +5919,8 @@
           </w:tcPr>
           <w:p>
             <w:r>
-              <w:t xml:space="preserve">1. </w:t>
+              <w:t>1. Hiperparámetros genéricos</w:t>
             </w:r>
-            <w:proofErr w:type="spellStart"/>
-            <w:r>
-              <w:t>Hiperparámetros</w:t>
-            </w:r>
-            <w:proofErr w:type="spellEnd"/>
-            <w:r>
-              <w:t xml:space="preserve"> </w:t>
-            </w:r>
-            <w:proofErr w:type="spellStart"/>
-            <w:r>
-              <w:t>genéricos</w:t>
-            </w:r>
-            <w:proofErr w:type="spellEnd"/>
-          </w:p>
-        </w:tc>
-        <w:tc>
-          <w:tcPr>
-            <w:tcW w:w="0" w:type="auto"/>
-          </w:tcPr>
-          <w:p>
-            <w:proofErr w:type="spellStart"/>
-            <w:r>
-              <w:rPr>
-                <w:rStyle w:val="ClarkdownCode"/>
-              </w:rPr>
-              <w:t>RandomizedSearchCV</w:t>
-            </w:r>
-            <w:proofErr w:type="spellEnd"/>
-            <w:r>
-              <w:t xml:space="preserve">, 25 × 5-fold = 125 </w:t>
-            </w:r>
-            <w:proofErr w:type="spellStart"/>
-            <w:r>
-              <w:t>ajustes</w:t>
-            </w:r>
-            <w:proofErr w:type="spellEnd"/>
           </w:p>
         </w:tc>
         <w:tc>
@@ -6730,21 +5929,24 @@
           </w:tcPr>
           <w:p>
             <w:r>
-              <w:t xml:space="preserve">Sin </w:t>
+              <w:rPr>
+                <w:rStyle w:val="ClarkdownCode"/>
+              </w:rPr>
+              <w:t>RandomizedSearchCV</w:t>
             </w:r>
-            <w:proofErr w:type="spellStart"/>
             <w:r>
-              <w:t>mejora</w:t>
+              <w:t>, 25 × 5-fold = 125 ajustes</w:t>
             </w:r>
-            <w:proofErr w:type="spellEnd"/>
+          </w:p>
+        </w:tc>
+        <w:tc>
+          <w:tcPr>
+            <w:tcW w:w="0" w:type="auto"/>
+          </w:tcPr>
+          <w:p>
             <w:r>
-              <w:t xml:space="preserve"> </w:t>
+              <w:t>Sin mejora apreciable</w:t>
             </w:r>
-            <w:proofErr w:type="spellStart"/>
-            <w:r>
-              <w:t>apreciable</w:t>
-            </w:r>
-            <w:proofErr w:type="spellEnd"/>
           </w:p>
         </w:tc>
       </w:tr>
@@ -6755,13 +5957,8 @@
           </w:tcPr>
           <w:p>
             <w:r>
-              <w:t xml:space="preserve">2. Variables </w:t>
+              <w:t>2. Variables nuevas</w:t>
             </w:r>
-            <w:proofErr w:type="spellStart"/>
-            <w:r>
-              <w:t>nuevas</w:t>
-            </w:r>
-            <w:proofErr w:type="spellEnd"/>
           </w:p>
         </w:tc>
         <w:tc>
@@ -6796,21 +5993,7 @@
               <w:rPr>
                 <w:lang w:val="es-GT"/>
               </w:rPr>
-              <w:t xml:space="preserve">V de </w:t>
-            </w:r>
-            <w:proofErr w:type="spellStart"/>
-            <w:r>
-              <w:rPr>
-                <w:lang w:val="es-GT"/>
-              </w:rPr>
-              <w:t>Cramér</w:t>
-            </w:r>
-            <w:proofErr w:type="spellEnd"/>
-            <w:r>
-              <w:rPr>
-                <w:lang w:val="es-GT"/>
-              </w:rPr>
-              <w:t xml:space="preserve"> 0.008 y 0.001; ninguna métrica se movió</w:t>
+              <w:t>V de Cramér 0.008 y 0.001; ninguna métrica se movió</w:t>
             </w:r>
           </w:p>
         </w:tc>
@@ -6822,60 +6005,8 @@
           </w:tcPr>
           <w:p>
             <w:r>
-              <w:t xml:space="preserve">3. </w:t>
+              <w:t>3. Hiperparámetros nativos</w:t>
             </w:r>
-            <w:proofErr w:type="spellStart"/>
-            <w:r>
-              <w:t>Hiperparámetros</w:t>
-            </w:r>
-            <w:proofErr w:type="spellEnd"/>
-            <w:r>
-              <w:t xml:space="preserve"> </w:t>
-            </w:r>
-            <w:proofErr w:type="spellStart"/>
-            <w:r>
-              <w:t>nativos</w:t>
-            </w:r>
-            <w:proofErr w:type="spellEnd"/>
-          </w:p>
-        </w:tc>
-        <w:tc>
-          <w:tcPr>
-            <w:tcW w:w="0" w:type="auto"/>
-          </w:tcPr>
-          <w:p>
-            <w:proofErr w:type="spellStart"/>
-            <w:r>
-              <w:rPr>
-                <w:rStyle w:val="ClarkdownCode"/>
-              </w:rPr>
-              <w:t>RandomizedSearchCV</w:t>
-            </w:r>
-            <w:proofErr w:type="spellEnd"/>
-            <w:r>
-              <w:t xml:space="preserve"> </w:t>
-            </w:r>
-            <w:proofErr w:type="spellStart"/>
-            <w:r>
-              <w:t>sobre</w:t>
-            </w:r>
-            <w:proofErr w:type="spellEnd"/>
-            <w:r>
-              <w:t xml:space="preserve"> </w:t>
-            </w:r>
-            <w:proofErr w:type="spellStart"/>
-            <w:r>
-              <w:t>LightGBM</w:t>
-            </w:r>
-            <w:proofErr w:type="spellEnd"/>
-            <w:r>
-              <w:t xml:space="preserve">, 60 × 5-fold = 300 </w:t>
-            </w:r>
-            <w:proofErr w:type="spellStart"/>
-            <w:r>
-              <w:t>ajustes</w:t>
-            </w:r>
-            <w:proofErr w:type="spellEnd"/>
           </w:p>
         </w:tc>
         <w:tc>
@@ -6884,15 +6015,23 @@
           </w:tcPr>
           <w:p>
             <w:r>
-              <w:t xml:space="preserve">ROC-AUC 0.741 · Recall </w:t>
+              <w:rPr>
+                <w:rStyle w:val="ClarkdownCode"/>
+              </w:rPr>
+              <w:t>RandomizedSearchCV</w:t>
             </w:r>
-            <w:proofErr w:type="gramStart"/>
             <w:r>
-              <w:t>66.0% ·</w:t>
+              <w:t xml:space="preserve"> sobre LightGBM, 60 × 5-fold = 300 ajustes</w:t>
             </w:r>
-            <w:proofErr w:type="gramEnd"/>
+          </w:p>
+        </w:tc>
+        <w:tc>
+          <w:tcPr>
+            <w:tcW w:w="0" w:type="auto"/>
+          </w:tcPr>
+          <w:p>
             <w:r>
-              <w:t xml:space="preserve"> F1 0.461</w:t>
+              <w:t>ROC-AUC 0.741 · Recall 66.0% · F1 0.461</w:t>
             </w:r>
           </w:p>
         </w:tc>
@@ -6904,13 +6043,8 @@
           </w:tcPr>
           <w:p>
             <w:r>
-              <w:t xml:space="preserve">4. Modelo </w:t>
+              <w:t>4. Modelo reducido</w:t>
             </w:r>
-            <w:proofErr w:type="spellStart"/>
-            <w:r>
-              <w:t>reducido</w:t>
-            </w:r>
-            <w:proofErr w:type="spellEnd"/>
           </w:p>
         </w:tc>
         <w:tc>
@@ -6937,15 +6071,7 @@
           </w:tcPr>
           <w:p>
             <w:r>
-              <w:t xml:space="preserve">ROC-AUC 0.734 · Recall </w:t>
-            </w:r>
-            <w:proofErr w:type="gramStart"/>
-            <w:r>
-              <w:t>66.8% ·</w:t>
-            </w:r>
-            <w:proofErr w:type="gramEnd"/>
-            <w:r>
-              <w:t xml:space="preserve"> F1 0.460</w:t>
+              <w:t>ROC-AUC 0.734 · Recall 66.8% · F1 0.460</w:t>
             </w:r>
           </w:p>
         </w:tc>
@@ -6957,21 +6083,8 @@
           </w:tcPr>
           <w:p>
             <w:r>
-              <w:t xml:space="preserve">5. </w:t>
+              <w:t>5. Búsqueda bayesiana</w:t>
             </w:r>
-            <w:proofErr w:type="spellStart"/>
-            <w:r>
-              <w:t>Búsqueda</w:t>
-            </w:r>
-            <w:proofErr w:type="spellEnd"/>
-            <w:r>
-              <w:t xml:space="preserve"> </w:t>
-            </w:r>
-            <w:proofErr w:type="spellStart"/>
-            <w:r>
-              <w:t>bayesiana</w:t>
-            </w:r>
-            <w:proofErr w:type="spellEnd"/>
           </w:p>
         </w:tc>
         <w:tc>
@@ -6984,33 +6097,11 @@
                 <w:lang w:val="es-GT"/>
               </w:rPr>
             </w:pPr>
-            <w:proofErr w:type="spellStart"/>
             <w:r>
               <w:rPr>
                 <w:lang w:val="es-GT"/>
               </w:rPr>
-              <w:t>Optuna</w:t>
-            </w:r>
-            <w:proofErr w:type="spellEnd"/>
-            <w:r>
-              <w:rPr>
-                <w:lang w:val="es-GT"/>
-              </w:rPr>
-              <w:t xml:space="preserve"> (TPE), mismo espacio y presupuesto que </w:t>
-            </w:r>
-            <w:proofErr w:type="gramStart"/>
-            <w:r>
-              <w:rPr>
-                <w:lang w:val="es-GT"/>
-              </w:rPr>
-              <w:t>la n.º</w:t>
-            </w:r>
-            <w:proofErr w:type="gramEnd"/>
-            <w:r>
-              <w:rPr>
-                <w:lang w:val="es-GT"/>
-              </w:rPr>
-              <w:t xml:space="preserve"> 3</w:t>
+              <w:t>Optuna (TPE), mismo espacio y presupuesto que la n.º 3</w:t>
             </w:r>
           </w:p>
         </w:tc>
@@ -7020,15 +6111,7 @@
           </w:tcPr>
           <w:p>
             <w:r>
-              <w:t xml:space="preserve">ROC-AUC 0.738 · Recall </w:t>
-            </w:r>
-            <w:proofErr w:type="gramStart"/>
-            <w:r>
-              <w:t>66.3% ·</w:t>
-            </w:r>
-            <w:proofErr w:type="gramEnd"/>
-            <w:r>
-              <w:t xml:space="preserve"> F1 0.462</w:t>
+              <w:t>ROC-AUC 0.738 · Recall 66.3% · F1 0.462</w:t>
             </w:r>
           </w:p>
         </w:tc>
@@ -7044,80 +6127,8 @@
               <w:rPr>
                 <w:b/>
               </w:rPr>
-              <w:t>Modelo final (</w:t>
+              <w:t>Modelo final (referencia)</w:t>
             </w:r>
-            <w:proofErr w:type="spellStart"/>
-            <w:r>
-              <w:rPr>
-                <w:b/>
-              </w:rPr>
-              <w:t>referencia</w:t>
-            </w:r>
-            <w:proofErr w:type="spellEnd"/>
-            <w:r>
-              <w:rPr>
-                <w:b/>
-              </w:rPr>
-              <w:t>)</w:t>
-            </w:r>
-          </w:p>
-        </w:tc>
-        <w:tc>
-          <w:tcPr>
-            <w:tcW w:w="0" w:type="auto"/>
-            <w:shd w:val="clear" w:color="auto" w:fill="EAF2FB"/>
-          </w:tcPr>
-          <w:p>
-            <w:proofErr w:type="spellStart"/>
-            <w:r>
-              <w:rPr>
-                <w:b/>
-              </w:rPr>
-              <w:t>LightGBM</w:t>
-            </w:r>
-            <w:proofErr w:type="spellEnd"/>
-            <w:r>
-              <w:rPr>
-                <w:b/>
-              </w:rPr>
-              <w:t xml:space="preserve">, </w:t>
-            </w:r>
-            <w:proofErr w:type="spellStart"/>
-            <w:r>
-              <w:rPr>
-                <w:b/>
-              </w:rPr>
-              <w:t>hiperparámetros</w:t>
-            </w:r>
-            <w:proofErr w:type="spellEnd"/>
-            <w:r>
-              <w:rPr>
-                <w:b/>
-              </w:rPr>
-              <w:t xml:space="preserve"> </w:t>
-            </w:r>
-            <w:proofErr w:type="spellStart"/>
-            <w:r>
-              <w:rPr>
-                <w:b/>
-              </w:rPr>
-              <w:t>por</w:t>
-            </w:r>
-            <w:proofErr w:type="spellEnd"/>
-            <w:r>
-              <w:rPr>
-                <w:b/>
-              </w:rPr>
-              <w:t xml:space="preserve"> </w:t>
-            </w:r>
-            <w:proofErr w:type="spellStart"/>
-            <w:r>
-              <w:rPr>
-                <w:b/>
-              </w:rPr>
-              <w:t>defecto</w:t>
-            </w:r>
-            <w:proofErr w:type="spellEnd"/>
           </w:p>
         </w:tc>
         <w:tc>
@@ -7130,21 +6141,21 @@
               <w:rPr>
                 <w:b/>
               </w:rPr>
-              <w:t xml:space="preserve">ROC-AUC 0.740 · Recall </w:t>
+              <w:t>LightGBM, hiperparámetros por defecto</w:t>
             </w:r>
-            <w:proofErr w:type="gramStart"/>
+          </w:p>
+        </w:tc>
+        <w:tc>
+          <w:tcPr>
+            <w:tcW w:w="0" w:type="auto"/>
+            <w:shd w:val="clear" w:color="auto" w:fill="EAF2FB"/>
+          </w:tcPr>
+          <w:p>
             <w:r>
               <w:rPr>
                 <w:b/>
               </w:rPr>
-              <w:t>67.8% ·</w:t>
-            </w:r>
-            <w:proofErr w:type="gramEnd"/>
-            <w:r>
-              <w:rPr>
-                <w:b/>
-              </w:rPr>
-              <w:t xml:space="preserve"> F1 0.467</w:t>
+              <w:t>ROC-AUC 0.740 · Recall 67.8% · F1 0.467</w:t>
             </w:r>
           </w:p>
         </w:tc>
@@ -7160,127 +6171,20 @@
         <w:rPr>
           <w:lang w:val="es-GT"/>
         </w:rPr>
-        <w:t xml:space="preserve">Las dos búsquedas profundas de </w:t>
-      </w:r>
-      <w:proofErr w:type="spellStart"/>
-      <w:r>
-        <w:rPr>
-          <w:lang w:val="es-GT"/>
-        </w:rPr>
-        <w:t>hiperparámetros</w:t>
-      </w:r>
-      <w:proofErr w:type="spellEnd"/>
-      <w:r>
-        <w:rPr>
-          <w:lang w:val="es-GT"/>
-        </w:rPr>
-        <w:t xml:space="preserve"> (verificaciones 3 y 5) sí mejoraron la validación cruzada —de 0.773 a 0.777—, pero esa ventaja se desvanece sobre el </w:t>
-      </w:r>
-      <w:proofErr w:type="spellStart"/>
-      <w:r>
-        <w:rPr>
-          <w:lang w:val="es-GT"/>
-        </w:rPr>
-        <w:t>holdout</w:t>
-      </w:r>
-      <w:proofErr w:type="spellEnd"/>
-      <w:r>
-        <w:rPr>
-          <w:lang w:val="es-GT"/>
-        </w:rPr>
-        <w:t xml:space="preserve">: las tres variantes de </w:t>
-      </w:r>
-      <w:proofErr w:type="spellStart"/>
-      <w:r>
-        <w:rPr>
-          <w:lang w:val="es-GT"/>
-        </w:rPr>
-        <w:t>LightGBM</w:t>
-      </w:r>
-      <w:proofErr w:type="spellEnd"/>
-      <w:r>
-        <w:rPr>
-          <w:lang w:val="es-GT"/>
-        </w:rPr>
-        <w:t xml:space="preserve"> caen dentro de un rango de tres milésimas de ROC-AUC, y la que más profundizó en el espacio de </w:t>
-      </w:r>
-      <w:proofErr w:type="spellStart"/>
-      <w:r>
-        <w:rPr>
-          <w:lang w:val="es-GT"/>
-        </w:rPr>
-        <w:t>hiperparámetros</w:t>
-      </w:r>
-      <w:proofErr w:type="spellEnd"/>
-      <w:r>
-        <w:rPr>
-          <w:lang w:val="es-GT"/>
-        </w:rPr>
-        <w:t xml:space="preserve"> (</w:t>
-      </w:r>
-      <w:proofErr w:type="spellStart"/>
-      <w:r>
-        <w:rPr>
-          <w:lang w:val="es-GT"/>
-        </w:rPr>
-        <w:t>Optuna</w:t>
-      </w:r>
-      <w:proofErr w:type="spellEnd"/>
-      <w:r>
-        <w:rPr>
-          <w:lang w:val="es-GT"/>
-        </w:rPr>
-        <w:t xml:space="preserve">) es, de hecho, la que peor generalizó fuera de tiempo. Por eso la memoria reporta el modelo con </w:t>
-      </w:r>
-      <w:proofErr w:type="spellStart"/>
-      <w:r>
-        <w:rPr>
-          <w:b/>
-          <w:lang w:val="es-GT"/>
-        </w:rPr>
-        <w:t>hiperparámetros</w:t>
-      </w:r>
-      <w:proofErr w:type="spellEnd"/>
-      <w:r>
-        <w:rPr>
-          <w:b/>
-          <w:lang w:val="es-GT"/>
-        </w:rPr>
-        <w:t xml:space="preserve"> por defecto</w:t>
-      </w:r>
-      <w:r>
-        <w:rPr>
-          <w:lang w:val="es-GT"/>
-        </w:rPr>
-        <w:t xml:space="preserve">: iguala al ajustado en discriminación, lo supera en </w:t>
-      </w:r>
-      <w:proofErr w:type="spellStart"/>
-      <w:r>
-        <w:rPr>
-          <w:lang w:val="es-GT"/>
-        </w:rPr>
-        <w:t>recall</w:t>
-      </w:r>
-      <w:proofErr w:type="spellEnd"/>
-      <w:r>
-        <w:rPr>
-          <w:lang w:val="es-GT"/>
-        </w:rPr>
-        <w:t xml:space="preserve"> sobre la clase fatal (67.8% vs. 66.0%) y no obliga a justificar una configuración más compleja. Los </w:t>
-      </w:r>
-      <w:proofErr w:type="spellStart"/>
-      <w:r>
-        <w:rPr>
-          <w:lang w:val="es-GT"/>
-        </w:rPr>
-        <w:t>hiperparámetros</w:t>
-      </w:r>
-      <w:proofErr w:type="spellEnd"/>
-      <w:r>
-        <w:rPr>
-          <w:lang w:val="es-GT"/>
-        </w:rPr>
-        <w:t xml:space="preserve"> exactos de cada búsqueda se detallan en el Anexo D.</w:t>
+        <w:t xml:space="preserve">Las dos búsquedas profundas de hiperparámetros (verificaciones 3 y 5) sí mejoraron la validación cruzada —de 0.773 a 0.777—, pero esa ventaja se desvanece sobre el holdout: las tres variantes de LightGBM caen dentro de un rango de tres milésimas de ROC-AUC, y la que más profundizó en el espacio de hiperparámetros (Optuna) es, de hecho, la que peor generalizó fuera de tiempo. Por eso la memoria reporta el modelo con </w:t>
+      </w:r>
+      <w:r>
+        <w:rPr>
+          <w:b/>
+          <w:lang w:val="es-GT"/>
+        </w:rPr>
+        <w:t>hiperparámetros por defecto</w:t>
+      </w:r>
+      <w:r>
+        <w:rPr>
+          <w:lang w:val="es-GT"/>
+        </w:rPr>
+        <w:t>: iguala al ajustado en discriminación, lo supera en recall sobre la clase fatal (67.8% vs. 66.0%) y no obliga a justificar una configuración más compleja. Los hiperparámetros exactos de cada búsqueda se detallan en el Anexo D.</w:t>
       </w:r>
     </w:p>
     <w:p>
@@ -7300,21 +6204,7 @@
           <w:lang w:val="es-GT"/>
         </w:rPr>
         <w:lastRenderedPageBreak/>
-        <w:t xml:space="preserve">modelo, ni la variante de </w:t>
-      </w:r>
-      <w:proofErr w:type="spellStart"/>
-      <w:r>
-        <w:rPr>
-          <w:lang w:val="es-GT"/>
-        </w:rPr>
-        <w:t>boosting</w:t>
-      </w:r>
-      <w:proofErr w:type="spellEnd"/>
-      <w:r>
-        <w:rPr>
-          <w:lang w:val="es-GT"/>
-        </w:rPr>
-        <w:t xml:space="preserve"> elegida, ni lo sofisticado del algoritmo de búsqueda. El margen de mejora real está en incorporar variables nuevas, no en seguir optimizando sobre las actuales (Capítulo 7.2).</w:t>
+        <w:t>modelo, ni la variante de boosting elegida, ni lo sofisticado del algoritmo de búsqueda. El margen de mejora real está en incorporar variables nuevas, no en seguir optimizando sobre las actuales (Capítulo 7.2).</w:t>
       </w:r>
     </w:p>
     <w:p>
@@ -7330,49 +6220,7 @@
         <w:rPr>
           <w:lang w:val="es-GT"/>
         </w:rPr>
-        <w:t xml:space="preserve">4.4. Evaluación final sobre el </w:t>
-      </w:r>
-      <w:proofErr w:type="spellStart"/>
-      <w:r>
-        <w:rPr>
-          <w:lang w:val="es-GT"/>
-        </w:rPr>
-        <w:t>holdout</w:t>
-      </w:r>
-      <w:proofErr w:type="spellEnd"/>
-      <w:r>
-        <w:rPr>
-          <w:lang w:val="es-GT"/>
-        </w:rPr>
-        <w:t xml:space="preserve"> </w:t>
-      </w:r>
-      <w:proofErr w:type="spellStart"/>
-      <w:r>
-        <w:rPr>
-          <w:lang w:val="es-GT"/>
-        </w:rPr>
-        <w:t>Out</w:t>
-      </w:r>
-      <w:proofErr w:type="spellEnd"/>
-      <w:r>
-        <w:rPr>
-          <w:lang w:val="es-GT"/>
-        </w:rPr>
-        <w:t>-</w:t>
-      </w:r>
-      <w:proofErr w:type="spellStart"/>
-      <w:r>
-        <w:rPr>
-          <w:lang w:val="es-GT"/>
-        </w:rPr>
-        <w:t>of</w:t>
-      </w:r>
-      <w:proofErr w:type="spellEnd"/>
-      <w:r>
-        <w:rPr>
-          <w:lang w:val="es-GT"/>
-        </w:rPr>
-        <w:t>-Time (2024)</w:t>
+        <w:t>4.4. Evaluación final sobre el holdout Out-of-Time (2024)</w:t>
       </w:r>
       <w:bookmarkEnd w:id="39"/>
       <w:bookmarkEnd w:id="40"/>
@@ -7387,21 +6235,7 @@
         <w:rPr>
           <w:lang w:val="es-GT"/>
         </w:rPr>
-        <w:t>El modelo ganador (</w:t>
-      </w:r>
-      <w:proofErr w:type="spellStart"/>
-      <w:r>
-        <w:rPr>
-          <w:lang w:val="es-GT"/>
-        </w:rPr>
-        <w:t>LightGBM</w:t>
-      </w:r>
-      <w:proofErr w:type="spellEnd"/>
-      <w:r>
-        <w:rPr>
-          <w:lang w:val="es-GT"/>
-        </w:rPr>
-        <w:t xml:space="preserve">, con las variables de feriado/temporada alta vial ya incluidas) se reentrenó con la totalidad de 2018–2023 y se evaluó </w:t>
+        <w:t xml:space="preserve">El modelo ganador (LightGBM, con las variables de feriado/temporada alta vial ya incluidas) se reentrenó con la totalidad de 2018–2023 y se evaluó </w:t>
       </w:r>
       <w:r>
         <w:rPr>
@@ -7448,77 +6282,7 @@
                   <w:rPr>
                     <w:b/>
                   </w:rPr>
-                  <w:t>ROC-AUC: 0.740 · PR-AUC: 0.469 · Recall (</w:t>
-                </w:r>
-                <w:proofErr w:type="spellStart"/>
-                <w:r>
-                  <w:rPr>
-                    <w:b/>
-                  </w:rPr>
-                  <w:t>Fallecido</w:t>
-                </w:r>
-                <w:proofErr w:type="spellEnd"/>
-                <w:r>
-                  <w:rPr>
-                    <w:b/>
-                  </w:rPr>
-                  <w:t xml:space="preserve">): </w:t>
-                </w:r>
-                <w:proofErr w:type="gramStart"/>
-                <w:r>
-                  <w:rPr>
-                    <w:b/>
-                  </w:rPr>
-                  <w:t>67.8% ·</w:t>
-                </w:r>
-                <w:proofErr w:type="gramEnd"/>
-                <w:r>
-                  <w:rPr>
-                    <w:b/>
-                  </w:rPr>
-                  <w:t xml:space="preserve"> Precision (</w:t>
-                </w:r>
-                <w:proofErr w:type="spellStart"/>
-                <w:r>
-                  <w:rPr>
-                    <w:b/>
-                  </w:rPr>
-                  <w:t>Fallecido</w:t>
-                </w:r>
-                <w:proofErr w:type="spellEnd"/>
-                <w:r>
-                  <w:rPr>
-                    <w:b/>
-                  </w:rPr>
-                  <w:t xml:space="preserve">): </w:t>
-                </w:r>
-                <w:proofErr w:type="gramStart"/>
-                <w:r>
-                  <w:rPr>
-                    <w:b/>
-                  </w:rPr>
-                  <w:t>35.7% ·</w:t>
-                </w:r>
-                <w:proofErr w:type="gramEnd"/>
-                <w:r>
-                  <w:rPr>
-                    <w:b/>
-                  </w:rPr>
-                  <w:t xml:space="preserve"> F1 (</w:t>
-                </w:r>
-                <w:proofErr w:type="spellStart"/>
-                <w:r>
-                  <w:rPr>
-                    <w:b/>
-                  </w:rPr>
-                  <w:t>Fallecido</w:t>
-                </w:r>
-                <w:proofErr w:type="spellEnd"/>
-                <w:r>
-                  <w:rPr>
-                    <w:b/>
-                  </w:rPr>
-                  <w:t>): 0.467</w:t>
+                  <w:t>ROC-AUC: 0.740 · PR-AUC: 0.469 · Recall (Fallecido): 67.8% · Precision (Fallecido): 35.7% · F1 (Fallecido): 0.467</w:t>
                 </w:r>
               </w:p>
             </w:sdtContent>
@@ -7580,49 +6344,7 @@
         <w:rPr>
           <w:lang w:val="es-GT"/>
         </w:rPr>
-        <w:t xml:space="preserve">La matriz de confusión hace tangibles esas métricas sobre los 11,272 casos del </w:t>
-      </w:r>
-      <w:proofErr w:type="spellStart"/>
-      <w:r>
-        <w:rPr>
-          <w:lang w:val="es-GT"/>
-        </w:rPr>
-        <w:t>holdout</w:t>
-      </w:r>
-      <w:proofErr w:type="spellEnd"/>
-      <w:r>
-        <w:rPr>
-          <w:lang w:val="es-GT"/>
-        </w:rPr>
-        <w:t xml:space="preserve">: de los 2,365 siniestros realmente fatales, el modelo detecta 1,603 (el 67.8% de </w:t>
-      </w:r>
-      <w:proofErr w:type="spellStart"/>
-      <w:r>
-        <w:rPr>
-          <w:lang w:val="es-GT"/>
-        </w:rPr>
-        <w:t>recall</w:t>
-      </w:r>
-      <w:proofErr w:type="spellEnd"/>
-      <w:r>
-        <w:rPr>
-          <w:lang w:val="es-GT"/>
-        </w:rPr>
-        <w:t xml:space="preserve">) y deja pasar 762 como falsos negativos; de los 4,494 casos que el modelo marca como de alto riesgo, 1,603 en efecto lo eran (35.7% de precisión) y 2,891 resultaron ser falsos positivos — el costo operacional de priorizar el </w:t>
-      </w:r>
-      <w:proofErr w:type="spellStart"/>
-      <w:r>
-        <w:rPr>
-          <w:lang w:val="es-GT"/>
-        </w:rPr>
-        <w:t>recall</w:t>
-      </w:r>
-      <w:proofErr w:type="spellEnd"/>
-      <w:r>
-        <w:rPr>
-          <w:lang w:val="es-GT"/>
-        </w:rPr>
-        <w:t>, discutido más abajo.</w:t>
+        <w:t>La matriz de confusión hace tangibles esas métricas sobre los 11,272 casos del holdout: de los 2,365 siniestros realmente fatales, el modelo detecta 1,603 (el 67.8% de recall) y deja pasar 762 como falsos negativos; de los 4,494 casos que el modelo marca como de alto riesgo, 1,603 en efecto lo eran (35.7% de precisión) y 2,891 resultaron ser falsos positivos — el costo operacional de priorizar el recall, discutido más abajo.</w:t>
       </w:r>
     </w:p>
     <w:p>
@@ -7637,87 +6359,38 @@
         </w:rPr>
         <w:t>Un matiz metodológico que conviene documentar: LightGBM tuvo el mejor ROC-AUC en validación cruzada por un margen mínimo sobre XGBoost (0.7720 vs. 0.7715), pero sobre el holdout de 2024 HistGradientBoosting alcanza 0.743 frente al 0.740 de LightGBM. El modelo que se reporta sigue siendo LightGBM, y deliberadamente: el criterio de selección se fijó antes de mirar el holdout, y cambiarlo después equivaldría a usar la muestra de evaluación para tomar una decisión de modelado, exactamente el sesgo que la partición Out-of-Time existe para evitar. La diferencia es de tres milésimas: las tres implementaciones de boosting convergen al mismo techo, lo que refuerza que ese techo lo determinan las variables disponibles y no la implementación.</w:t>
       </w:r>
-      <w:proofErr w:type="spellStart"/>
-      <w:proofErr w:type="spellEnd"/>
-      <w:proofErr w:type="spellStart"/>
-      <w:proofErr w:type="spellEnd"/>
-      <w:proofErr w:type="spellStart"/>
-      <w:proofErr w:type="spellEnd"/>
-      <w:proofErr w:type="spellStart"/>
-      <w:proofErr w:type="spellEnd"/>
-      <w:proofErr w:type="spellStart"/>
-      <w:proofErr w:type="spellEnd"/>
-      <w:proofErr w:type="spellStart"/>
-      <w:proofErr w:type="spellEnd"/>
-      <w:proofErr w:type="spellStart"/>
-      <w:proofErr w:type="spellEnd"/>
-      <w:proofErr w:type="spellStart"/>
-      <w:proofErr w:type="spellEnd"/>
-      <w:proofErr w:type="spellStart"/>
-      <w:proofErr w:type="spellEnd"/>
-      <w:proofErr w:type="spellStart"/>
-      <w:proofErr w:type="spellEnd"/>
-      <w:proofErr w:type="spellStart"/>
-      <w:proofErr w:type="spellEnd"/>
-      <w:proofErr w:type="spellStart"/>
-      <w:proofErr w:type="spellEnd"/>
-      <w:proofErr w:type="spellStart"/>
-      <w:proofErr w:type="spellEnd"/>
-      <w:proofErr w:type="spellStart"/>
-      <w:proofErr w:type="spellEnd"/>
-    </w:p>
-    <w:p>
-      <w:pPr>
-        <w:rPr>
-          <w:lang w:val="es-GT"/>
-        </w:rPr>
-      </w:pPr>
-      <w:r>
-        <w:rPr>
-          <w:lang w:val="es-GT"/>
-        </w:rPr>
-        <w:t xml:space="preserve">Para contextualizar estos números: un ROC-AUC de 0.5 equivale a azar puro y 1.0 a un clasificador perfecto; en aplicaciones de </w:t>
-      </w:r>
-      <w:proofErr w:type="spellStart"/>
-      <w:r>
-        <w:rPr>
-          <w:lang w:val="es-GT"/>
-        </w:rPr>
-        <w:t>scoring</w:t>
-      </w:r>
-      <w:proofErr w:type="spellEnd"/>
-      <w:r>
-        <w:rPr>
-          <w:lang w:val="es-GT"/>
-        </w:rPr>
-        <w:t xml:space="preserve"> de riesgo sobre datos administrativos (sin variables de causalidad directa como velocidad, alcohol o clima), un valor en el rango 0.70–0.80 se considera de discriminación aceptable y operacionalmente útil. El PR-AUC es especialmente informativo dado el desbalance de clases: la línea base de un clasificador sin ninguna capacidad predictiva sería igual a la tasa base de la clase fatal (~19–21%), de modo que 0.469 representa más del doble de esa referencia.</w:t>
-      </w:r>
-    </w:p>
-    <w:p>
-      <w:pPr>
-        <w:rPr>
-          <w:lang w:val="es-GT"/>
-        </w:rPr>
-      </w:pPr>
-      <w:r>
-        <w:rPr>
-          <w:lang w:val="es-GT"/>
-        </w:rPr>
-        <w:t xml:space="preserve">El balance </w:t>
-      </w:r>
-      <w:proofErr w:type="spellStart"/>
-      <w:r>
-        <w:rPr>
-          <w:lang w:val="es-GT"/>
-        </w:rPr>
-        <w:t>recall</w:t>
-      </w:r>
-      <w:proofErr w:type="spellEnd"/>
-      <w:r>
-        <w:rPr>
-          <w:lang w:val="es-GT"/>
-        </w:rPr>
-        <w:t>/precisión (67.8% / 35.7%) es una decisión operacional deliberada, no una debilidad: para una herramienta orientada a priorizar recursos de prevención vial, el costo de no detectar un caso de alto riesgo (falso negativo) es considerablemente mayor que el costo de revisar de más un caso que no resultó fatal (falso positivo).</w:t>
+    </w:p>
+    <w:p>
+      <w:pPr>
+        <w:rPr>
+          <w:lang w:val="es-GT"/>
+        </w:rPr>
+      </w:pPr>
+      <w:r>
+        <w:rPr>
+          <w:lang w:val="es-GT"/>
+        </w:rPr>
+        <w:t xml:space="preserve">Para contextualizar estos números: un ROC-AUC de 0.5 equivale a azar puro y 1.0 a un clasificador perfecto; en aplicaciones de scoring de riesgo sobre datos administrativos (sin </w:t>
+      </w:r>
+      <w:r>
+        <w:rPr>
+          <w:lang w:val="es-GT"/>
+        </w:rPr>
+        <w:lastRenderedPageBreak/>
+        <w:t>variables de causalidad directa como velocidad, alcohol o clima), un valor en el rango 0.70–0.80 se considera de discriminación aceptable y operacionalmente útil. El PR-AUC es especialmente informativo dado el desbalance de clases: la línea base de un clasificador sin ninguna capacidad predictiva sería igual a la tasa base de la clase fatal (~19–21%), de modo que 0.469 representa más del doble de esa referencia.</w:t>
+      </w:r>
+    </w:p>
+    <w:p>
+      <w:pPr>
+        <w:rPr>
+          <w:lang w:val="es-GT"/>
+        </w:rPr>
+      </w:pPr>
+      <w:r>
+        <w:rPr>
+          <w:lang w:val="es-GT"/>
+        </w:rPr>
+        <w:t>El balance recall/precisión (67.8% / 35.7%) es una decisión operacional deliberada, no una debilidad: para una herramienta orientada a priorizar recursos de prevención vial, el costo de no detectar un caso de alto riesgo (falso negativo) es considerablemente mayor que el costo de revisar de más un caso que no resultó fatal (falso positivo).</w:t>
       </w:r>
     </w:p>
     <w:p>
@@ -7747,21 +6420,7 @@
           <w:lang w:val="es-GT"/>
         </w:rPr>
         <w:lastRenderedPageBreak/>
-        <w:t xml:space="preserve">Capítulo 5: Interpretabilidad y </w:t>
-      </w:r>
-      <w:proofErr w:type="spellStart"/>
-      <w:r>
-        <w:rPr>
-          <w:lang w:val="es-GT"/>
-        </w:rPr>
-        <w:t>Explicabilidad</w:t>
-      </w:r>
-      <w:proofErr w:type="spellEnd"/>
-      <w:r>
-        <w:rPr>
-          <w:lang w:val="es-GT"/>
-        </w:rPr>
-        <w:t xml:space="preserve"> del Modelo (XAI)</w:t>
+        <w:t>Capítulo 5: Interpretabilidad y Explicabilidad del Modelo (XAI)</w:t>
       </w:r>
       <w:bookmarkEnd w:id="41"/>
       <w:bookmarkEnd w:id="42"/>
@@ -7810,16 +6469,6 @@
         </w:rPr>
         <w:t>En entornos de alta responsabilidad como la gestión pública de seguridad vial, un modelo de tipo "caja negra" resulta poco útil sin una capa de explicabilidad. Este trabajo usa valores SHAP (SHapley Additive exPlanations), un método de teoría de juegos cooperativos que reparte de forma aditiva la contribución de cada variable a la predicción, calculados con TreeExplainer, la variante exacta para modelos de árboles.</w:t>
       </w:r>
-      <w:proofErr w:type="spellStart"/>
-      <w:proofErr w:type="spellEnd"/>
-      <w:proofErr w:type="spellStart"/>
-      <w:proofErr w:type="spellEnd"/>
-      <w:proofErr w:type="spellStart"/>
-      <w:proofErr w:type="spellEnd"/>
-      <w:proofErr w:type="spellStart"/>
-      <w:proofErr w:type="spellEnd"/>
-      <w:proofErr w:type="spellStart"/>
-      <w:proofErr w:type="spellEnd"/>
     </w:p>
     <w:p>
       <w:pPr>
@@ -7834,21 +6483,7 @@
         <w:rPr>
           <w:lang w:val="es-GT"/>
         </w:rPr>
-        <w:t xml:space="preserve">5.2. </w:t>
-      </w:r>
-      <w:proofErr w:type="spellStart"/>
-      <w:r>
-        <w:rPr>
-          <w:lang w:val="es-GT"/>
-        </w:rPr>
-        <w:t>Explicatividad</w:t>
-      </w:r>
-      <w:proofErr w:type="spellEnd"/>
-      <w:r>
-        <w:rPr>
-          <w:lang w:val="es-GT"/>
-        </w:rPr>
-        <w:t xml:space="preserve"> global: importancia de variables</w:t>
+        <w:t>5.2. Explicatividad global: importancia de variables</w:t>
       </w:r>
       <w:bookmarkEnd w:id="45"/>
       <w:bookmarkEnd w:id="46"/>
@@ -7865,7 +6500,6 @@
         </w:rPr>
         <w:t xml:space="preserve">Tras la codificación descrita en el Capítulo 3, el modelo final trabaja con 84 columnas. Los valores SHAP se calcularon con </w:t>
       </w:r>
-      <w:proofErr w:type="spellStart"/>
       <w:r>
         <w:rPr>
           <w:rStyle w:val="ClarkdownCode"/>
@@ -7873,48 +6507,24 @@
         </w:rPr>
         <w:t>TreeExplainer</w:t>
       </w:r>
-      <w:proofErr w:type="spellEnd"/>
       <w:r>
         <w:rPr>
           <w:lang w:val="es-GT"/>
         </w:rPr>
         <w:t xml:space="preserve"> sobre el </w:t>
       </w:r>
-      <w:proofErr w:type="spellStart"/>
-      <w:r>
-        <w:rPr>
-          <w:b/>
-          <w:lang w:val="es-GT"/>
-        </w:rPr>
-        <w:t>holdout</w:t>
-      </w:r>
-      <w:proofErr w:type="spellEnd"/>
-      <w:r>
-        <w:rPr>
-          <w:b/>
-          <w:lang w:val="es-GT"/>
-        </w:rPr>
-        <w:t xml:space="preserve"> 2024 completo</w:t>
-      </w:r>
-      <w:r>
-        <w:rPr>
-          <w:lang w:val="es-GT"/>
-        </w:rPr>
-        <w:t xml:space="preserve"> (11,272 casos). El gráfico (Figura 5.1) ordena cada columna por el valor absoluto medio de su SHAP </w:t>
-      </w:r>
-      <w:proofErr w:type="spellStart"/>
-      <w:r>
-        <w:rPr>
-          <w:lang w:val="es-GT"/>
-        </w:rPr>
-        <w:t>value</w:t>
-      </w:r>
-      <w:proofErr w:type="spellEnd"/>
-      <w:r>
-        <w:rPr>
-          <w:lang w:val="es-GT"/>
-        </w:rPr>
-        <w:t xml:space="preserve">; las de mayor impacto son </w:t>
+      <w:r>
+        <w:rPr>
+          <w:b/>
+          <w:lang w:val="es-GT"/>
+        </w:rPr>
+        <w:t>holdout 2024 completo</w:t>
+      </w:r>
+      <w:r>
+        <w:rPr>
+          <w:lang w:val="es-GT"/>
+        </w:rPr>
+        <w:t xml:space="preserve"> (11,272 casos). El gráfico (Figura 5.1) ordena cada columna por el valor absoluto medio de su SHAP value; las de mayor impacto son </w:t>
       </w:r>
       <w:r>
         <w:rPr>
@@ -8007,7 +6617,6 @@
         </w:rPr>
         <w:t>, la codificación cíclica de la hora (</w:t>
       </w:r>
-      <w:proofErr w:type="spellStart"/>
       <w:r>
         <w:rPr>
           <w:rStyle w:val="ClarkdownCode"/>
@@ -8015,7 +6624,6 @@
         </w:rPr>
         <w:t>hora_cos</w:t>
       </w:r>
-      <w:proofErr w:type="spellEnd"/>
       <w:r>
         <w:rPr>
           <w:lang w:val="es-GT"/>
@@ -8033,21 +6641,7 @@
         <w:rPr>
           <w:lang w:val="es-GT"/>
         </w:rPr>
-        <w:t xml:space="preserve">. Ninguna de las dos variables de feriado/temporada alta aparece entre las 15 más influyentes — coherente con su V de </w:t>
-      </w:r>
-      <w:proofErr w:type="spellStart"/>
-      <w:r>
-        <w:rPr>
-          <w:lang w:val="es-GT"/>
-        </w:rPr>
-        <w:t>Cramér</w:t>
-      </w:r>
-      <w:proofErr w:type="spellEnd"/>
-      <w:r>
-        <w:rPr>
-          <w:lang w:val="es-GT"/>
-        </w:rPr>
-        <w:t xml:space="preserve"> casi nula (Capítulo 3.3) y con que no movieron ninguna métrica (Capítulo 4.3).</w:t>
+        <w:t>. Ninguna de las dos variables de feriado/temporada alta aparece entre las 15 más influyentes — coherente con su V de Cramér casi nula (Capítulo 3.3) y con que no movieron ninguna métrica (Capítulo 4.3).</w:t>
       </w:r>
     </w:p>
     <w:p>
@@ -8274,7 +6868,7 @@
           <w:lang w:val="es-GT"/>
         </w:rPr>
       </w:pPr>
-      <w:r xml:space="preserve">
+      <w:r>
         <w:rPr>
           <w:b/>
           <w:lang w:val="es-GT"/>
@@ -8299,23 +6893,7 @@
           <w:lang w:val="es-GT"/>
         </w:rPr>
         <w:lastRenderedPageBreak/>
-        <w:t xml:space="preserve">Aseguradora — </w:t>
-      </w:r>
-      <w:proofErr w:type="spellStart"/>
-      <w:r>
-        <w:rPr>
-          <w:b/>
-          <w:lang w:val="es-GT"/>
-        </w:rPr>
-        <w:t>triage</w:t>
-      </w:r>
-      <w:proofErr w:type="spellEnd"/>
-      <w:r>
-        <w:rPr>
-          <w:b/>
-          <w:lang w:val="es-GT"/>
-        </w:rPr>
-        <w:t xml:space="preserve"> de siniestros:</w:t>
+        <w:t>Aseguradora — triage de siniestros:</w:t>
       </w:r>
       <w:r>
         <w:rPr>
@@ -8376,18 +6954,10 @@
           <w:lang w:val="es-GT"/>
         </w:rPr>
         <w:lastRenderedPageBreak/>
-        <w:t xml:space="preserve">Capítulo 6: </w:t>
-      </w:r>
-      <w:proofErr w:type="spellStart"/>
-      <w:r>
-        <w:rPr>
-          <w:lang w:val="es-GT"/>
-        </w:rPr>
-        <w:t>Productivización</w:t>
+        <w:t>Capítulo 6: Productivización</w:t>
       </w:r>
       <w:bookmarkEnd w:id="49"/>
       <w:bookmarkEnd w:id="50"/>
-      <w:proofErr w:type="spellEnd"/>
     </w:p>
     <w:p>
       <w:pPr>
@@ -8419,19 +6989,10 @@
         </w:rPr>
         <w:t>Se construyó una aplicación interactiva en Streamlit (app.py) que carga el preprocesador y el modelo ya serializados (modelo/preprocesador_tfm.joblib, modelo/modelo_final_tfm.joblib), junto con las frecuencias históricas de municipio y marca, los diccionarios de traducción código → etiqueta y el catálogo de municipios por departamento, generados por la sección 9 del notebook. Un formulario reconstruye, para el caso ingresado, exactamente las mismas variables derivadas del Capítulo 3 antes de pasarlas por el mismo preprocesador del entrenamiento, evitando discrepancias entre lo que el modelo aprendió y lo que recibe en producción.</w:t>
       </w:r>
-      <w:proofErr w:type="spellStart"/>
-      <w:proofErr w:type="spellEnd"/>
-      <w:proofErr w:type="spellStart"/>
-      <w:proofErr w:type="spellEnd"/>
-      <w:proofErr w:type="spellStart"/>
-      <w:proofErr w:type="spellEnd"/>
-      <w:proofErr w:type="spellStart"/>
-      <w:proofErr w:type="spellEnd"/>
-      <w:proofErr w:type="spellStart"/>
-      <w:proofErr w:type="spellEnd"/>
-      <w:proofErr w:type="gramStart"/>
-      <w:proofErr w:type="gramEnd"/>
-      <w:r xml:space="preserve">
+      <w:r>
+        <w:rPr>
+          <w:lang w:val="es-GT"/>
+        </w:rPr>
         <w:t xml:space="preserve"> Ambas aplicaciones están desplegadas en Streamlit Community Cloud y son accesibles sin instalar nada: el simulador en tfm-siniestros-viales-guatemala-estimador.streamlit.app y el prototipo de captura en tfm-siniestros-viales-guatemala-reporte.streamlit.app. Corren en contenedores gratuitos que se suspenden tras un periodo de inactividad, por lo que la primera carga puede tardar cerca de un minuto en reactivarse.</w:t>
       </w:r>
     </w:p>
@@ -8489,7 +7050,7 @@
           <w:lang w:val="es-GT"/>
         </w:rPr>
       </w:pPr>
-      <w:r xml:space="preserve">
+      <w:r>
         <w:rPr>
           <w:b/>
           <w:lang w:val="es-GT"/>
@@ -8528,18 +7089,14 @@
         </w:rPr>
         <w:t>Ambas aplicaciones comparten un único módulo de scoring (scoring_tfm.py) que reproduce la ingeniería de características del Capítulo 3.3 y lee del propio artefacto la lista de columnas que el modelo espera. La centralización es deliberada: replicar esa transformación en cada app hace que, al incorporar una variable nueva, las copias se desincronicen en silencio.</w:t>
       </w:r>
-      <w:proofErr w:type="spellStart"/>
-      <w:proofErr w:type="spellEnd"/>
-      <w:proofErr w:type="gramStart"/>
-      <w:proofErr w:type="gramEnd"/>
-    </w:p>
-    <w:p>
-      <w:pPr>
-        <w:rPr>
-          <w:lang w:val="es-GT"/>
-        </w:rPr>
-      </w:pPr>
-      <w:r xml:space="preserve">
+    </w:p>
+    <w:p>
+      <w:pPr>
+        <w:rPr>
+          <w:lang w:val="es-GT"/>
+        </w:rPr>
+      </w:pPr>
+      <w:r>
         <w:rPr>
           <w:lang w:val="es-GT"/>
         </w:rPr>
@@ -8626,10 +7183,15 @@
         <w:rPr>
           <w:lang w:val="es-GT"/>
         </w:rPr>
-        <w:t>El escenario de mayor riesgo objetivo obtiene una probabilidad claramente más alta (+13.6 puntos porcentuales, cerca de 1.6 veces la del otro), coherente con los hallazgos del Capítulo 5. Ambos casos caen dentro de la banda "Moderado": es el reflejo esperable de un modelo que discrimina señal real pero no ofrece separaciones extremas para un caso individual, consistente con el ROC-AUC de 0.740.</w:t>
-      </w:r>
-      <w:proofErr w:type="gramStart"/>
-      <w:proofErr w:type="gramEnd"/>
+        <w:t xml:space="preserve">El escenario de mayor riesgo objetivo obtiene una probabilidad claramente más alta (+13.6 puntos porcentuales, cerca de 1.6 veces la del otro), coherente con los hallazgos del Capítulo 5. Ambos casos caen dentro de la banda "Moderado": es el reflejo esperable de un modelo que discrimina </w:t>
+      </w:r>
+      <w:r>
+        <w:rPr>
+          <w:lang w:val="es-GT"/>
+        </w:rPr>
+        <w:lastRenderedPageBreak/>
+        <w:t>señal real pero no ofrece separaciones extremas para un caso individual, consistente con el ROC-AUC de 0.740.</w:t>
+      </w:r>
     </w:p>
     <w:p>
       <w:pPr>
@@ -8661,22 +7223,6 @@
         </w:rPr>
         <w:t>Como complemento se construyó un segundo prototipo (reporte_aseguradora.py) que explora un mecanismo de recolección continua: un formulario que captura la ubicación por geolocalización del navegador, la hora de forma automática y los campos relevantes del siniestro, y devuelve en el momento la probabilidad estimada de fatalidad — con lo que la captura se convierte también en herramienta de triage. Está enfocado en personal de una aseguradora que auxilia el siniestro en el lugar de los hechos (Capítulo 1.2). La motivación es directa: el INE publica sus microdatos con rezago considerable —al cierre de este trabajo aún no está disponible 2025— y un reporte en campo podría complementar esa cadencia.</w:t>
       </w:r>
-      <w:proofErr w:type="gramStart"/>
-      <w:proofErr w:type="gramEnd"/>
-      <w:proofErr w:type="spellStart"/>
-      <w:proofErr w:type="spellEnd"/>
-    </w:p>
-    <w:p>
-      <w:pPr>
-        <w:rPr>
-          <w:lang w:val="es-GT"/>
-        </w:rPr>
-      </w:pPr>
-      <w:r>
-        <w:rPr>
-          <w:lang w:val="es-GT"/>
-        </w:rPr>
-      </w:r>
     </w:p>
     <w:p>
       <w:pPr>
@@ -8690,20 +7236,6 @@
           <w:lang w:val="es-GT"/>
         </w:rPr>
         <w:t>Su segunda función es la más relevante: sirve de maqueta de captura validada. El Capítulo 2.3 documentó defectos concretos —hora = 99, edad = 999, un registro con anio = 3, el 31.2% sin día de la semana— típicos de una captura con poca validación. El prototipo muestra cómo se evitan: listas cerradas en lugar de texto libre, ubicación y hora tomadas del dispositivo, y la categoría "Ignorado" excluida por diseño. Recoge además las seis variables de la capa 1 del Capítulo 7.4, intercaladas en la sección que por contenido les corresponde y señaladas una a una: el modelo actual no las usa, y la interfaz lo advierte. Ese principio de captura validada aplica igual — o más — al registro policial que origina la fuente oficial, cuyo instrumento en campo no está documentado públicamente (Capítulo 7.4).</w:t>
-      </w:r>
-      <w:proofErr w:type="spellStart"/>
-      <w:proofErr w:type="spellEnd"/>
-    </w:p>
-    <w:p>
-      <w:pPr>
-        <w:rPr>
-          <w:lang w:val="es-GT"/>
-        </w:rPr>
-      </w:pPr>
-      <w:r>
-        <w:rPr>
-          <w:lang w:val="es-GT"/>
-        </w:rPr>
       </w:r>
     </w:p>
     <w:tbl>
@@ -8742,22 +7274,7 @@
                   <w:rPr>
                     <w:lang w:val="es-GT"/>
                   </w:rPr>
-                  <w:t xml:space="preserve">Es deliberadamente una prueba de concepto y no un sistema en producción: corre en un contenedor efímero que no conserva los reportes, y — sobre todo — un reporte capturado en el momento del hecho no puede saber todavía si hubo o no un desenlace fatal, que es justamente la variable objetivo del modelo. Por eso cada reporte queda marcado como pendiente_de_verificacion: antes de incorporarse a un reentrenamiento necesitaría un proceso de verificación posterior contra una fuente confiable, fuera del alcance de este trabajo.</w:t>
-                </w:r>
-                <w:proofErr w:type="spellStart"/>
-                <w:r>
-                  <w:rPr>
-                    <w:rStyle w:val="ClarkdownCode"/>
-                    <w:lang w:val="es-GT"/>
-                  </w:rPr>
-                  <w:t/>
-                </w:r>
-                <w:proofErr w:type="spellEnd"/>
-                <w:r>
-                  <w:rPr>
-                    <w:lang w:val="es-GT"/>
-                  </w:rPr>
-                  <w:t/>
+                  <w:t>Es deliberadamente una prueba de concepto y no un sistema en producción: corre en un contenedor efímero que no conserva los reportes, y — sobre todo — un reporte capturado en el momento del hecho no puede saber todavía si hubo o no un desenlace fatal, que es justamente la variable objetivo del modelo. Por eso cada reporte queda marcado como pendiente_de_verificacion: antes de incorporarse a un reentrenamiento necesitaría un proceso de verificación posterior contra una fuente confiable, fuera del alcance de este trabajo.</w:t>
                 </w:r>
               </w:p>
             </w:sdtContent>
@@ -8778,21 +7295,7 @@
         <w:rPr>
           <w:lang w:val="es-GT"/>
         </w:rPr>
-        <w:t xml:space="preserve">6.4. Automatización de la actualización de datos y reentrenamiento (Model </w:t>
-      </w:r>
-      <w:proofErr w:type="spellStart"/>
-      <w:r>
-        <w:rPr>
-          <w:lang w:val="es-GT"/>
-        </w:rPr>
-        <w:t>Monitoring</w:t>
-      </w:r>
-      <w:proofErr w:type="spellEnd"/>
-      <w:r>
-        <w:rPr>
-          <w:lang w:val="es-GT"/>
-        </w:rPr>
-        <w:t>)</w:t>
+        <w:t>6.4. Automatización de la actualización de datos y reentrenamiento (Model Monitoring)</w:t>
       </w:r>
       <w:bookmarkEnd w:id="57"/>
       <w:bookmarkEnd w:id="58"/>
@@ -8814,17 +7317,8 @@
           <w:i/>
           <w:lang w:val="es-GT"/>
         </w:rPr>
-        <w:t xml:space="preserve">Model </w:t>
-      </w:r>
-      <w:proofErr w:type="spellStart"/>
-      <w:r>
-        <w:rPr>
-          <w:i/>
-          <w:lang w:val="es-GT"/>
-        </w:rPr>
-        <w:t>Monitoring</w:t>
-      </w:r>
-      <w:proofErr w:type="spellEnd"/>
+        <w:t>Model Monitoring</w:t>
+      </w:r>
       <w:r>
         <w:rPr>
           <w:lang w:val="es-GT"/>
@@ -8849,42 +7343,13 @@
           <w:b/>
           <w:lang w:val="es-GT"/>
         </w:rPr>
-        <w:lastRenderedPageBreak/>
         <w:t>descargar_datos.py</w:t>
       </w:r>
       <w:r>
         <w:rPr>
           <w:lang w:val="es-GT"/>
         </w:rPr>
-        <w:t xml:space="preserve"> </w:t>
-      </w:r>
-      <w:proofErr w:type="spellStart"/>
-      <w:r>
-        <w:rPr>
-          <w:lang w:val="es-GT"/>
-        </w:rPr>
-        <w:t>autodescubre</w:t>
-      </w:r>
-      <w:proofErr w:type="spellEnd"/>
-      <w:r>
-        <w:rPr>
-          <w:lang w:val="es-GT"/>
-        </w:rPr>
-        <w:t xml:space="preserve"> los recursos vigentes del portal de datos abiertos del INE a través de su API pública de CKAN y descarga los archivos anuales que falten, con un conjunto de </w:t>
-      </w:r>
-      <w:proofErr w:type="spellStart"/>
-      <w:r>
-        <w:rPr>
-          <w:lang w:val="es-GT"/>
-        </w:rPr>
-        <w:t>URLs</w:t>
-      </w:r>
-      <w:proofErr w:type="spellEnd"/>
-      <w:r>
-        <w:rPr>
-          <w:lang w:val="es-GT"/>
-        </w:rPr>
-        <w:t xml:space="preserve"> de respaldo por si esa API no responde. Elimina la dependencia de que alguien descargue y coloque manualmente los </w:t>
+        <w:t xml:space="preserve"> autodescubre los recursos vigentes del portal de datos abiertos del INE a través de su API pública de CKAN y descarga los archivos anuales que falten, con un conjunto de URLs de respaldo por si esa API no responde. Elimina la dependencia de que alguien descargue y coloque manualmente los </w:t>
       </w:r>
       <w:r>
         <w:rPr>
@@ -8914,18 +7379,17 @@
           <w:b/>
           <w:lang w:val="es-GT"/>
         </w:rPr>
-        <w:t>reentrenar_modelo.py orquesta el ciclo completo: descarga los datos, respalda el modelo desplegado, reentrena el notebook de punta a punta y compara el ROC-AUC del modelo nuevo contra el anterior sobre su propio holdout. El modelo nuevo solo reemplaza al desplegado si se aprueba explícitamente (--promover) y su ROC-AUC no empeora más allá de una tolerancia configurable: para un modelo que informa decisiones de seguridad vial se prioriza que una persona confirme cada actualización. Cada corrida queda registrada en un log.</w:t>
-      </w:r>
-      <w:proofErr w:type="spellStart"/>
-      <w:proofErr w:type="spellEnd"/>
-      <w:proofErr w:type="spellStart"/>
-      <w:proofErr w:type="spellEnd"/>
-      <w:proofErr w:type="spellStart"/>
-      <w:proofErr w:type="spellEnd"/>
-      <w:proofErr w:type="spellStart"/>
-      <w:proofErr w:type="spellEnd"/>
-      <w:proofErr w:type="spellStart"/>
-      <w:proofErr w:type="spellEnd"/>
+        <w:t xml:space="preserve">reentrenar_modelo.py orquesta el ciclo completo: descarga los datos, respalda el modelo desplegado, reentrena el notebook de punta a punta y compara el ROC-AUC del modelo nuevo contra el anterior sobre su propio holdout. El modelo nuevo solo reemplaza al desplegado si se aprueba explícitamente (--promover) y su ROC-AUC no empeora más allá de una tolerancia configurable: para un modelo que informa </w:t>
+      </w:r>
+      <w:r>
+        <w:rPr>
+          <w:rStyle w:val="ClarkdownCode"/>
+          <w:b/>
+          <w:lang w:val="es-GT"/>
+        </w:rPr>
+        <w:lastRenderedPageBreak/>
+        <w:t>decisiones de seguridad vial se prioriza que una persona confirme cada actualización. Cada corrida queda registrada en un log.</w:t>
+      </w:r>
     </w:p>
     <w:tbl>
       <w:tblPr>
@@ -8996,21 +7460,7 @@
                   <w:rPr>
                     <w:lang w:val="es-GT"/>
                   </w:rPr>
-                  <w:t xml:space="preserve"> (hash SHA-256), y la vía de autodescubrimiento por API funcionó sin recurrir a las </w:t>
-                </w:r>
-                <w:proofErr w:type="spellStart"/>
-                <w:r>
-                  <w:rPr>
-                    <w:lang w:val="es-GT"/>
-                  </w:rPr>
-                  <w:t>URLs</w:t>
-                </w:r>
-                <w:proofErr w:type="spellEnd"/>
-                <w:r>
-                  <w:rPr>
-                    <w:lang w:val="es-GT"/>
-                  </w:rPr>
-                  <w:t xml:space="preserve"> de respaldo. El pipeline queda así reproducible de punta a punta desde la fuente oficial.</w:t>
+                  <w:t xml:space="preserve"> (hash SHA-256), y la vía de autodescubrimiento por API funcionó sin recurrir a las URLs de respaldo. El pipeline queda así reproducible de punta a punta desde la fuente oficial.</w:t>
                 </w:r>
               </w:p>
             </w:sdtContent>
@@ -9102,35 +7552,7 @@
         <w:rPr>
           <w:lang w:val="es-GT"/>
         </w:rPr>
-        <w:t xml:space="preserve"> casos que terminaron en fallecimiento sobre un año completo que nunca vio durante su entrenamiento — 2024 —, sin necesidad de recolectar ninguna variable nueva. En términos técnicos: </w:t>
-      </w:r>
-      <w:proofErr w:type="spellStart"/>
-      <w:r>
-        <w:rPr>
-          <w:lang w:val="es-GT"/>
-        </w:rPr>
-        <w:t>Recall</w:t>
-      </w:r>
-      <w:proofErr w:type="spellEnd"/>
-      <w:r>
-        <w:rPr>
-          <w:lang w:val="es-GT"/>
-        </w:rPr>
-        <w:t xml:space="preserve"> 67.8% y ROC-AUC 0.740, un rango que en </w:t>
-      </w:r>
-      <w:proofErr w:type="spellStart"/>
-      <w:r>
-        <w:rPr>
-          <w:lang w:val="es-GT"/>
-        </w:rPr>
-        <w:t>scoring</w:t>
-      </w:r>
-      <w:proofErr w:type="spellEnd"/>
-      <w:r>
-        <w:rPr>
-          <w:lang w:val="es-GT"/>
-        </w:rPr>
-        <w:t xml:space="preserve"> de riesgo sobre datos administrativos se considera operacionalmente útil.</w:t>
+        <w:t xml:space="preserve"> casos que terminaron en fallecimiento sobre un año completo que nunca vio durante su entrenamiento — 2024 —, sin necesidad de recolectar ninguna variable nueva. En términos técnicos: Recall 67.8% y ROC-AUC 0.740, un rango que en scoring de riesgo sobre datos administrativos se considera operacionalmente útil.</w:t>
       </w:r>
     </w:p>
     <w:p>
@@ -9155,21 +7577,7 @@
         <w:rPr>
           <w:lang w:val="es-GT"/>
         </w:rPr>
-        <w:t xml:space="preserve"> El departamento de Guatemala concentra el mayor volumen del </w:t>
-      </w:r>
-      <w:proofErr w:type="gramStart"/>
-      <w:r>
-        <w:rPr>
-          <w:lang w:val="es-GT"/>
-        </w:rPr>
-        <w:t>país</w:t>
-      </w:r>
-      <w:proofErr w:type="gramEnd"/>
-      <w:r>
-        <w:rPr>
-          <w:lang w:val="es-GT"/>
-        </w:rPr>
-        <w:t xml:space="preserve"> pero registra la tasa de fatalidad </w:t>
+        <w:t xml:space="preserve"> El departamento de Guatemala concentra el mayor volumen del país pero registra la tasa de fatalidad </w:t>
       </w:r>
       <w:r>
         <w:rPr>
@@ -9245,50 +7653,7 @@
         <w:rPr>
           <w:lang w:val="es-GT"/>
         </w:rPr>
-        <w:t xml:space="preserve"> Cinco verificaciones independientes —dos búsquedas de </w:t>
-      </w:r>
-      <w:proofErr w:type="spellStart"/>
-      <w:r>
-        <w:rPr>
-          <w:lang w:val="es-GT"/>
-        </w:rPr>
-        <w:t>hiperparámetros</w:t>
-      </w:r>
-      <w:proofErr w:type="spellEnd"/>
-      <w:r>
-        <w:rPr>
-          <w:lang w:val="es-GT"/>
-        </w:rPr>
-        <w:t xml:space="preserve">, una búsqueda bayesiana con </w:t>
-      </w:r>
-      <w:proofErr w:type="spellStart"/>
-      <w:r>
-        <w:rPr>
-          <w:lang w:val="es-GT"/>
-        </w:rPr>
-        <w:lastRenderedPageBreak/>
-        <w:t>Optuna</w:t>
-      </w:r>
-      <w:proofErr w:type="spellEnd"/>
-      <w:r>
-        <w:rPr>
-          <w:lang w:val="es-GT"/>
-        </w:rPr>
-        <w:t xml:space="preserve">, un modelo reducido a 15 variables y el ensayo de dos variables nuevas— confirmaron que el desempeño actual está en el techo alcanzable con la información disponible: ninguna lo superó de forma apreciable, y las tres librerías de </w:t>
-      </w:r>
-      <w:proofErr w:type="spellStart"/>
-      <w:r>
-        <w:rPr>
-          <w:lang w:val="es-GT"/>
-        </w:rPr>
-        <w:t>boosting</w:t>
-      </w:r>
-      <w:proofErr w:type="spellEnd"/>
-      <w:r>
-        <w:rPr>
-          <w:lang w:val="es-GT"/>
-        </w:rPr>
-        <w:t xml:space="preserve"> evaluadas quedaron dentro de tres milésimas entre sí. El margen real de mejora está en capturar variables que hoy no se registran (Capítulo 7.4).</w:t>
+        <w:t xml:space="preserve"> Cinco verificaciones independientes —dos búsquedas de hiperparámetros, una búsqueda bayesiana con Optuna, un modelo reducido a 15 variables y el ensayo de dos variables nuevas— confirmaron que el desempeño actual está en el techo alcanzable con la información disponible: ninguna lo superó de forma apreciable, y las tres librerías de boosting evaluadas quedaron dentro de tres milésimas entre sí. El margen real de mejora está en capturar variables que hoy no se registran (Capítulo 7.4).</w:t>
       </w:r>
     </w:p>
     <w:p>
@@ -9323,15 +7688,10 @@
       <w:bookmarkStart w:id="63" w:name="_72_limitaciones"/>
       <w:bookmarkStart w:id="64" w:name="_Toc240103752"/>
       <w:r>
-        <w:t xml:space="preserve">7.2. </w:t>
-      </w:r>
-      <w:proofErr w:type="spellStart"/>
-      <w:r>
-        <w:t>Limitaciones</w:t>
+        <w:t>7.2. Limitaciones</w:t>
       </w:r>
       <w:bookmarkEnd w:id="63"/>
       <w:bookmarkEnd w:id="64"/>
-      <w:proofErr w:type="spellEnd"/>
     </w:p>
     <w:p>
       <w:pPr>
@@ -9355,91 +7715,14 @@
         <w:rPr>
           <w:lang w:val="es-GT"/>
         </w:rPr>
-        <w:t xml:space="preserve"> el </w:t>
-      </w:r>
-      <w:proofErr w:type="spellStart"/>
-      <w:r>
-        <w:rPr>
-          <w:lang w:val="es-GT"/>
-        </w:rPr>
-        <w:t>dataset</w:t>
-      </w:r>
-      <w:proofErr w:type="spellEnd"/>
-      <w:r>
-        <w:rPr>
-          <w:lang w:val="es-GT"/>
-        </w:rPr>
-        <w:t xml:space="preserve"> del INE/PNC es de naturaleza administrativa y no incluye variables de causalidad directa documentadas en la literatura de seguridad vial — velocidad real, consumo de alcohol, condición climática o estado de la infraestructura. Los valores de asociación (V de </w:t>
-      </w:r>
-      <w:proofErr w:type="spellStart"/>
-      <w:r>
-        <w:rPr>
-          <w:lang w:val="es-GT"/>
-        </w:rPr>
-        <w:t>Cramér</w:t>
-      </w:r>
-      <w:proofErr w:type="spellEnd"/>
-      <w:r>
-        <w:rPr>
-          <w:lang w:val="es-GT"/>
-        </w:rPr>
-        <w:t xml:space="preserve">) obtenidos en el Capítulo 3, todos en el rango pequeño-moderado, son coherentes con esta ausencia: el techo de desempeño del modelo está condicionado por la información disponible, no por la técnica empleada — de hecho, tres implementaciones distintas de </w:t>
-      </w:r>
-      <w:proofErr w:type="spellStart"/>
-      <w:r>
-        <w:rPr>
-          <w:lang w:val="es-GT"/>
-        </w:rPr>
-        <w:t>boosting</w:t>
-      </w:r>
-      <w:proofErr w:type="spellEnd"/>
-      <w:r>
-        <w:rPr>
-          <w:lang w:val="es-GT"/>
-        </w:rPr>
-        <w:t xml:space="preserve"> (</w:t>
-      </w:r>
-      <w:proofErr w:type="spellStart"/>
-      <w:r>
-        <w:rPr>
-          <w:lang w:val="es-GT"/>
-        </w:rPr>
-        <w:t>HistGradientBoosting</w:t>
-      </w:r>
-      <w:proofErr w:type="spellEnd"/>
-      <w:r>
-        <w:rPr>
-          <w:lang w:val="es-GT"/>
-        </w:rPr>
-        <w:t xml:space="preserve">, </w:t>
-      </w:r>
-      <w:proofErr w:type="spellStart"/>
-      <w:r>
-        <w:rPr>
-          <w:lang w:val="es-GT"/>
-        </w:rPr>
-        <w:t>XGBoost</w:t>
-      </w:r>
-      <w:proofErr w:type="spellEnd"/>
-      <w:r>
-        <w:rPr>
-          <w:lang w:val="es-GT"/>
-        </w:rPr>
-        <w:t xml:space="preserve">, </w:t>
-      </w:r>
-      <w:proofErr w:type="spellStart"/>
-      <w:r>
-        <w:rPr>
-          <w:lang w:val="es-GT"/>
-        </w:rPr>
-        <w:t>LightGBM</w:t>
-      </w:r>
-      <w:proofErr w:type="spellEnd"/>
-      <w:r>
-        <w:rPr>
-          <w:lang w:val="es-GT"/>
-        </w:rPr>
-        <w:t>) convergen al mismo techo (Capítulo 4.4), lo que refuerza esta conclusión.</w:t>
+        <w:t xml:space="preserve"> el dataset del INE/PNC es de naturaleza administrativa y no incluye variables de causalidad directa documentadas en la literatura de seguridad vial — </w:t>
+      </w:r>
+      <w:r>
+        <w:rPr>
+          <w:lang w:val="es-GT"/>
+        </w:rPr>
+        <w:lastRenderedPageBreak/>
+        <w:t>velocidad real, consumo de alcohol, condición climática o estado de la infraestructura. Los valores de asociación (V de Cramér) obtenidos en el Capítulo 3, todos en el rango pequeño-moderado, son coherentes con esta ausencia: el techo de desempeño del modelo está condicionado por la información disponible, no por la técnica empleada — de hecho, tres implementaciones distintas de boosting (HistGradientBoosting, XGBoost, LightGBM) convergen al mismo techo (Capítulo 4.4), lo que refuerza esta conclusión.</w:t>
       </w:r>
     </w:p>
     <w:p>
@@ -9502,21 +7785,7 @@
         <w:rPr>
           <w:lang w:val="es-GT"/>
         </w:rPr>
-        <w:t xml:space="preserve"> mantenga su plataforma CKAN y una API pública compatible; un cambio de plataforma requeriría actualizar a mano las </w:t>
-      </w:r>
-      <w:proofErr w:type="spellStart"/>
-      <w:r>
-        <w:rPr>
-          <w:lang w:val="es-GT"/>
-        </w:rPr>
-        <w:t>URLs</w:t>
-      </w:r>
-      <w:proofErr w:type="spellEnd"/>
-      <w:r>
-        <w:rPr>
-          <w:lang w:val="es-GT"/>
-        </w:rPr>
-        <w:t xml:space="preserve"> de respaldo del script </w:t>
+        <w:t xml:space="preserve"> mantenga su plataforma CKAN y una API pública compatible; un cambio de plataforma requeriría actualizar a mano las URLs de respaldo del script </w:t>
       </w:r>
       <w:r>
         <w:rPr>
@@ -9564,23 +7833,10 @@
       <w:bookmarkStart w:id="65" w:name="_73_trabajo_futuro"/>
       <w:bookmarkStart w:id="66" w:name="_Toc240103753"/>
       <w:r>
-        <w:t xml:space="preserve">7.3. </w:t>
-      </w:r>
-      <w:proofErr w:type="spellStart"/>
-      <w:r>
-        <w:t>Trabajo</w:t>
-      </w:r>
-      <w:proofErr w:type="spellEnd"/>
-      <w:r>
-        <w:t xml:space="preserve"> </w:t>
-      </w:r>
-      <w:proofErr w:type="spellStart"/>
-      <w:r>
-        <w:t>futuro</w:t>
+        <w:t>7.3. Trabajo futuro</w:t>
       </w:r>
       <w:bookmarkEnd w:id="65"/>
       <w:bookmarkEnd w:id="66"/>
-      <w:proofErr w:type="spellEnd"/>
     </w:p>
     <w:p>
       <w:pPr>
@@ -9623,13 +7879,7 @@
           <w:b/>
           <w:lang w:val="es-GT"/>
         </w:rPr>
-        <w:t xml:space="preserve">Evaluar formalmente el simulador del Capítulo 6 con usuarios reales del dominio — personal de gestión de seguridad vial o del sector asegurador —, más allá de las pruebas de sentido común hechas durante su desarrollo.</w:t>
-      </w:r>
-      <w:r>
-        <w:rPr>
-          <w:lang w:val="es-GT"/>
-        </w:rPr>
-        <w:t xml:space="preserve"/>
+        <w:t>Evaluar formalmente el simulador del Capítulo 6 con usuarios reales del dominio — personal de gestión de seguridad vial o del sector asegurador —, más allá de las pruebas de sentido común hechas durante su desarrollo.</w:t>
       </w:r>
     </w:p>
     <w:p>
@@ -9737,7 +7987,6 @@
           <w:b/>
           <w:lang w:val="es-GT"/>
         </w:rPr>
-        <w:lastRenderedPageBreak/>
         <w:t>Traducir el score a impacto económico</w:t>
       </w:r>
       <w:r>
@@ -9797,12 +8046,16 @@
           <w:bCs/>
           <w:lang w:val="es-GT"/>
         </w:rPr>
-        <w:t>La selección descansa en dos criterios. El externo: la nota descriptiva Road traffic injuries de la OMS (actualizada el 20 de julio de 2026) cuantifica los determinantes de severidad que estos microdatos no registran — el casco reduce el riesgo de muerte más de seis veces, el cinturón hasta un 50%, cada 1% de aumento en la velocidad media produce un 4% más de riesgo de siniestro mortal, y sobre la atención post-siniestro señala que "demoras de minutos pueden marcar la diferencia entre la vida y la muerte" (OMS, 2026). El interno: cada variable propuesta responde a una hipótesis que este trabajo formuló y no pudo contrastar. Se agrupan según cómo se obtienen, porque eso determina su costo de recolección.</w:t>
-      </w:r>
-      <w:proofErr w:type="spellStart"/>
-      <w:proofErr w:type="spellEnd"/>
-      <w:proofErr w:type="spellStart"/>
-      <w:proofErr w:type="spellEnd"/>
+        <w:t xml:space="preserve">La selección descansa en dos criterios. El externo: la nota descriptiva Road traffic injuries de la OMS (actualizada el 20 de julio de 2026) cuantifica los determinantes de severidad que estos microdatos no registran — el casco reduce el riesgo de muerte más de seis veces, el cinturón hasta un 50%, cada 1% de aumento en la velocidad media produce un 4% más de riesgo de siniestro mortal, y sobre la atención post-siniestro señala que "demoras de minutos pueden </w:t>
+      </w:r>
+      <w:r>
+        <w:rPr>
+          <w:bCs/>
+          <w:lang w:val="es-GT"/>
+        </w:rPr>
+        <w:lastRenderedPageBreak/>
+        <w:t>marcar la diferencia entre la vida y la muerte" (OMS, 2026). El interno: cada variable propuesta responde a una hipótesis que este trabajo formuló y no pudo contrastar. Se agrupan según cómo se obtienen, porque eso determina su costo de recolección.</w:t>
+      </w:r>
     </w:p>
     <w:p>
       <w:pPr>
@@ -9909,21 +8162,7 @@
         <w:rPr>
           <w:lang w:val="es-GT"/>
         </w:rPr>
-        <w:t xml:space="preserve"> El pico de fatalidad de las 4:00 (~30% frente a ~13% al mediodía) admite dos explicaciones que el </w:t>
-      </w:r>
-      <w:proofErr w:type="spellStart"/>
-      <w:r>
-        <w:rPr>
-          <w:lang w:val="es-GT"/>
-        </w:rPr>
-        <w:t>dataset</w:t>
-      </w:r>
-      <w:proofErr w:type="spellEnd"/>
-      <w:r>
-        <w:rPr>
-          <w:lang w:val="es-GT"/>
-        </w:rPr>
-        <w:t xml:space="preserve"> no separa —menor visibilidad y menor auxilio disponible—; esta variable aísla la primera.</w:t>
+        <w:t xml:space="preserve"> El pico de fatalidad de las 4:00 (~30% frente a ~13% al mediodía) admite dos explicaciones que el dataset no separa —menor visibilidad y menor auxilio disponible—; esta variable aísla la primera.</w:t>
       </w:r>
     </w:p>
     <w:p>
@@ -10096,14 +8335,7 @@
         <w:rPr>
           <w:lang w:val="es-GT"/>
         </w:rPr>
-        <w:t xml:space="preserve"> el caso más ilustrativo. La OMS la cuantifica como determinante de primer orden, y por eso mismo no conviene capturarla mal: dos observadores darían </w:t>
-      </w:r>
-      <w:r>
-        <w:rPr>
-          <w:lang w:val="es-GT"/>
-        </w:rPr>
-        <w:lastRenderedPageBreak/>
-        <w:t>cifras distintas y ninguno puede verificarla. El límite de la vía es objetivo y se deriva de la coordenada.</w:t>
+        <w:t xml:space="preserve"> el caso más ilustrativo. La OMS la cuantifica como determinante de primer orden, y por eso mismo no conviene capturarla mal: dos observadores darían cifras distintas y ninguno puede verificarla. El límite de la vía es objetivo y se deriva de la coordenada.</w:t>
       </w:r>
     </w:p>
     <w:p>
@@ -10216,38 +8448,30 @@
         <w:rPr>
           <w:lang w:val="es-GT"/>
         </w:rPr>
-        <w:t xml:space="preserve"> — se probaron aquí y su aporte fue nulo (V de </w:t>
-      </w:r>
-      <w:proofErr w:type="spellStart"/>
-      <w:r>
-        <w:rPr>
-          <w:lang w:val="es-GT"/>
-        </w:rPr>
-        <w:t>Cramér</w:t>
-      </w:r>
-      <w:proofErr w:type="spellEnd"/>
-      <w:r>
-        <w:rPr>
-          <w:lang w:val="es-GT"/>
-        </w:rPr>
-        <w:t xml:space="preserve"> 0.008 y 0.001).</w:t>
-      </w:r>
-    </w:p>
-    <w:p>
-      <w:pPr>
-        <w:rPr>
-          <w:lang w:val="es-GT"/>
-        </w:rPr>
-      </w:pPr>
-      <w:r>
-        <w:rPr>
-          <w:b/>
-          <w:lang w:val="es-GT"/>
-        </w:rPr>
-        <w:t>El proceso importa tanto como las variables. El manual de procesos del INE documenta la cadena actual: las comisarías trasladan los hechos al Departamento de Estadística de la PNC, que remite la información mensualmente al INE en hojas de Excel por correo, donde se recodifica en SPSS antes de publicarse (INE, 2022). El instrumento de captura en el lugar del hecho no aparece documentado en las fuentes públicas consultadas. Esa cadena de validación mínima es consistente con los defectos del Capítulo 2.3 y apunta a tres mejoras: validar en el punto de captura, reducir la categoría "Ignorado" con mejor protocolo de levantamiento, e interoperar con INACIF y MSPAS para depurar el subregistro. Publicar en formatos abiertos y con menor rezago cierra la cadena.</w:t>
-      </w:r>
-      <w:proofErr w:type="spellStart"/>
-      <w:proofErr w:type="spellEnd"/>
+        <w:t xml:space="preserve"> — se probaron aquí y su aporte fue nulo (V de Cramér 0.008 y 0.001).</w:t>
+      </w:r>
+    </w:p>
+    <w:p>
+      <w:pPr>
+        <w:rPr>
+          <w:lang w:val="es-GT"/>
+        </w:rPr>
+      </w:pPr>
+      <w:r>
+        <w:rPr>
+          <w:b/>
+          <w:lang w:val="es-GT"/>
+        </w:rPr>
+        <w:t xml:space="preserve">El proceso importa tanto como las variables. El manual de procesos del INE documenta la cadena actual: las comisarías trasladan los hechos al Departamento de Estadística de la </w:t>
+      </w:r>
+      <w:r>
+        <w:rPr>
+          <w:b/>
+          <w:lang w:val="es-GT"/>
+        </w:rPr>
+        <w:lastRenderedPageBreak/>
+        <w:t>PNC, que remite la información mensualmente al INE en hojas de Excel por correo, donde se recodifica en SPSS antes de publicarse (INE, 2022). El instrumento de captura en el lugar del hecho no aparece documentado en las fuentes públicas consultadas. Esa cadena de validación mínima es consistente con los defectos del Capítulo 2.3 y apunta a tres mejoras: validar en el punto de captura, reducir la categoría "Ignorado" con mejor protocolo de levantamiento, e interoperar con INACIF y MSPAS para depurar el subregistro. Publicar en formatos abiertos y con menor rezago cierra la cadena.</w:t>
+      </w:r>
     </w:p>
     <w:p>
       <w:pPr>
@@ -10281,21 +8505,11 @@
       </w:pPr>
       <w:bookmarkStart w:id="69" w:name="referencias_bibliogrficas"/>
       <w:bookmarkStart w:id="70" w:name="_Toc240103755"/>
-      <w:proofErr w:type="spellStart"/>
-      <w:r>
-        <w:t>Referencias</w:t>
-      </w:r>
-      <w:proofErr w:type="spellEnd"/>
-      <w:r>
-        <w:t xml:space="preserve"> </w:t>
-      </w:r>
-      <w:proofErr w:type="spellStart"/>
-      <w:r>
-        <w:t>Bibliográficas</w:t>
+      <w:r>
+        <w:t>Referencias Bibliográficas</w:t>
       </w:r>
       <w:bookmarkEnd w:id="69"/>
       <w:bookmarkEnd w:id="70"/>
-      <w:proofErr w:type="spellEnd"/>
     </w:p>
     <w:p>
       <w:pPr>
@@ -10390,23 +8604,7 @@
           <w:i/>
           <w:lang w:val="es-GT"/>
         </w:rPr>
-        <w:t xml:space="preserve">Guía para el Trabajo Fin de Máster — Big Data, Data </w:t>
-      </w:r>
-      <w:proofErr w:type="spellStart"/>
-      <w:r>
-        <w:rPr>
-          <w:i/>
-          <w:lang w:val="es-GT"/>
-        </w:rPr>
-        <w:t>Science</w:t>
-      </w:r>
-      <w:proofErr w:type="spellEnd"/>
-      <w:r>
-        <w:rPr>
-          <w:i/>
-          <w:lang w:val="es-GT"/>
-        </w:rPr>
-        <w:t xml:space="preserve"> e IA (semipresencial).</w:t>
+        <w:t>Guía para el Trabajo Fin de Máster — Big Data, Data Science e IA (semipresencial).</w:t>
       </w:r>
     </w:p>
     <w:p>
@@ -10517,48 +8715,11 @@
           <w:numId w:val="23"/>
         </w:numPr>
       </w:pPr>
-      <w:proofErr w:type="spellStart"/>
-      <w:r>
-        <w:rPr>
-          <w:lang w:val="es-GT"/>
-        </w:rPr>
-        <w:lastRenderedPageBreak/>
-        <w:t>Grinsztajn</w:t>
-      </w:r>
-      <w:proofErr w:type="spellEnd"/>
-      <w:r>
-        <w:rPr>
-          <w:lang w:val="es-GT"/>
-        </w:rPr>
-        <w:t xml:space="preserve">, L., </w:t>
-      </w:r>
-      <w:proofErr w:type="spellStart"/>
-      <w:r>
-        <w:rPr>
-          <w:lang w:val="es-GT"/>
-        </w:rPr>
-        <w:t>Oyallon</w:t>
-      </w:r>
-      <w:proofErr w:type="spellEnd"/>
-      <w:r>
-        <w:rPr>
-          <w:lang w:val="es-GT"/>
-        </w:rPr>
-        <w:t xml:space="preserve">, E., &amp; </w:t>
-      </w:r>
-      <w:proofErr w:type="spellStart"/>
-      <w:r>
-        <w:rPr>
-          <w:lang w:val="es-GT"/>
-        </w:rPr>
-        <w:t>Varoquaux</w:t>
-      </w:r>
-      <w:proofErr w:type="spellEnd"/>
-      <w:r>
-        <w:rPr>
-          <w:lang w:val="es-GT"/>
-        </w:rPr>
-        <w:t xml:space="preserve">, G. (2022). </w:t>
+      <w:r>
+        <w:rPr>
+          <w:lang w:val="es-GT"/>
+        </w:rPr>
+        <w:t xml:space="preserve">Grinsztajn, L., Oyallon, E., &amp; Varoquaux, G. (2022). </w:t>
       </w:r>
       <w:r>
         <w:rPr>
@@ -10619,21 +8780,7 @@
         <w:rPr>
           <w:lang w:val="es-GT"/>
         </w:rPr>
-        <w:t xml:space="preserve"> cuantomecuesta.com/</w:t>
-      </w:r>
-      <w:proofErr w:type="spellStart"/>
-      <w:r>
-        <w:rPr>
-          <w:lang w:val="es-GT"/>
-        </w:rPr>
-        <w:t>gt</w:t>
-      </w:r>
-      <w:proofErr w:type="spellEnd"/>
-      <w:r>
-        <w:rPr>
-          <w:lang w:val="es-GT"/>
-        </w:rPr>
-        <w:t>/seguro-vehicular/.</w:t>
+        <w:t xml:space="preserve"> cuantomecuesta.com/gt/seguro-vehicular/.</w:t>
       </w:r>
     </w:p>
     <w:p>
@@ -10663,13 +8810,11 @@
       </w:pPr>
       <w:bookmarkStart w:id="71" w:name="anexos"/>
       <w:bookmarkStart w:id="72" w:name="_Toc240103756"/>
-      <w:proofErr w:type="spellStart"/>
       <w:r>
         <w:t>Anexos</w:t>
       </w:r>
       <w:bookmarkEnd w:id="71"/>
       <w:bookmarkEnd w:id="72"/>
-      <w:proofErr w:type="spellEnd"/>
     </w:p>
     <w:p>
       <w:pPr>
@@ -10695,7 +8840,6 @@
         </w:rPr>
         <w:t xml:space="preserve"> Notebook completo (</w:t>
       </w:r>
-      <w:proofErr w:type="spellStart"/>
       <w:r>
         <w:rPr>
           <w:rStyle w:val="ClarkdownCode0"/>
@@ -10703,40 +8847,11 @@
         </w:rPr>
         <w:t>TFM_Analisis_Completo.ipynb</w:t>
       </w:r>
-      <w:proofErr w:type="spellEnd"/>
-      <w:r>
-        <w:rPr>
-          <w:lang w:val="es-GT"/>
-        </w:rPr>
-        <w:t xml:space="preserve">) — descarga de datos, ETL, EDA, </w:t>
-      </w:r>
-      <w:proofErr w:type="spellStart"/>
-      <w:r>
-        <w:rPr>
-          <w:lang w:val="es-GT"/>
-        </w:rPr>
-        <w:t>feature</w:t>
-      </w:r>
-      <w:proofErr w:type="spellEnd"/>
-      <w:r>
-        <w:rPr>
-          <w:lang w:val="es-GT"/>
-        </w:rPr>
-        <w:t xml:space="preserve"> </w:t>
-      </w:r>
-      <w:proofErr w:type="spellStart"/>
-      <w:r>
-        <w:rPr>
-          <w:lang w:val="es-GT"/>
-        </w:rPr>
-        <w:t>engineering</w:t>
-      </w:r>
-      <w:proofErr w:type="spellEnd"/>
-      <w:r>
-        <w:rPr>
-          <w:lang w:val="es-GT"/>
-        </w:rPr>
-        <w:t>, modelado, evaluación e interpretabilidad, ejecutable de principio a fin, con la salida completa de la validación cruzada por pliegue. Detecta automáticamente qué librerías opcionales están instaladas y degrada de forma controlada si alguna falta.</w:t>
+      <w:r>
+        <w:rPr>
+          <w:lang w:val="es-GT"/>
+        </w:rPr>
+        <w:t>) — descarga de datos, ETL, EDA, feature engineering, modelado, evaluación e interpretabilidad, ejecutable de principio a fin, con la salida completa de la validación cruzada por pliegue. Detecta automáticamente qué librerías opcionales están instaladas y degrada de forma controlada si alguna falta.</w:t>
       </w:r>
     </w:p>
     <w:p>
@@ -10806,6 +8921,7 @@
           <w:b/>
           <w:lang w:val="es-GT"/>
         </w:rPr>
+        <w:lastRenderedPageBreak/>
         <w:t>Anexo C:</w:t>
       </w:r>
       <w:r>
@@ -10876,63 +8992,7 @@
         <w:rPr>
           <w:lang w:val="es-GT"/>
         </w:rPr>
-        <w:t xml:space="preserve"> como subconjunto mínimo para desplegar las aplicaciones) e </w:t>
-      </w:r>
-      <w:proofErr w:type="spellStart"/>
-      <w:r>
-        <w:rPr>
-          <w:lang w:val="es-GT"/>
-        </w:rPr>
-        <w:t>hiperparámetros</w:t>
-      </w:r>
-      <w:proofErr w:type="spellEnd"/>
-      <w:r>
-        <w:rPr>
-          <w:lang w:val="es-GT"/>
-        </w:rPr>
-        <w:t xml:space="preserve"> completos de cada búsqueda del Capítulo 4.3, incluidas las versiones de </w:t>
-      </w:r>
-      <w:proofErr w:type="spellStart"/>
-      <w:r>
-        <w:rPr>
-          <w:lang w:val="es-GT"/>
-        </w:rPr>
-        <w:t>XGBoost</w:t>
-      </w:r>
-      <w:proofErr w:type="spellEnd"/>
-      <w:r>
-        <w:rPr>
-          <w:lang w:val="es-GT"/>
-        </w:rPr>
-        <w:t xml:space="preserve">, </w:t>
-      </w:r>
-      <w:proofErr w:type="spellStart"/>
-      <w:r>
-        <w:rPr>
-          <w:lang w:val="es-GT"/>
-        </w:rPr>
-        <w:t>LightGBM</w:t>
-      </w:r>
-      <w:proofErr w:type="spellEnd"/>
-      <w:r>
-        <w:rPr>
-          <w:lang w:val="es-GT"/>
-        </w:rPr>
-        <w:t xml:space="preserve"> y </w:t>
-      </w:r>
-      <w:proofErr w:type="spellStart"/>
-      <w:r>
-        <w:rPr>
-          <w:lang w:val="es-GT"/>
-        </w:rPr>
-        <w:t>Optuna</w:t>
-      </w:r>
-      <w:proofErr w:type="spellEnd"/>
-      <w:r>
-        <w:rPr>
-          <w:lang w:val="es-GT"/>
-        </w:rPr>
-        <w:t xml:space="preserve"> usadas para los resultados finales.</w:t>
+        <w:t xml:space="preserve"> como subconjunto mínimo para desplegar las aplicaciones) e hiperparámetros completos de cada búsqueda del Capítulo 4.3, incluidas las versiones de XGBoost, LightGBM y Optuna usadas para los resultados finales.</w:t>
       </w:r>
     </w:p>
     <w:p>
@@ -10957,21 +9017,7 @@
         <w:rPr>
           <w:lang w:val="es-GT"/>
         </w:rPr>
-        <w:t xml:space="preserve"> Módulo de </w:t>
-      </w:r>
-      <w:proofErr w:type="spellStart"/>
-      <w:r>
-        <w:rPr>
-          <w:lang w:val="es-GT"/>
-        </w:rPr>
-        <w:t>scoring</w:t>
-      </w:r>
-      <w:proofErr w:type="spellEnd"/>
-      <w:r>
-        <w:rPr>
-          <w:lang w:val="es-GT"/>
-        </w:rPr>
-        <w:t xml:space="preserve"> compartido y scripts de automatización (</w:t>
+        <w:t xml:space="preserve"> Módulo de scoring compartido y scripts de automatización (</w:t>
       </w:r>
       <w:r>
         <w:rPr>
@@ -11078,21 +9124,7 @@
         <w:rPr>
           <w:lang w:val="es-GT"/>
         </w:rPr>
-        <w:t xml:space="preserve">. Las tres que sostienen directamente un argumento del texto —tasa de fatalidad por hora, matriz de confusión del </w:t>
-      </w:r>
-      <w:proofErr w:type="spellStart"/>
-      <w:r>
-        <w:rPr>
-          <w:lang w:val="es-GT"/>
-        </w:rPr>
-        <w:t>holdout</w:t>
-      </w:r>
-      <w:proofErr w:type="spellEnd"/>
-      <w:r>
-        <w:rPr>
-          <w:lang w:val="es-GT"/>
-        </w:rPr>
-        <w:t xml:space="preserve"> y resumen SHAP— están en el cuerpo de la memoria; aquí se recogen las restantes.</w:t>
+        <w:t>. Las tres que sostienen directamente un argumento del texto —tasa de fatalidad por hora, matriz de confusión del holdout y resumen SHAP— están en el cuerpo de la memoria; aquí se recogen las restantes.</w:t>
       </w:r>
     </w:p>
     <w:p>
@@ -11120,7 +9152,6 @@
         <w:rPr>
           <w:noProof/>
         </w:rPr>
-        <w:lastRenderedPageBreak/>
         <w:drawing>
           <wp:inline distT="0" distB="0" distL="0" distR="0" wp14:anchorId="4D047514" wp14:editId="3F0C6A11">
             <wp:extent cx="6120130" cy="4369772"/>
@@ -11177,21 +9208,7 @@
         <w:rPr>
           <w:lang w:val="es-GT"/>
         </w:rPr>
-        <w:t xml:space="preserve"> De 15.6% en 2018 a 21.0% en 2024 — la razón por la que el </w:t>
-      </w:r>
-      <w:proofErr w:type="spellStart"/>
-      <w:r>
-        <w:rPr>
-          <w:lang w:val="es-GT"/>
-        </w:rPr>
-        <w:t>holdout</w:t>
-      </w:r>
-      <w:proofErr w:type="spellEnd"/>
-      <w:r>
-        <w:rPr>
-          <w:lang w:val="es-GT"/>
-        </w:rPr>
-        <w:t xml:space="preserve"> se fijó fuera de tiempo y no de forma aleatoria (Capítulo 2.4).</w:t>
+        <w:t xml:space="preserve"> De 15.6% en 2018 a 21.0% en 2024 — la razón por la que el holdout se fijó fuera de tiempo y no de forma aleatoria (Capítulo 2.4).</w:t>
       </w:r>
     </w:p>
     <w:p>
@@ -11199,6 +9216,7 @@
         <w:rPr>
           <w:noProof/>
         </w:rPr>
+        <w:lastRenderedPageBreak/>
         <w:drawing>
           <wp:inline distT="0" distB="0" distL="0" distR="0" wp14:anchorId="5A4DD3EF" wp14:editId="76C855C8">
             <wp:extent cx="6120130" cy="3060065"/>
@@ -11263,7 +9281,6 @@
         <w:rPr>
           <w:noProof/>
         </w:rPr>
-        <w:lastRenderedPageBreak/>
         <w:drawing>
           <wp:inline distT="0" distB="0" distL="0" distR="0" wp14:anchorId="7E8FD150" wp14:editId="6E5DED69">
             <wp:extent cx="6120130" cy="3402792"/>
@@ -11328,6 +9345,7 @@
         <w:rPr>
           <w:noProof/>
         </w:rPr>
+        <w:lastRenderedPageBreak/>
         <w:drawing>
           <wp:inline distT="0" distB="0" distL="0" distR="0" wp14:anchorId="2469BF05" wp14:editId="07D1EF9F">
             <wp:extent cx="6120130" cy="4082126"/>
@@ -11392,7 +9410,6 @@
         <w:rPr>
           <w:noProof/>
         </w:rPr>
-        <w:lastRenderedPageBreak/>
         <w:drawing>
           <wp:inline distT="0" distB="0" distL="0" distR="0" wp14:anchorId="1BE26135" wp14:editId="56B7FBCE">
             <wp:extent cx="6120130" cy="3402792"/>
@@ -11457,6 +9474,7 @@
         <w:rPr>
           <w:noProof/>
         </w:rPr>
+        <w:lastRenderedPageBreak/>
         <w:drawing>
           <wp:inline distT="0" distB="0" distL="0" distR="0" wp14:anchorId="6B43E799" wp14:editId="2718C9A7">
             <wp:extent cx="6120130" cy="3439513"/>
@@ -11521,7 +9539,6 @@
         <w:rPr>
           <w:noProof/>
         </w:rPr>
-        <w:lastRenderedPageBreak/>
         <w:drawing>
           <wp:inline distT="0" distB="0" distL="0" distR="0" wp14:anchorId="7CFCC2E3" wp14:editId="07CD79A7">
             <wp:extent cx="6120130" cy="3060065"/>
@@ -11609,21 +9626,7 @@
         <w:rPr>
           <w:lang w:val="es-GT"/>
         </w:rPr>
-        <w:t xml:space="preserve"> Claude, de </w:t>
-      </w:r>
-      <w:proofErr w:type="spellStart"/>
-      <w:r>
-        <w:rPr>
-          <w:lang w:val="es-GT"/>
-        </w:rPr>
-        <w:t>Anthropic</w:t>
-      </w:r>
-      <w:proofErr w:type="spellEnd"/>
-      <w:r>
-        <w:rPr>
-          <w:lang w:val="es-GT"/>
-        </w:rPr>
-        <w:t>, empleado entre el 29 de agosto y el 11 de septiembre de 2026 a través de su aplicación de escritorio. Los modelos configurados durante el trabajo fueron Claude Sonnet 5 y, en la fase final, Claude Opus 5.</w:t>
+        <w:t xml:space="preserve"> Claude, de Anthropic, empleado entre el 29 de agosto y el 11 de septiembre de 2026 a través de su aplicación de escritorio. Los modelos configurados durante el trabajo fueron Claude Sonnet 5 y, en la fase final, Claude Opus 5.</w:t>
       </w:r>
     </w:p>
     <w:p>
@@ -11687,41 +9690,14 @@
           <w:b/>
           <w:lang w:val="es-GT"/>
         </w:rPr>
+        <w:lastRenderedPageBreak/>
         <w:t>Desarrollo de código:</w:t>
       </w:r>
       <w:r>
         <w:rPr>
           <w:lang w:val="es-GT"/>
         </w:rPr>
-        <w:t xml:space="preserve"> apoyo en la consolidación del notebook, depuración de errores, construcción del módulo de </w:t>
-      </w:r>
-      <w:proofErr w:type="spellStart"/>
-      <w:r>
-        <w:rPr>
-          <w:lang w:val="es-GT"/>
-        </w:rPr>
-        <w:t>scoring</w:t>
-      </w:r>
-      <w:proofErr w:type="spellEnd"/>
-      <w:r>
-        <w:rPr>
-          <w:lang w:val="es-GT"/>
-        </w:rPr>
-        <w:t xml:space="preserve"> compartido, los scripts de automatización y las dos aplicaciones de </w:t>
-      </w:r>
-      <w:proofErr w:type="spellStart"/>
-      <w:r>
-        <w:rPr>
-          <w:lang w:val="es-GT"/>
-        </w:rPr>
-        <w:t>Streamlit</w:t>
-      </w:r>
-      <w:proofErr w:type="spellEnd"/>
-      <w:r>
-        <w:rPr>
-          <w:lang w:val="es-GT"/>
-        </w:rPr>
-        <w:t>, y la organización final del repositorio.</w:t>
+        <w:t xml:space="preserve"> apoyo en la consolidación del notebook, depuración de errores, construcción del módulo de scoring compartido, los scripts de automatización y las dos aplicaciones de Streamlit, y la organización final del repositorio.</w:t>
       </w:r>
     </w:p>
     <w:p>
@@ -11771,21 +9747,7 @@
         <w:rPr>
           <w:lang w:val="es-GT"/>
         </w:rPr>
-        <w:t xml:space="preserve"> exploración de alternativas —algoritmos, estrategias de búsqueda de </w:t>
-      </w:r>
-      <w:proofErr w:type="spellStart"/>
-      <w:r>
-        <w:rPr>
-          <w:lang w:val="es-GT"/>
-        </w:rPr>
-        <w:t>hiperparámetros</w:t>
-      </w:r>
-      <w:proofErr w:type="spellEnd"/>
-      <w:r>
-        <w:rPr>
-          <w:lang w:val="es-GT"/>
-        </w:rPr>
-        <w:t>, diseño de la propuesta de recolección— cuya adopción o descarte decidió el autor.</w:t>
+        <w:t xml:space="preserve"> exploración de alternativas —algoritmos, estrategias de búsqueda de hiperparámetros, diseño de la propuesta de recolección— cuya adopción o descarte decidió el autor.</w:t>
       </w:r>
     </w:p>
     <w:p>
@@ -11805,89 +9767,21 @@
         <w:rPr>
           <w:lang w:val="es-GT"/>
         </w:rPr>
-        <w:t xml:space="preserve"> La elección del tema y de la fuente de datos, la definición de los objetivos, las decisiones metodológicas —incluida la de mantener </w:t>
-      </w:r>
-      <w:proofErr w:type="spellStart"/>
-      <w:r>
-        <w:rPr>
-          <w:lang w:val="es-GT"/>
-        </w:rPr>
-        <w:t>LightGBM</w:t>
-      </w:r>
-      <w:proofErr w:type="spellEnd"/>
-      <w:r>
-        <w:rPr>
-          <w:lang w:val="es-GT"/>
-        </w:rPr>
-        <w:t xml:space="preserve"> como modelo final pese a que </w:t>
-      </w:r>
-      <w:proofErr w:type="spellStart"/>
-      <w:r>
-        <w:rPr>
-          <w:lang w:val="es-GT"/>
-        </w:rPr>
-        <w:t>HistGradientBoosting</w:t>
-      </w:r>
-      <w:proofErr w:type="spellEnd"/>
-      <w:r>
-        <w:rPr>
-          <w:lang w:val="es-GT"/>
-        </w:rPr>
-        <w:t xml:space="preserve"> obtiene un valor ligeramente superior en el </w:t>
-      </w:r>
-      <w:proofErr w:type="spellStart"/>
-      <w:r>
-        <w:rPr>
-          <w:lang w:val="es-GT"/>
-        </w:rPr>
-        <w:t>holdout</w:t>
-      </w:r>
-      <w:proofErr w:type="spellEnd"/>
-      <w:r>
-        <w:rPr>
-          <w:lang w:val="es-GT"/>
-        </w:rPr>
-        <w:t>—, la ejecución de todos los experimentos y la interpretación de los resultados corresponden al autor. Ninguna cifra de esta memoria procede de la herramienta: todas se leyeron de las salidas del notebook ejecutado en el equipo del autor.</w:t>
-      </w:r>
-    </w:p>
-    <w:p>
-      <w:pPr>
-        <w:rPr>
-          <w:lang w:val="es-GT"/>
-        </w:rPr>
-      </w:pPr>
-      <w:r>
-        <w:rPr>
-          <w:b/>
-          <w:lang w:val="es-GT"/>
-        </w:rPr>
-        <w:t xml:space="preserve">Reflexión crítica sobre su aporte y sus limitaciones. El uso resultó productivo en dos frentes: aceleró la redacción, y ayudó a resolver problemas de compatibilidad en librerías.</w:t>
-      </w:r>
-      <w:r>
-        <w:rPr>
-          <w:lang w:val="es-GT"/>
-        </w:rPr>
-        <w:t xml:space="preserve"/>
-      </w:r>
-      <w:r>
-        <w:rPr>
-          <w:lang w:val="es-GT"/>
-        </w:rPr>
-        <w:t xml:space="preserve"/>
-      </w:r>
-      <w:proofErr w:type="spellStart"/>
-      <w:r>
-        <w:rPr>
-          <w:lang w:val="es-GT"/>
-        </w:rPr>
-        <w:t/>
-      </w:r>
-      <w:proofErr w:type="spellEnd"/>
-      <w:r>
-        <w:rPr>
-          <w:lang w:val="es-GT"/>
-        </w:rPr>
-        <w:t/>
+        <w:t xml:space="preserve"> La elección del tema y de la fuente de datos, la definición de los objetivos, las decisiones metodológicas —incluida la de mantener LightGBM como modelo final pese a que HistGradientBoosting obtiene un valor ligeramente superior en el holdout—, la ejecución de todos los experimentos y la interpretación de los resultados corresponden al autor. Ninguna cifra de esta memoria procede de la herramienta: todas se leyeron de las salidas del notebook ejecutado en el equipo del autor.</w:t>
+      </w:r>
+    </w:p>
+    <w:p>
+      <w:pPr>
+        <w:rPr>
+          <w:lang w:val="es-GT"/>
+        </w:rPr>
+      </w:pPr>
+      <w:r>
+        <w:rPr>
+          <w:b/>
+          <w:lang w:val="es-GT"/>
+        </w:rPr>
+        <w:t>Reflexión crítica sobre su aporte y sus limitaciones. El uso resultó productivo en dos frentes: aceleró la redacción, y ayudó a resolver problemas de compatibilidad en librerías.</w:t>
       </w:r>
     </w:p>
     <w:p>
@@ -11902,7 +9796,6 @@
         </w:rPr>
         <w:t xml:space="preserve">Sus limitaciones se manifestaron con igual claridad. La herramienta introdujo errores propios que hubo que corregir, como una cifra de </w:t>
       </w:r>
-      <w:proofErr w:type="spellStart"/>
       <w:r>
         <w:rPr>
           <w:i/>
@@ -11910,19 +9803,11 @@
         </w:rPr>
         <w:t>recall</w:t>
       </w:r>
-      <w:proofErr w:type="spellEnd"/>
-      <w:r>
-        <w:rPr>
-          <w:lang w:val="es-GT"/>
-        </w:rPr>
-        <w:t xml:space="preserve"> mal trasladada a una tabla comparativa, una </w:t>
-      </w:r>
-      <w:r>
-        <w:rPr>
-          <w:lang w:val="es-GT"/>
-        </w:rPr>
-        <w:lastRenderedPageBreak/>
-        <w:t>comparación mal etiquetada en el notebook y una edición que sobrescribió un párrafo distinto del previsto en este mismo anexo. Su conocimiento tiene fecha de corte, de modo que las afirmaciones sobre hechos posteriores exigieron verificación externa. Y en varias ocasiones propuso incorporaciones que el autor descartó por criterio propio</w:t>
+      <w:r>
+        <w:rPr>
+          <w:lang w:val="es-GT"/>
+        </w:rPr>
+        <w:t xml:space="preserve"> mal trasladada a una tabla comparativa, una comparación mal etiquetada en el notebook y una edición que sobrescribió un párrafo distinto del previsto en este mismo anexo. Su conocimiento tiene fecha de corte, de modo que las afirmaciones sobre hechos posteriores exigieron verificación externa. Y en varias ocasiones propuso incorporaciones que el autor descartó por criterio propio</w:t>
       </w:r>
       <w:r>
         <w:rPr>

</xml_diff>

<commit_message>
chore: actualizar documentacion y comprimir video
</commit_message>
<xml_diff>
--- a/docs/Carlos_Calderon_Illescas_Modelado_Predictivo_Siniestros_Viales_Guatemala.docx
+++ b/docs/Carlos_Calderon_Illescas_Modelado_Predictivo_Siniestros_Viales_Guatemala.docx
@@ -42,7 +42,23 @@
               <w:rStyle w:val="ClarkdownMuted"/>
               <w:lang w:val="es-GT"/>
             </w:rPr>
-            <w:t>Trabajo Fin de Máster — Máster en Big Data, Data Science e Inteligencia Artificial</w:t>
+            <w:t xml:space="preserve">Trabajo Fin de Máster — Máster en Big Data, Data </w:t>
+          </w:r>
+          <w:proofErr w:type="spellStart"/>
+          <w:r>
+            <w:rPr>
+              <w:rStyle w:val="ClarkdownMuted"/>
+              <w:lang w:val="es-GT"/>
+            </w:rPr>
+            <w:t>Science</w:t>
+          </w:r>
+          <w:proofErr w:type="spellEnd"/>
+          <w:r>
+            <w:rPr>
+              <w:rStyle w:val="ClarkdownMuted"/>
+              <w:lang w:val="es-GT"/>
+            </w:rPr>
+            <w:t xml:space="preserve"> e Inteligencia Artificial</w:t>
           </w:r>
           <w:r>
             <w:rPr>
@@ -95,11 +111,21 @@
       </w:pPr>
       <w:bookmarkStart w:id="1" w:name="ndice_de_contenidos"/>
       <w:bookmarkStart w:id="2" w:name="_Toc240103720"/>
-      <w:r>
-        <w:t>Índice de Contenidos</w:t>
+      <w:proofErr w:type="spellStart"/>
+      <w:r>
+        <w:t>Índice</w:t>
+      </w:r>
+      <w:proofErr w:type="spellEnd"/>
+      <w:r>
+        <w:t xml:space="preserve"> de </w:t>
+      </w:r>
+      <w:proofErr w:type="spellStart"/>
+      <w:r>
+        <w:t>Contenidos</w:t>
       </w:r>
       <w:bookmarkEnd w:id="1"/>
       <w:bookmarkEnd w:id="2"/>
+      <w:proofErr w:type="spellEnd"/>
     </w:p>
     <w:p>
       <w:pPr>
@@ -2742,13 +2768,43 @@
         <w:rPr>
           <w:lang w:val="es-GT"/>
         </w:rPr>
-        <w:t>El resultado, u</w:t>
-      </w:r>
-      <w:r>
-        <w:rPr>
-          <w:lang w:val="es-GT"/>
-        </w:rPr>
-        <w:t>n clasificador LightGBM entrenado sobre 2018–2023 y evaluado una sola vez sobre 2024, un año completo que no intervino en ninguna decisión de modelado. Sobre ese holdout: ROC-AUC 0.740, recall 67.8% sobre la clase fatal, precisión 35.7% y PR-AUC 0.469 frente a una tasa base de 19.1%. En términos operativos, el modelo identifica correctamente a dos de cada tres víctimas mortales sin necesidad de recolectar ninguna variable nueva.</w:t>
+        <w:t xml:space="preserve">El </w:t>
+      </w:r>
+      <w:proofErr w:type="spellStart"/>
+      <w:proofErr w:type="gramStart"/>
+      <w:r>
+        <w:rPr>
+          <w:lang w:val="es-GT"/>
+        </w:rPr>
+        <w:t>resultado,u</w:t>
+      </w:r>
+      <w:r>
+        <w:rPr>
+          <w:lang w:val="es-GT"/>
+        </w:rPr>
+        <w:t>n</w:t>
+      </w:r>
+      <w:proofErr w:type="spellEnd"/>
+      <w:proofErr w:type="gramEnd"/>
+      <w:r>
+        <w:rPr>
+          <w:lang w:val="es-GT"/>
+        </w:rPr>
+        <w:t xml:space="preserve"> clasificador </w:t>
+      </w:r>
+      <w:proofErr w:type="spellStart"/>
+      <w:r>
+        <w:rPr>
+          <w:lang w:val="es-GT"/>
+        </w:rPr>
+        <w:t>LightGBM</w:t>
+      </w:r>
+      <w:proofErr w:type="spellEnd"/>
+      <w:r>
+        <w:rPr>
+          <w:lang w:val="es-GT"/>
+        </w:rPr>
+        <w:t xml:space="preserve"> entrenado sobre 2018–2023 y evaluado una sola vez sobre 2024, un año completo que no intervino en ninguna decisión de modelado. Sobre ese holdout: ROC-AUC 0.740, recall 67.8% sobre la clase fatal, precisión 35.7% y PR-AUC 0.469 frente a una tasa base de 19.1%. En términos operativos, el modelo identifica correctamente a dos de cada tres víctimas mortales sin necesidad de recolectar ninguna variable nueva.</w:t>
       </w:r>
     </w:p>
     <w:p>
@@ -2778,17 +2834,10 @@
       </w:pPr>
       <w:r>
         <w:rPr>
-          <w:b/>
-          <w:lang w:val="es-GT"/>
-        </w:rPr>
-        <w:t>La prioridad no está donde está el volumen.</w:t>
-      </w:r>
-      <w:r>
-        <w:rPr>
           <w:bCs/>
           <w:lang w:val="es-GT"/>
         </w:rPr>
-        <w:t xml:space="preserve"> El departamento de Guatemala concentra el mayor número de siniestros del país y registra la tasa de fatalidad más baja (12.9%); Petén (34.6%), Izabal (34.2%) y Zacapa (27.4%) casi la triplican. Asignar recursos por tasa en lugar de por volumen reordena por completo el mapa de la prevención.</w:t>
+        <w:t>La prioridad no está donde está el volumen. El departamento de Guatemala concentra el mayor número de siniestros del país y registra la tasa de fatalidad más baja (12.9%); Petén (34.6%), Izabal (34.2%) y Zacapa (27.4%) casi la triplican. Asignar recursos por tasa en lugar de por volumen reordena por completo el mapa de la prevención.</w:t>
       </w:r>
     </w:p>
     <w:p>
@@ -2805,17 +2854,10 @@
       </w:pPr>
       <w:r>
         <w:rPr>
-          <w:b/>
-          <w:lang w:val="es-GT"/>
-        </w:rPr>
-        <w:t>El evento más frecuente es el menos letal</w:t>
-      </w:r>
-      <w:r>
-        <w:rPr>
           <w:bCs/>
           <w:lang w:val="es-GT"/>
         </w:rPr>
-        <w:t>. La colisión —38,403 casos— termina en fallecimiento en el 14.0% de los casos, frente al 26.5% del atropello y el 30.1% del derrape: en una colisión el otro vehículo absorbe parte del impacto, mientras que el peatón queda desprotegido.</w:t>
+        <w:t>El evento más frecuente es el menos letal. La colisión —38,403 casos— termina en fallecimiento en el 14.0% de los casos, frente al 26.5% del atropello y el 30.1% del derrape: en una colisión el otro vehículo absorbe parte del impacto, mientras que el peatón queda desprotegido.</w:t>
       </w:r>
     </w:p>
     <w:p>
@@ -2832,17 +2874,10 @@
       </w:pPr>
       <w:r>
         <w:rPr>
-          <w:b/>
-          <w:lang w:val="es-GT"/>
-        </w:rPr>
-        <w:t>La motocicleta no es el vehículo más letal,</w:t>
-      </w:r>
-      <w:r>
-        <w:rPr>
           <w:bCs/>
           <w:lang w:val="es-GT"/>
         </w:rPr>
-        <w:t xml:space="preserve"> pero sí el que más muertes acumula. Su tasa por siniestro (~18%) está por debajo de la del camión (~28%) y el automóvil (~20%), y aun así concentra el 51.1% de todos los fallecidos. Es exposición, no letalidad unitaria; confundir ambas cifras lleva a políticas equivocadas.</w:t>
+        <w:t>La motocicleta no es el vehículo más letal, pero sí el que más muertes acumula. Su tasa por siniestro (~18%) está por debajo de la del camión (~28%) y el automóvil (~20%), y aun así concentra el 51.1% de todos los fallecidos. Es exposición, no letalidad unitaria; confundir ambas cifras lleva a políticas equivocadas.</w:t>
       </w:r>
     </w:p>
     <w:p>
@@ -2868,7 +2903,37 @@
         <w:rPr>
           <w:lang w:val="es-GT"/>
         </w:rPr>
-        <w:t>Qué se entrega además del modelo. Un simulador de riesgo y un prototipo de captura en campo con triage, ambos desplegados y accesibles; scripts que descargan los datos del portal del INE y reentrenan con una compuerta de aprobación humana; y una propuesta concreta de qué debería empezar a registrarse —y qué deliberadamente no— para levantar ese techo (Capítulo 7.4).</w:t>
+        <w:t>Además del modelo, se entrega</w:t>
+      </w:r>
+      <w:r>
+        <w:rPr>
+          <w:lang w:val="es-GT"/>
+        </w:rPr>
+        <w:t xml:space="preserve"> </w:t>
+      </w:r>
+      <w:r>
+        <w:rPr>
+          <w:lang w:val="es-GT"/>
+        </w:rPr>
+        <w:t>u</w:t>
+      </w:r>
+      <w:r>
+        <w:rPr>
+          <w:lang w:val="es-GT"/>
+        </w:rPr>
+        <w:t>n simulador de riesgo y un prototipo de captura en campo</w:t>
+      </w:r>
+      <w:r>
+        <w:rPr>
+          <w:lang w:val="es-GT"/>
+        </w:rPr>
+        <w:t xml:space="preserve"> para robustecer la base</w:t>
+      </w:r>
+      <w:r>
+        <w:rPr>
+          <w:lang w:val="es-GT"/>
+        </w:rPr>
+        <w:t>, ambos desplegados y accesibles; scripts que descargan los datos del portal del INE y reentrenan con una compuerta de aprobación humana; y una propuesta concreta de qué debería empezar a registrarse —y qué deliberadamente no— para levantar ese techo (Capítulo 7.4).</w:t>
       </w:r>
     </w:p>
     <w:p>
@@ -2930,14 +2995,14 @@
         <w:rPr>
           <w:lang w:val="es-GT"/>
         </w:rPr>
-        <w:t xml:space="preserve">La siniestralidad vial es una de las principales problemáticas de salud pública, seguridad ciudadana y exposición económica en Guatemala. El parque vehicular ha crecido con un desplazamiento marcado hacia los vehículos de dos ruedas: según la SAT, en mayo de 2024 había 5,497,829 vehículos activos, de los cuales 2,615,117 —el 47.6%— eran motocicletas, que </w:t>
+        <w:t xml:space="preserve">La siniestralidad vial es una de las principales problemáticas de salud pública, seguridad ciudadana y exposición económica en Guatemala. El parque vehicular ha crecido con un desplazamiento marcado hacia los vehículos de dos ruedas: según la SAT, en mayo de 2024 </w:t>
       </w:r>
       <w:r>
         <w:rPr>
           <w:lang w:val="es-GT"/>
         </w:rPr>
         <w:lastRenderedPageBreak/>
-        <w:t>ya superan en número a los de cuatro ruedas (SAT, 2024). Ese perfil de movilidad, combinado con limitaciones de infraestructura y conductas de riesgo, sitúa a los accidentes de tránsito entre las causas más frecuentes de lesiones graves y mortales del país.</w:t>
+        <w:t>había 5,497,829 vehículos activos, de los cuales 2,615,117 —el 47.6%— eran motocicletas, que ya superan en número a los de cuatro ruedas (SAT, 2024). Ese perfil de movilidad, combinado con limitaciones de infraestructura y conductas de riesgo, sitúa a los accidentes de tránsito entre las causas más frecuentes de lesiones graves y mortales del país.</w:t>
       </w:r>
     </w:p>
     <w:p>
@@ -3154,11 +3219,33 @@
       </w:r>
     </w:p>
     <w:p>
-      <w:r>
-        <w:rPr>
-          <w:b/>
-        </w:rPr>
-        <w:t>Objetivos Específicos:</w:t>
+      <w:proofErr w:type="spellStart"/>
+      <w:r>
+        <w:rPr>
+          <w:b/>
+        </w:rPr>
+        <w:t>Objetivos</w:t>
+      </w:r>
+      <w:proofErr w:type="spellEnd"/>
+      <w:r>
+        <w:rPr>
+          <w:b/>
+        </w:rPr>
+        <w:t xml:space="preserve"> </w:t>
+      </w:r>
+      <w:proofErr w:type="spellStart"/>
+      <w:r>
+        <w:rPr>
+          <w:b/>
+        </w:rPr>
+        <w:t>Específicos</w:t>
+      </w:r>
+      <w:proofErr w:type="spellEnd"/>
+      <w:r>
+        <w:rPr>
+          <w:b/>
+        </w:rPr>
+        <w:t>:</w:t>
       </w:r>
     </w:p>
     <w:p>
@@ -3249,7 +3336,21 @@
         <w:rPr>
           <w:lang w:val="es-GT"/>
         </w:rPr>
-        <w:t>Explorar el diseño de una herramienta interactiva de simulación de riesgo como línea de trabajo de productivización.</w:t>
+        <w:t xml:space="preserve">Explorar el diseño de una herramienta interactiva de simulación de riesgo como línea de trabajo de </w:t>
+      </w:r>
+      <w:proofErr w:type="spellStart"/>
+      <w:r>
+        <w:rPr>
+          <w:lang w:val="es-GT"/>
+        </w:rPr>
+        <w:t>productivización</w:t>
+      </w:r>
+      <w:proofErr w:type="spellEnd"/>
+      <w:r>
+        <w:rPr>
+          <w:lang w:val="es-GT"/>
+        </w:rPr>
+        <w:t>.</w:t>
       </w:r>
     </w:p>
     <w:p>
@@ -3349,7 +3450,14 @@
           <w:b/>
           <w:lang w:val="es-GT"/>
         </w:rPr>
-        <w:t>Enfoque de aplicación: los hallazgos se orientan a dos audiencias — gobernanza y prevención vial (perfiles y contextos de alta severidad para campañas institucionales) y, como línea exploratoria, el sector asegurador, sujeto a validación con datos propios de cada aseguradora.</w:t>
+        <w:t xml:space="preserve">Enfoque de aplicación: </w:t>
+      </w:r>
+      <w:r>
+        <w:rPr>
+          <w:bCs/>
+          <w:lang w:val="es-GT"/>
+        </w:rPr>
+        <w:t>los hallazgos se orientan a dos audiencias — gobernanza y prevención vial (perfiles y contextos de alta severidad para campañas institucionales) y, como línea exploratoria, el sector asegurador, sujeto a validación con datos propios de cada aseguradora.</w:t>
       </w:r>
     </w:p>
     <w:p>
@@ -3445,8 +3553,17 @@
           <w:b/>
           <w:lang w:val="es-GT"/>
         </w:rPr>
-        <w:t>Creative Commons Attribution</w:t>
-      </w:r>
+        <w:t xml:space="preserve">Creative Commons </w:t>
+      </w:r>
+      <w:proofErr w:type="spellStart"/>
+      <w:r>
+        <w:rPr>
+          <w:b/>
+          <w:lang w:val="es-GT"/>
+        </w:rPr>
+        <w:t>Attribution</w:t>
+      </w:r>
+      <w:proofErr w:type="spellEnd"/>
       <w:r>
         <w:rPr>
           <w:lang w:val="es-GT"/>
@@ -3458,8 +3575,17 @@
           <w:i/>
           <w:lang w:val="es-GT"/>
         </w:rPr>
-        <w:t>Open Definition</w:t>
-      </w:r>
+        <w:t xml:space="preserve">Open </w:t>
+      </w:r>
+      <w:proofErr w:type="spellStart"/>
+      <w:r>
+        <w:rPr>
+          <w:i/>
+          <w:lang w:val="es-GT"/>
+        </w:rPr>
+        <w:t>Definition</w:t>
+      </w:r>
+      <w:proofErr w:type="spellEnd"/>
       <w:r>
         <w:rPr>
           <w:lang w:val="es-GT"/>
@@ -3477,7 +3603,21 @@
         <w:rPr>
           <w:lang w:val="es-GT"/>
         </w:rPr>
-        <w:t>Cada archivo trae variables agrupadas en tres dimensiones: información espacio-temporal (año, mes, día, día de la semana, hora, departamento, municipio), características del siniestro y el vehículo (tipo de evento, tipo de vehículo, marca, color), y datos del involucrado (edad, sexo). La correspondencia entre los códigos numéricos de cada variable y su significado se tomó del diccionario oficial de variables que acompaña la publicación del INE, evitando así etiquetas manuales propensas a error.</w:t>
+        <w:t xml:space="preserve">Cada archivo trae variables agrupadas en tres dimensiones: información espacio-temporal (año, mes, día, día de la semana, hora, departamento, municipio), características del siniestro y el vehículo (tipo de evento, tipo de vehículo, marca, color), y datos del involucrado (edad, sexo). La correspondencia entre los códigos numéricos de cada variable y su significado se tomó del diccionario oficial de variables que acompaña la publicación del INE, evitando así etiquetas </w:t>
+      </w:r>
+      <w:proofErr w:type="gramStart"/>
+      <w:r>
+        <w:rPr>
+          <w:lang w:val="es-GT"/>
+        </w:rPr>
+        <w:t>manuales propensas</w:t>
+      </w:r>
+      <w:proofErr w:type="gramEnd"/>
+      <w:r>
+        <w:rPr>
+          <w:lang w:val="es-GT"/>
+        </w:rPr>
+        <w:t xml:space="preserve"> a error.</w:t>
       </w:r>
     </w:p>
     <w:p>
@@ -3565,13 +3705,43 @@
           <w:b/>
           <w:lang w:val="es-GT"/>
         </w:rPr>
-        <w:t>Consolidación del dataset maestro:</w:t>
-      </w:r>
-      <w:r>
-        <w:rPr>
-          <w:lang w:val="es-GT"/>
-        </w:rPr>
-        <w:t xml:space="preserve"> concatenación de los siete archivos individuales en un único DataFrame, conservando el año de cada registro para permitir después la partición temporal.</w:t>
+        <w:t xml:space="preserve">Consolidación del </w:t>
+      </w:r>
+      <w:proofErr w:type="spellStart"/>
+      <w:r>
+        <w:rPr>
+          <w:b/>
+          <w:lang w:val="es-GT"/>
+        </w:rPr>
+        <w:t>dataset</w:t>
+      </w:r>
+      <w:proofErr w:type="spellEnd"/>
+      <w:r>
+        <w:rPr>
+          <w:b/>
+          <w:lang w:val="es-GT"/>
+        </w:rPr>
+        <w:t xml:space="preserve"> maestro:</w:t>
+      </w:r>
+      <w:r>
+        <w:rPr>
+          <w:lang w:val="es-GT"/>
+        </w:rPr>
+        <w:t xml:space="preserve"> concatenación de los siete archivos individuales en un único </w:t>
+      </w:r>
+      <w:proofErr w:type="spellStart"/>
+      <w:r>
+        <w:rPr>
+          <w:lang w:val="es-GT"/>
+        </w:rPr>
+        <w:t>DataFrame</w:t>
+      </w:r>
+      <w:proofErr w:type="spellEnd"/>
+      <w:r>
+        <w:rPr>
+          <w:lang w:val="es-GT"/>
+        </w:rPr>
+        <w:t>, conservando el año de cada registro para permitir después la partición temporal.</w:t>
       </w:r>
     </w:p>
     <w:p>
@@ -3590,7 +3760,14 @@
           <w:b/>
           <w:lang w:val="es-GT"/>
         </w:rPr>
-        <w:t>Traducción de códigos: los códigos de departamento, municipio, tipo de vehículo, tipo de evento y sexo se traducen a etiquetas legibles con el diccionario oficial del INE, cargado en tiempo de ejecución.</w:t>
+        <w:t xml:space="preserve">Traducción de códigos: </w:t>
+      </w:r>
+      <w:r>
+        <w:rPr>
+          <w:bCs/>
+          <w:lang w:val="es-GT"/>
+        </w:rPr>
+        <w:t>los códigos de departamento, municipio, tipo de vehículo, tipo de evento y sexo se traducen a etiquetas legibles con el diccionario oficial del INE, cargado en tiempo de ejecución.</w:t>
       </w:r>
     </w:p>
     <w:p>
@@ -3621,7 +3798,7 @@
         <w:rPr>
           <w:lang w:val="es-GT"/>
         </w:rPr>
-        <w:t>Antes de cualquier análisis se ejecutó una auditoría de calidad de datos, comparando los valores presentes contra los rangos válidos y los códigos de "Ignorado" (99, 9, 999, según la variable) documentados en el diccionario del INE:</w:t>
+        <w:t>Antes de cualquier análisis se ejecutó una auditoría sistemática de calidad de datos, comparando los valores presentes contra los rangos válidos y los códigos de "Ignorado" (99, 9, 999, según la variable) documentados en el diccionario del INE:</w:t>
       </w:r>
     </w:p>
     <w:tbl>
@@ -3675,8 +3852,30 @@
               <w:rPr>
                 <w:b/>
               </w:rPr>
-              <w:t>Presentes pero inválidos</w:t>
-            </w:r>
+              <w:t xml:space="preserve">Presentes </w:t>
+            </w:r>
+            <w:proofErr w:type="spellStart"/>
+            <w:r>
+              <w:rPr>
+                <w:b/>
+              </w:rPr>
+              <w:t>pero</w:t>
+            </w:r>
+            <w:proofErr w:type="spellEnd"/>
+            <w:r>
+              <w:rPr>
+                <w:b/>
+              </w:rPr>
+              <w:t xml:space="preserve"> </w:t>
+            </w:r>
+            <w:proofErr w:type="spellStart"/>
+            <w:r>
+              <w:rPr>
+                <w:b/>
+              </w:rPr>
+              <w:t>inválidos</w:t>
+            </w:r>
+            <w:proofErr w:type="spellEnd"/>
           </w:p>
         </w:tc>
       </w:tr>
@@ -3718,9 +3917,11 @@
             <w:tcW w:w="0" w:type="auto"/>
           </w:tcPr>
           <w:p>
+            <w:proofErr w:type="spellStart"/>
             <w:r>
               <w:t>edad</w:t>
             </w:r>
+            <w:proofErr w:type="spellEnd"/>
           </w:p>
         </w:tc>
         <w:tc>
@@ -3750,9 +3951,11 @@
             <w:tcW w:w="0" w:type="auto"/>
           </w:tcPr>
           <w:p>
+            <w:proofErr w:type="spellStart"/>
             <w:r>
               <w:t>mes</w:t>
             </w:r>
+            <w:proofErr w:type="spellEnd"/>
           </w:p>
         </w:tc>
         <w:tc>
@@ -3782,9 +3985,11 @@
             <w:tcW w:w="0" w:type="auto"/>
           </w:tcPr>
           <w:p>
+            <w:proofErr w:type="spellStart"/>
             <w:r>
               <w:t>dia</w:t>
             </w:r>
+            <w:proofErr w:type="spellEnd"/>
           </w:p>
         </w:tc>
         <w:tc>
@@ -3814,10 +4019,12 @@
             <w:tcW w:w="0" w:type="auto"/>
           </w:tcPr>
           <w:p>
+            <w:proofErr w:type="spellStart"/>
             <w:r>
               <w:lastRenderedPageBreak/>
               <w:t>dia_semana</w:t>
             </w:r>
+            <w:proofErr w:type="spellEnd"/>
           </w:p>
         </w:tc>
         <w:tc>
@@ -3881,7 +4088,35 @@
         <w:rPr>
           <w:lang w:val="es-GT"/>
         </w:rPr>
-        <w:t>2.4. Estrategia de particionamiento temporal (Out-of-Time Split)</w:t>
+        <w:t>2.4. Estrategia de particionamiento temporal (</w:t>
+      </w:r>
+      <w:proofErr w:type="spellStart"/>
+      <w:r>
+        <w:rPr>
+          <w:lang w:val="es-GT"/>
+        </w:rPr>
+        <w:t>Out</w:t>
+      </w:r>
+      <w:proofErr w:type="spellEnd"/>
+      <w:r>
+        <w:rPr>
+          <w:lang w:val="es-GT"/>
+        </w:rPr>
+        <w:t>-</w:t>
+      </w:r>
+      <w:proofErr w:type="spellStart"/>
+      <w:r>
+        <w:rPr>
+          <w:lang w:val="es-GT"/>
+        </w:rPr>
+        <w:t>of</w:t>
+      </w:r>
+      <w:proofErr w:type="spellEnd"/>
+      <w:r>
+        <w:rPr>
+          <w:lang w:val="es-GT"/>
+        </w:rPr>
+        <w:t>-Time Split)</w:t>
       </w:r>
       <w:bookmarkEnd w:id="21"/>
       <w:bookmarkEnd w:id="22"/>
@@ -3934,7 +4169,15 @@
         <w:t xml:space="preserve"> 60,669 registros, usados para el análisis exploratorio, la ingeniería de características, la selección de variables y la validación cruzada estratificada. </w:t>
       </w:r>
       <w:r>
-        <w:t>Tasa de fatalidad: 18.75%.</w:t>
+        <w:t xml:space="preserve">Tasa de </w:t>
+      </w:r>
+      <w:proofErr w:type="spellStart"/>
+      <w:r>
+        <w:t>fatalidad</w:t>
+      </w:r>
+      <w:proofErr w:type="spellEnd"/>
+      <w:r>
+        <w:t>: 18.75%.</w:t>
       </w:r>
     </w:p>
     <w:p>
@@ -3972,7 +4215,21 @@
         <w:rPr>
           <w:lang w:val="es-GT"/>
         </w:rPr>
-        <w:t>La tendencia anual (Anexo B) —de 15.6% en 2018 a 21.0% en 2024— es la razón por la que 2024 se aísla como holdout en vez de mezclarse al azar: un modelo entrenado solo sobre 2018–2023 podría subestimar el riesgo si esa tendencia continúa, algo que solo la partición temporal permite detectar (Capítulo 7.1).</w:t>
+        <w:t xml:space="preserve">La tendencia anual (Anexo B) —de 15.6% en 2018 a 21.0% en 2024— es la razón por la que 2024 se aísla como </w:t>
+      </w:r>
+      <w:proofErr w:type="spellStart"/>
+      <w:r>
+        <w:rPr>
+          <w:lang w:val="es-GT"/>
+        </w:rPr>
+        <w:t>holdout</w:t>
+      </w:r>
+      <w:proofErr w:type="spellEnd"/>
+      <w:r>
+        <w:rPr>
+          <w:lang w:val="es-GT"/>
+        </w:rPr>
+        <w:t xml:space="preserve"> en vez de mezclarse al azar: un modelo entrenado solo sobre 2018–2023 podría subestimar el riesgo si esa tendencia continúa, algo que solo la partición temporal permite detectar (Capítulo 7.1).</w:t>
       </w:r>
     </w:p>
     <w:p>
@@ -4085,7 +4342,21 @@
         <w:rPr>
           <w:lang w:val="es-GT"/>
         </w:rPr>
-        <w:t xml:space="preserve"> a fallecidos (clase 1) sobre el total 2018–2024; restringido al periodo de entrenamiento y validación (2018–2023, 60,669 registros) el reparto es 81.3% / 18.7%. Esta asimetría condiciona directamente la selección de métricas en la fase de modelado (Capítulo 4), priorizando el recall y el F1 sobre la clase fatal por encima de la exactitud global (figura en el Anexo B).</w:t>
+        <w:t xml:space="preserve"> a fallecidos (clase 1) sobre el total 2018–2024; restringido al periodo de entrenamiento y validación (2018–2023, 60,669 registros) el reparto es 81.3% / 18.7%. Esta asimetría condiciona directamente la selección de métricas en la fase de modelado (Capítulo 4), priorizando el </w:t>
+      </w:r>
+      <w:proofErr w:type="spellStart"/>
+      <w:r>
+        <w:rPr>
+          <w:lang w:val="es-GT"/>
+        </w:rPr>
+        <w:t>recall</w:t>
+      </w:r>
+      <w:proofErr w:type="spellEnd"/>
+      <w:r>
+        <w:rPr>
+          <w:lang w:val="es-GT"/>
+        </w:rPr>
+        <w:t xml:space="preserve"> y el F1 sobre la clase fatal por encima de la exactitud global (figura en el Anexo B).</w:t>
       </w:r>
     </w:p>
     <w:p>
@@ -4343,7 +4614,30 @@
           <w:b/>
           <w:lang w:val="es-GT"/>
         </w:rPr>
-        <w:t>Geografía: el departamento de Guatemala concentra el mayor volumen absoluto de siniestros pero registra la tasa de fatalidad más baja del país (12.9%); Petén (34.6%), Izabal (34.2%) y Zacapa (27.4%) casi la triplican. El dato está medido; la explicación no: la hipótesis más plausible —corredores de carretera de alta velocidad y mayores tiempos de traslado a un centro asistencial— no puede contrastarse con estos microdatos, y es lo que las variables del Capítulo 7.4 permitirían verificar. A nivel municipal el patrón se acentúa: entre los municipios con al menos 100 siniestros, Livingston (Izabal) encabeza con cerca del 47%, seguido de Raxruhá y Sayaxché por encima del 40%.</w:t>
+        <w:t xml:space="preserve">Geografía: </w:t>
+      </w:r>
+      <w:r>
+        <w:rPr>
+          <w:bCs/>
+          <w:lang w:val="es-GT"/>
+        </w:rPr>
+        <w:t xml:space="preserve">el departamento de Guatemala concentra el mayor volumen absoluto de </w:t>
+      </w:r>
+      <w:proofErr w:type="gramStart"/>
+      <w:r>
+        <w:rPr>
+          <w:bCs/>
+          <w:lang w:val="es-GT"/>
+        </w:rPr>
+        <w:t>siniestros</w:t>
+      </w:r>
+      <w:proofErr w:type="gramEnd"/>
+      <w:r>
+        <w:rPr>
+          <w:bCs/>
+          <w:lang w:val="es-GT"/>
+        </w:rPr>
+        <w:t xml:space="preserve"> pero registra la tasa de fatalidad más baja del país (12.9%); Petén (34.6%), Izabal (34.2%) y Zacapa (27.4%) casi la triplican. El dato está medido; la explicación no: la hipótesis más plausible —corredores de carretera de alta velocidad y mayores tiempos de traslado a un centro asistencial— no puede contrastarse con estos microdatos, y es lo que las variables del Capítulo 7.4 permitirían verificar. A nivel municipal el patrón se acentúa: entre los municipios con al menos 100 siniestros, Livingston (Izabal) encabeza con cerca del 47%, seguido de Raxruhá y Sayaxché por encima del 40%.</w:t>
       </w:r>
     </w:p>
     <w:p>
@@ -4461,7 +4755,35 @@
         <w:rPr>
           <w:lang w:val="es-GT"/>
         </w:rPr>
-        <w:t>3.3. Ingeniería y selección de variables (Feature Engineering)</w:t>
+        <w:t>3.3. Ingeniería y selección de variables (</w:t>
+      </w:r>
+      <w:proofErr w:type="spellStart"/>
+      <w:r>
+        <w:rPr>
+          <w:lang w:val="es-GT"/>
+        </w:rPr>
+        <w:t>Feature</w:t>
+      </w:r>
+      <w:proofErr w:type="spellEnd"/>
+      <w:r>
+        <w:rPr>
+          <w:lang w:val="es-GT"/>
+        </w:rPr>
+        <w:t xml:space="preserve"> </w:t>
+      </w:r>
+      <w:proofErr w:type="spellStart"/>
+      <w:r>
+        <w:rPr>
+          <w:lang w:val="es-GT"/>
+        </w:rPr>
+        <w:t>Engineering</w:t>
+      </w:r>
+      <w:proofErr w:type="spellEnd"/>
+      <w:r>
+        <w:rPr>
+          <w:lang w:val="es-GT"/>
+        </w:rPr>
+        <w:t>)</w:t>
       </w:r>
       <w:bookmarkEnd w:id="29"/>
       <w:bookmarkEnd w:id="30"/>
@@ -4516,7 +4838,10 @@
         </w:rPr>
         <w:t xml:space="preserve"> (entre semana, fin de semana, desconocido) en vez de dos, porque el 31.2% de los registros no trae día de la semana y tratarlo como "no es fin de semana" introduciría un sesgo; y codificación cíclica seno/coseno de la hora y el mes, que preserva la continuidad entre las 23:00 y las 00:00 (y entre diciembre y enero) que una codificación lineal rompería.</w:t>
       </w:r>
-      <w:r xml:space="preserve">
+      <w:r>
+        <w:rPr>
+          <w:lang w:val="es-GT"/>
+        </w:rPr>
         <w:t xml:space="preserve"> Se añadió además un indicador de horario crítico, que marca la intersección de madrugada y fin de semana — la combinación con mayor tasa observada en el EDA.</w:t>
       </w:r>
     </w:p>
@@ -4567,7 +4892,21 @@
         <w:rPr>
           <w:lang w:val="es-GT"/>
         </w:rPr>
-        <w:t xml:space="preserve"> dos indicadores binarios calculados de año/mes/día sin ninguna fuente externa — feriado oficial, y temporada alta vial (Semana Santa, con el algoritmo de Meeus/Jones/Butcher para la fecha de Pascua, y fin de año). Se probaron porque la literatura de seguridad vial los señala como relevantes.</w:t>
+        <w:t xml:space="preserve"> dos indicadores binarios calculados de año/mes/día sin ninguna fuente externa — feriado oficial, y temporada alta vial (Semana Santa, con el algoritmo de </w:t>
+      </w:r>
+      <w:proofErr w:type="spellStart"/>
+      <w:r>
+        <w:rPr>
+          <w:lang w:val="es-GT"/>
+        </w:rPr>
+        <w:t>Meeus</w:t>
+      </w:r>
+      <w:proofErr w:type="spellEnd"/>
+      <w:r>
+        <w:rPr>
+          <w:lang w:val="es-GT"/>
+        </w:rPr>
+        <w:t>/Jones/Butcher para la fecha de Pascua, y fin de año). Se probaron porque la literatura de seguridad vial los señala como relevantes.</w:t>
       </w:r>
     </w:p>
     <w:p>
@@ -4586,13 +4925,28 @@
           <w:b/>
           <w:lang w:val="es-GT"/>
         </w:rPr>
+        <w:lastRenderedPageBreak/>
         <w:t>Codificación de categóricas:</w:t>
       </w:r>
       <w:r>
         <w:rPr>
           <w:lang w:val="es-GT"/>
         </w:rPr>
-        <w:t xml:space="preserve"> las de baja cardinalidad con One-Hot Encoding. Municipio (339 valores) y marca de vehículo (141) mediante </w:t>
+        <w:t xml:space="preserve"> las de baja cardinalidad con One-Hot </w:t>
+      </w:r>
+      <w:proofErr w:type="spellStart"/>
+      <w:r>
+        <w:rPr>
+          <w:lang w:val="es-GT"/>
+        </w:rPr>
+        <w:t>Encoding</w:t>
+      </w:r>
+      <w:proofErr w:type="spellEnd"/>
+      <w:r>
+        <w:rPr>
+          <w:lang w:val="es-GT"/>
+        </w:rPr>
+        <w:t xml:space="preserve">. Municipio (339 valores) y marca de vehículo (141) mediante </w:t>
       </w:r>
       <w:r>
         <w:rPr>
@@ -4605,14 +4959,21 @@
         <w:rPr>
           <w:lang w:val="es-GT"/>
         </w:rPr>
-        <w:t xml:space="preserve"> —calculada solo </w:t>
-      </w:r>
-      <w:r>
-        <w:rPr>
-          <w:lang w:val="es-GT"/>
-        </w:rPr>
-        <w:lastRenderedPageBreak/>
-        <w:t>sobre 2018–2023 y reutilizada en 2024— en vez de One-Hot: codificarlas directamente habría añadido 480 columnas al modelo, complicando el entrenamiento y la lectura de los gráficos del Capítulo 5. La contrapartida de esta codificación es que pierde la identidad de la categoría —dos municipios con la misma frecuencia se vuelven indistinguibles para el modelo— y que debe calcularse solo sobre el periodo de entrenamiento para no filtrar información del holdout.</w:t>
+        <w:t xml:space="preserve"> —calculada solo sobre 2018–2023 y reutilizada en 2024— en vez de One-Hot: codificarlas directamente habría añadido 480 columnas al modelo, complicando el entrenamiento y la lectura de los gráficos del Capítulo 5. La contrapartida de esta codificación es que pierde la identidad de la categoría —dos municipios con la misma frecuencia se vuelven indistinguibles para el modelo— y que debe calcularse solo sobre el periodo de entrenamiento para no filtrar información del </w:t>
+      </w:r>
+      <w:proofErr w:type="spellStart"/>
+      <w:r>
+        <w:rPr>
+          <w:lang w:val="es-GT"/>
+        </w:rPr>
+        <w:t>holdout</w:t>
+      </w:r>
+      <w:proofErr w:type="spellEnd"/>
+      <w:r>
+        <w:rPr>
+          <w:lang w:val="es-GT"/>
+        </w:rPr>
+        <w:t>.</w:t>
       </w:r>
     </w:p>
     <w:p>
@@ -4725,9 +5086,11 @@
             <w:tcW w:w="0" w:type="auto"/>
           </w:tcPr>
           <w:p>
+            <w:proofErr w:type="spellStart"/>
             <w:r>
               <w:t>color_vehiculo</w:t>
             </w:r>
+            <w:proofErr w:type="spellEnd"/>
           </w:p>
         </w:tc>
         <w:tc>
@@ -4747,9 +5110,11 @@
             <w:tcW w:w="0" w:type="auto"/>
           </w:tcPr>
           <w:p>
+            <w:proofErr w:type="spellStart"/>
             <w:r>
               <w:t>tipo_vehiculo</w:t>
             </w:r>
+            <w:proofErr w:type="spellEnd"/>
           </w:p>
         </w:tc>
         <w:tc>
@@ -4767,9 +5132,11 @@
             <w:tcW w:w="0" w:type="auto"/>
           </w:tcPr>
           <w:p>
+            <w:proofErr w:type="spellStart"/>
             <w:r>
               <w:t>franja_horaria</w:t>
             </w:r>
+            <w:proofErr w:type="spellEnd"/>
           </w:p>
         </w:tc>
         <w:tc>
@@ -4789,9 +5156,11 @@
             <w:tcW w:w="0" w:type="auto"/>
           </w:tcPr>
           <w:p>
+            <w:proofErr w:type="spellStart"/>
             <w:r>
               <w:t>marca_vehiculo</w:t>
             </w:r>
+            <w:proofErr w:type="spellEnd"/>
           </w:p>
         </w:tc>
         <w:tc>
@@ -4809,9 +5178,11 @@
             <w:tcW w:w="0" w:type="auto"/>
           </w:tcPr>
           <w:p>
+            <w:proofErr w:type="spellStart"/>
             <w:r>
               <w:t>edad_vulnerable</w:t>
             </w:r>
+            <w:proofErr w:type="spellEnd"/>
           </w:p>
         </w:tc>
         <w:tc>
@@ -4831,9 +5202,11 @@
             <w:tcW w:w="0" w:type="auto"/>
           </w:tcPr>
           <w:p>
+            <w:proofErr w:type="spellStart"/>
             <w:r>
               <w:t>tipo_evento</w:t>
             </w:r>
+            <w:proofErr w:type="spellEnd"/>
           </w:p>
         </w:tc>
         <w:tc>
@@ -4851,9 +5224,11 @@
             <w:tcW w:w="0" w:type="auto"/>
           </w:tcPr>
           <w:p>
+            <w:proofErr w:type="spellStart"/>
             <w:r>
               <w:t>vehiculo_vulnerable</w:t>
             </w:r>
+            <w:proofErr w:type="spellEnd"/>
           </w:p>
         </w:tc>
         <w:tc>
@@ -4873,9 +5248,11 @@
             <w:tcW w:w="0" w:type="auto"/>
           </w:tcPr>
           <w:p>
+            <w:proofErr w:type="spellStart"/>
             <w:r>
               <w:t>departamento</w:t>
             </w:r>
+            <w:proofErr w:type="spellEnd"/>
           </w:p>
         </w:tc>
         <w:tc>
@@ -4893,9 +5270,11 @@
             <w:tcW w:w="0" w:type="auto"/>
           </w:tcPr>
           <w:p>
+            <w:proofErr w:type="spellStart"/>
             <w:r>
               <w:t>es_fin_de_semana</w:t>
             </w:r>
+            <w:proofErr w:type="spellEnd"/>
           </w:p>
         </w:tc>
         <w:tc>
@@ -4915,9 +5294,11 @@
             <w:tcW w:w="0" w:type="auto"/>
           </w:tcPr>
           <w:p>
+            <w:proofErr w:type="spellStart"/>
             <w:r>
               <w:t>sexo</w:t>
             </w:r>
+            <w:proofErr w:type="spellEnd"/>
           </w:p>
         </w:tc>
         <w:tc>
@@ -4935,9 +5316,11 @@
             <w:tcW w:w="0" w:type="auto"/>
           </w:tcPr>
           <w:p>
+            <w:proofErr w:type="spellStart"/>
             <w:r>
               <w:t>es_feriado</w:t>
             </w:r>
+            <w:proofErr w:type="spellEnd"/>
           </w:p>
         </w:tc>
         <w:tc>
@@ -4977,9 +5360,11 @@
             <w:tcW w:w="0" w:type="auto"/>
           </w:tcPr>
           <w:p>
+            <w:proofErr w:type="spellStart"/>
             <w:r>
               <w:t>es_temporada_alta_vial</w:t>
             </w:r>
+            <w:proofErr w:type="spellEnd"/>
           </w:p>
         </w:tc>
         <w:tc>
@@ -5017,7 +5402,35 @@
         <w:rPr>
           <w:lang w:val="es-GT"/>
         </w:rPr>
-        <w:t>Como verificación de higiene de datos se calculó además la correlación de Pearson entre las numéricas candidatas, descartando pares con |r| ≥ 0.80–0.90. Ninguno supera el umbral: los más altos son hora/hora_sin (~0.77) y mes/mes_sin (~0.75), esperable porque cada una deriva de la otra. Para las categóricas el criterio pesa menos: los modelos de árboles usados aquí son en la práctica invariantes a variables correlacionadas entre sí, a diferencia de un modelo lineal.</w:t>
+        <w:t>Como verificación de higiene de datos se calculó además la correlación de Pearson entre las numéricas candidatas, descartando pares con |r| ≥ 0.80–0.90. Ninguno supera el umbral: los más altos son hora/</w:t>
+      </w:r>
+      <w:proofErr w:type="spellStart"/>
+      <w:r>
+        <w:rPr>
+          <w:lang w:val="es-GT"/>
+        </w:rPr>
+        <w:t>hora_sin</w:t>
+      </w:r>
+      <w:proofErr w:type="spellEnd"/>
+      <w:r>
+        <w:rPr>
+          <w:lang w:val="es-GT"/>
+        </w:rPr>
+        <w:t xml:space="preserve"> (~0.77) y mes/</w:t>
+      </w:r>
+      <w:proofErr w:type="spellStart"/>
+      <w:r>
+        <w:rPr>
+          <w:lang w:val="es-GT"/>
+        </w:rPr>
+        <w:t>mes_sin</w:t>
+      </w:r>
+      <w:proofErr w:type="spellEnd"/>
+      <w:r>
+        <w:rPr>
+          <w:lang w:val="es-GT"/>
+        </w:rPr>
+        <w:t xml:space="preserve"> (~0.75), esperable porque cada una deriva de la otra. Para las categóricas el criterio pesa menos: los modelos de árboles usados aquí son en la práctica invariantes a variables correlacionadas entre sí, a diferencia de un modelo lineal.</w:t>
       </w:r>
     </w:p>
     <w:p>
@@ -5080,7 +5493,21 @@
         <w:rPr>
           <w:lang w:val="es-GT"/>
         </w:rPr>
-        <w:t>El problema se formaliza como la estimación de la probabilidad condicional P(Y=1 | X), donde Y=1 denota un siniestro con desenlace fatal y X el vector de características descrito en el Capítulo 3. El objetivo es maximizar la capacidad de discriminación entre eventos de alta y baja severidad.</w:t>
+        <w:t xml:space="preserve">El problema se formaliza como la estimación de la probabilidad condicional </w:t>
+      </w:r>
+      <w:proofErr w:type="gramStart"/>
+      <w:r>
+        <w:rPr>
+          <w:lang w:val="es-GT"/>
+        </w:rPr>
+        <w:t>P(</w:t>
+      </w:r>
+      <w:proofErr w:type="gramEnd"/>
+      <w:r>
+        <w:rPr>
+          <w:lang w:val="es-GT"/>
+        </w:rPr>
+        <w:t>Y=1 | X), donde Y=1 denota un siniestro con desenlace fatal y X el vector de características descrito en el Capítulo 3. El objetivo es maximizar la capacidad de discriminación entre eventos de alta y baja severidad.</w:t>
       </w:r>
     </w:p>
     <w:p>
@@ -5111,15 +5538,23 @@
           <w:numId w:val="9"/>
         </w:numPr>
         <w:rPr>
-          <w:lang w:val="es-GT"/>
-        </w:rPr>
-      </w:pPr>
-      <w:r>
-        <w:rPr>
-          <w:b/>
-          <w:lang w:val="es-GT"/>
-        </w:rPr>
-        <w:t>Naturaleza tabular del problema: cerca de 60,000 registros y variables mayoritariamente categóricas de cardinalidad moderada — el régimen en el que la literatura reciente (Grinsztajn et al., 2022) documenta que los ensambles de árboles superan de forma consistente a las redes profundas. Por eso el deep learning se descartó desde el planteamiento (Capítulo 1.4).</w:t>
+          <w:bCs/>
+          <w:lang w:val="es-GT"/>
+        </w:rPr>
+      </w:pPr>
+      <w:r>
+        <w:rPr>
+          <w:b/>
+          <w:lang w:val="es-GT"/>
+        </w:rPr>
+        <w:t>Naturaleza tabular del problema:</w:t>
+      </w:r>
+      <w:r>
+        <w:rPr>
+          <w:bCs/>
+          <w:lang w:val="es-GT"/>
+        </w:rPr>
+        <w:t xml:space="preserve"> cerca de 60,000 registros y variables mayoritariamente categóricas de cardinalidad moderada — el régimen en el que la literatura reciente (Grinsztajn et al., 2022) documenta que los ensambles de árboles superan de forma consistente a las redes profundas. Por eso el deep learning se descartó desde el planteamiento (Capítulo 1.4).</w:t>
       </w:r>
     </w:p>
     <w:p>
@@ -5138,7 +5573,23 @@
           <w:b/>
           <w:lang w:val="es-GT"/>
         </w:rPr>
-        <w:t>Un baseline lineal e interpretable:</w:t>
+        <w:t xml:space="preserve">Un </w:t>
+      </w:r>
+      <w:proofErr w:type="spellStart"/>
+      <w:r>
+        <w:rPr>
+          <w:b/>
+          <w:lang w:val="es-GT"/>
+        </w:rPr>
+        <w:t>baseline</w:t>
+      </w:r>
+      <w:proofErr w:type="spellEnd"/>
+      <w:r>
+        <w:rPr>
+          <w:b/>
+          <w:lang w:val="es-GT"/>
+        </w:rPr>
+        <w:t xml:space="preserve"> lineal e interpretable:</w:t>
       </w:r>
       <w:r>
         <w:rPr>
@@ -5163,7 +5614,23 @@
           <w:b/>
           <w:lang w:val="es-GT"/>
         </w:rPr>
-        <w:t>Tres implementaciones de boosting, no solo una:</w:t>
+        <w:t xml:space="preserve">Tres implementaciones de </w:t>
+      </w:r>
+      <w:proofErr w:type="spellStart"/>
+      <w:r>
+        <w:rPr>
+          <w:b/>
+          <w:lang w:val="es-GT"/>
+        </w:rPr>
+        <w:t>boosting</w:t>
+      </w:r>
+      <w:proofErr w:type="spellEnd"/>
+      <w:r>
+        <w:rPr>
+          <w:b/>
+          <w:lang w:val="es-GT"/>
+        </w:rPr>
+        <w:t>, no solo una:</w:t>
       </w:r>
       <w:r>
         <w:rPr>
@@ -5188,7 +5655,14 @@
           <w:b/>
           <w:lang w:val="es-GT"/>
         </w:rPr>
-        <w:t>Compatibilidad con explicabilidad y costo acorde al alcance: las cinco familias son compatibles con SHAP —requisito del Capítulo 5.1— y entrenan en minutos sobre una laptop estándar.</w:t>
+        <w:t>Compatibilidad con explicabilidad y costo acorde al alcance:</w:t>
+      </w:r>
+      <w:r>
+        <w:rPr>
+          <w:bCs/>
+          <w:lang w:val="es-GT"/>
+        </w:rPr>
+        <w:t xml:space="preserve"> las cinco familias son compatibles con SHAP —requisito del Capítulo 5.1— y entrenan en minutos sobre una laptop estándar.</w:t>
       </w:r>
     </w:p>
     <w:p>
@@ -5221,18 +5695,85 @@
         </w:rPr>
         <w:t>Para abordar la asimetría 81/19 entre clases se utilizó ponderación de clases (</w:t>
       </w:r>
+      <w:proofErr w:type="spellStart"/>
       <w:r>
         <w:rPr>
           <w:rStyle w:val="ClarkdownCode"/>
           <w:lang w:val="es-GT"/>
         </w:rPr>
-        <w:t>class_weight="balanced"</w:t>
-      </w:r>
-      <w:r>
-        <w:rPr>
-          <w:lang w:val="es-GT"/>
-        </w:rPr>
-        <w:t xml:space="preserve"> en Regresión Logística y Random Forest; pesos de muestra proporcionales al desbalance en el modelo de boosting), en vez de sobremuestreo sintético (SMOTE): con series temporales de conteos administrativos, generar observaciones sintéticas es más difícil de justificar metodológicamente que ajustar el peso de la función de pérdida, y esta última es la práctica estándar recomendada para boosting sobre datos tabulares desbalanceados.</w:t>
+        <w:t>class_weight</w:t>
+      </w:r>
+      <w:proofErr w:type="spellEnd"/>
+      <w:r>
+        <w:rPr>
+          <w:rStyle w:val="ClarkdownCode"/>
+          <w:lang w:val="es-GT"/>
+        </w:rPr>
+        <w:t>="</w:t>
+      </w:r>
+      <w:proofErr w:type="spellStart"/>
+      <w:r>
+        <w:rPr>
+          <w:rStyle w:val="ClarkdownCode"/>
+          <w:lang w:val="es-GT"/>
+        </w:rPr>
+        <w:t>balanced</w:t>
+      </w:r>
+      <w:proofErr w:type="spellEnd"/>
+      <w:r>
+        <w:rPr>
+          <w:rStyle w:val="ClarkdownCode"/>
+          <w:lang w:val="es-GT"/>
+        </w:rPr>
+        <w:t>"</w:t>
+      </w:r>
+      <w:r>
+        <w:rPr>
+          <w:lang w:val="es-GT"/>
+        </w:rPr>
+        <w:t xml:space="preserve"> en Regresión Logística y Random Forest; pesos de muestra proporcionales al desbalance en el modelo de </w:t>
+      </w:r>
+      <w:proofErr w:type="spellStart"/>
+      <w:r>
+        <w:rPr>
+          <w:lang w:val="es-GT"/>
+        </w:rPr>
+        <w:t>boosting</w:t>
+      </w:r>
+      <w:proofErr w:type="spellEnd"/>
+      <w:r>
+        <w:rPr>
+          <w:lang w:val="es-GT"/>
+        </w:rPr>
+        <w:t xml:space="preserve">), en vez de </w:t>
+      </w:r>
+      <w:proofErr w:type="spellStart"/>
+      <w:r>
+        <w:rPr>
+          <w:lang w:val="es-GT"/>
+        </w:rPr>
+        <w:t>sobremuestreo</w:t>
+      </w:r>
+      <w:proofErr w:type="spellEnd"/>
+      <w:r>
+        <w:rPr>
+          <w:lang w:val="es-GT"/>
+        </w:rPr>
+        <w:t xml:space="preserve"> sintético (SMOTE): con series temporales de conteos administrativos, generar observaciones sintéticas es más difícil de justificar metodológicamente que ajustar el peso de la función de pérdida, y esta última es la práctica estándar recomendada para </w:t>
+      </w:r>
+      <w:proofErr w:type="spellStart"/>
+      <w:r>
+        <w:rPr>
+          <w:lang w:val="es-GT"/>
+        </w:rPr>
+        <w:t>boosting</w:t>
+      </w:r>
+      <w:proofErr w:type="spellEnd"/>
+      <w:r>
+        <w:rPr>
+          <w:lang w:val="es-GT"/>
+        </w:rPr>
+        <w:t xml:space="preserve"> sobre datos tabulares desbalanceados.</w:t>
       </w:r>
     </w:p>
     <w:p>
@@ -5252,8 +5793,33 @@
           <w:b/>
           <w:lang w:val="es-GT"/>
         </w:rPr>
-        <w:t>5-fold Stratified Cross-Validation</w:t>
-      </w:r>
+        <w:t xml:space="preserve">5-fold </w:t>
+      </w:r>
+      <w:proofErr w:type="spellStart"/>
+      <w:r>
+        <w:rPr>
+          <w:b/>
+          <w:lang w:val="es-GT"/>
+        </w:rPr>
+        <w:t>Stratified</w:t>
+      </w:r>
+      <w:proofErr w:type="spellEnd"/>
+      <w:r>
+        <w:rPr>
+          <w:b/>
+          <w:lang w:val="es-GT"/>
+        </w:rPr>
+        <w:t xml:space="preserve"> Cross-</w:t>
+      </w:r>
+      <w:proofErr w:type="spellStart"/>
+      <w:r>
+        <w:rPr>
+          <w:b/>
+          <w:lang w:val="es-GT"/>
+        </w:rPr>
+        <w:t>Validation</w:t>
+      </w:r>
+      <w:proofErr w:type="spellEnd"/>
       <w:r>
         <w:rPr>
           <w:lang w:val="es-GT"/>
@@ -5317,6 +5883,7 @@
         </w:rPr>
         <w:t xml:space="preserve"> (ensamble por </w:t>
       </w:r>
+      <w:proofErr w:type="spellStart"/>
       <w:r>
         <w:rPr>
           <w:i/>
@@ -5324,12 +5891,28 @@
         </w:rPr>
         <w:t>bagging</w:t>
       </w:r>
-      <w:r>
-        <w:rPr>
-          <w:lang w:val="es-GT"/>
-        </w:rPr>
-        <w:t xml:space="preserve">) y tres implementaciones de boosting sobre árboles — </w:t>
-      </w:r>
+      <w:proofErr w:type="spellEnd"/>
+      <w:r>
+        <w:rPr>
+          <w:lang w:val="es-GT"/>
+        </w:rPr>
+        <w:t xml:space="preserve">) y tres implementaciones de </w:t>
+      </w:r>
+      <w:proofErr w:type="spellStart"/>
+      <w:r>
+        <w:rPr>
+          <w:lang w:val="es-GT"/>
+        </w:rPr>
+        <w:t>boosting</w:t>
+      </w:r>
+      <w:proofErr w:type="spellEnd"/>
+      <w:r>
+        <w:rPr>
+          <w:lang w:val="es-GT"/>
+        </w:rPr>
+        <w:t xml:space="preserve"> sobre árboles — </w:t>
+      </w:r>
+      <w:proofErr w:type="spellStart"/>
       <w:r>
         <w:rPr>
           <w:b/>
@@ -5337,12 +5920,28 @@
         </w:rPr>
         <w:t>HistGradientBoostingClassifier</w:t>
       </w:r>
-      <w:r>
-        <w:rPr>
-          <w:lang w:val="es-GT"/>
-        </w:rPr>
-        <w:t xml:space="preserve"> (scikit-learn), </w:t>
-      </w:r>
+      <w:proofErr w:type="spellEnd"/>
+      <w:r>
+        <w:rPr>
+          <w:lang w:val="es-GT"/>
+        </w:rPr>
+        <w:t xml:space="preserve"> (</w:t>
+      </w:r>
+      <w:proofErr w:type="spellStart"/>
+      <w:r>
+        <w:rPr>
+          <w:lang w:val="es-GT"/>
+        </w:rPr>
+        <w:t>scikit-learn</w:t>
+      </w:r>
+      <w:proofErr w:type="spellEnd"/>
+      <w:r>
+        <w:rPr>
+          <w:lang w:val="es-GT"/>
+        </w:rPr>
+        <w:t xml:space="preserve">), </w:t>
+      </w:r>
+      <w:proofErr w:type="spellStart"/>
       <w:r>
         <w:rPr>
           <w:b/>
@@ -5350,12 +5949,14 @@
         </w:rPr>
         <w:t>XGBoost</w:t>
       </w:r>
+      <w:proofErr w:type="spellEnd"/>
       <w:r>
         <w:rPr>
           <w:lang w:val="es-GT"/>
         </w:rPr>
         <w:t xml:space="preserve"> y </w:t>
       </w:r>
+      <w:proofErr w:type="spellStart"/>
       <w:r>
         <w:rPr>
           <w:b/>
@@ -5363,6 +5964,7 @@
         </w:rPr>
         <w:t>LightGBM</w:t>
       </w:r>
+      <w:proofErr w:type="spellEnd"/>
       <w:r>
         <w:rPr>
           <w:lang w:val="es-GT"/>
@@ -5408,12 +6010,14 @@
             <w:tcW w:w="0" w:type="auto"/>
           </w:tcPr>
           <w:p>
+            <w:proofErr w:type="spellStart"/>
             <w:r>
               <w:rPr>
                 <w:b/>
               </w:rPr>
               <w:t>Algoritmo</w:t>
             </w:r>
+            <w:proofErr w:type="spellEnd"/>
           </w:p>
         </w:tc>
         <w:tc>
@@ -5451,7 +6055,21 @@
               <w:rPr>
                 <w:b/>
               </w:rPr>
-              <w:t>Recall (Fallecido)</w:t>
+              <w:t>Recall (</w:t>
+            </w:r>
+            <w:proofErr w:type="spellStart"/>
+            <w:r>
+              <w:rPr>
+                <w:b/>
+              </w:rPr>
+              <w:t>Fallecido</w:t>
+            </w:r>
+            <w:proofErr w:type="spellEnd"/>
+            <w:r>
+              <w:rPr>
+                <w:b/>
+              </w:rPr>
+              <w:t>)</w:t>
             </w:r>
           </w:p>
         </w:tc>
@@ -5464,7 +6082,21 @@
               <w:rPr>
                 <w:b/>
               </w:rPr>
-              <w:t>Precision (Fallecido)</w:t>
+              <w:t>Precision (</w:t>
+            </w:r>
+            <w:proofErr w:type="spellStart"/>
+            <w:r>
+              <w:rPr>
+                <w:b/>
+              </w:rPr>
+              <w:t>Fallecido</w:t>
+            </w:r>
+            <w:proofErr w:type="spellEnd"/>
+            <w:r>
+              <w:rPr>
+                <w:b/>
+              </w:rPr>
+              <w:t>)</w:t>
             </w:r>
           </w:p>
         </w:tc>
@@ -5477,7 +6109,21 @@
               <w:rPr>
                 <w:b/>
               </w:rPr>
-              <w:t>F1 (Fallecido)</w:t>
+              <w:t>F1 (</w:t>
+            </w:r>
+            <w:proofErr w:type="spellStart"/>
+            <w:r>
+              <w:rPr>
+                <w:b/>
+              </w:rPr>
+              <w:t>Fallecido</w:t>
+            </w:r>
+            <w:proofErr w:type="spellEnd"/>
+            <w:r>
+              <w:rPr>
+                <w:b/>
+              </w:rPr>
+              <w:t>)</w:t>
             </w:r>
           </w:p>
         </w:tc>
@@ -5488,9 +6134,19 @@
             <w:tcW w:w="0" w:type="auto"/>
           </w:tcPr>
           <w:p>
-            <w:r>
-              <w:t>Regresión Logística</w:t>
-            </w:r>
+            <w:proofErr w:type="spellStart"/>
+            <w:r>
+              <w:t>Regresión</w:t>
+            </w:r>
+            <w:proofErr w:type="spellEnd"/>
+            <w:r>
+              <w:t xml:space="preserve"> </w:t>
+            </w:r>
+            <w:proofErr w:type="spellStart"/>
+            <w:r>
+              <w:t>Logística</w:t>
+            </w:r>
+            <w:proofErr w:type="spellEnd"/>
           </w:p>
         </w:tc>
         <w:tc>
@@ -5612,10 +6268,12 @@
             <w:tcW w:w="0" w:type="auto"/>
           </w:tcPr>
           <w:p>
+            <w:proofErr w:type="spellStart"/>
             <w:r>
               <w:lastRenderedPageBreak/>
               <w:t>HistGradientBoosting</w:t>
             </w:r>
+            <w:proofErr w:type="spellEnd"/>
           </w:p>
         </w:tc>
         <w:tc>
@@ -5675,9 +6333,11 @@
             <w:tcW w:w="0" w:type="auto"/>
           </w:tcPr>
           <w:p>
+            <w:proofErr w:type="spellStart"/>
             <w:r>
               <w:t>XGBoost</w:t>
             </w:r>
+            <w:proofErr w:type="spellEnd"/>
           </w:p>
         </w:tc>
         <w:tc>
@@ -5744,12 +6404,14 @@
             <w:shd w:val="clear" w:color="auto" w:fill="EAF2FB"/>
           </w:tcPr>
           <w:p>
+            <w:proofErr w:type="spellStart"/>
             <w:r>
               <w:rPr>
                 <w:b/>
               </w:rPr>
               <w:t>LightGBM</w:t>
             </w:r>
+            <w:proofErr w:type="spellEnd"/>
           </w:p>
         </w:tc>
         <w:tc>
@@ -5822,8 +6484,23 @@
         <w:rPr>
           <w:lang w:val="es-GT"/>
         </w:rPr>
-        <w:t xml:space="preserve">Los tres modelos de boosting quedan prácticamente empatados — 0.004 de diferencia en ROC-AUC entre el mejor y el peor de los tres —, muy por encima de la Regresión Logística y ligeramente por encima de Random Forest. Se selecciona </w:t>
-      </w:r>
+        <w:t xml:space="preserve">Los tres modelos de </w:t>
+      </w:r>
+      <w:proofErr w:type="spellStart"/>
+      <w:r>
+        <w:rPr>
+          <w:lang w:val="es-GT"/>
+        </w:rPr>
+        <w:t>boosting</w:t>
+      </w:r>
+      <w:proofErr w:type="spellEnd"/>
+      <w:r>
+        <w:rPr>
+          <w:lang w:val="es-GT"/>
+        </w:rPr>
+        <w:t xml:space="preserve"> quedan prácticamente empatados — 0.004 de diferencia en ROC-AUC entre el mejor y el peor de los tres —, muy por encima de la Regresión Logística y ligeramente por encima de Random Forest. Se selecciona </w:t>
+      </w:r>
+      <w:proofErr w:type="spellStart"/>
       <w:r>
         <w:rPr>
           <w:b/>
@@ -5831,11 +6508,40 @@
         </w:rPr>
         <w:t>LightGBM</w:t>
       </w:r>
-      <w:r>
-        <w:rPr>
-          <w:lang w:val="es-GT"/>
-        </w:rPr>
-        <w:t xml:space="preserve"> por tener, por un margen mínimo sobre XGBoost (0.7720 vs. 0.7715), el mejor ROC-AUC en validación cruzada: el único criterio admisible en este punto, porque el holdout de 2024 todavía no se ha mirado. La salida completa por pliegue está en el Anexo A.</w:t>
+      <w:proofErr w:type="spellEnd"/>
+      <w:r>
+        <w:rPr>
+          <w:lang w:val="es-GT"/>
+        </w:rPr>
+        <w:t xml:space="preserve"> por tener, por un margen mínimo sobre </w:t>
+      </w:r>
+      <w:proofErr w:type="spellStart"/>
+      <w:r>
+        <w:rPr>
+          <w:lang w:val="es-GT"/>
+        </w:rPr>
+        <w:t>XGBoost</w:t>
+      </w:r>
+      <w:proofErr w:type="spellEnd"/>
+      <w:r>
+        <w:rPr>
+          <w:lang w:val="es-GT"/>
+        </w:rPr>
+        <w:t xml:space="preserve"> (0.7720 vs. 0.7715), el mejor ROC-AUC en validación cruzada: el único criterio admisible en este punto, porque el </w:t>
+      </w:r>
+      <w:proofErr w:type="spellStart"/>
+      <w:r>
+        <w:rPr>
+          <w:lang w:val="es-GT"/>
+        </w:rPr>
+        <w:t>holdout</w:t>
+      </w:r>
+      <w:proofErr w:type="spellEnd"/>
+      <w:r>
+        <w:rPr>
+          <w:lang w:val="es-GT"/>
+        </w:rPr>
+        <w:t xml:space="preserve"> de 2024 todavía no se ha mirado. La salida completa por pliegue está en el Anexo A.</w:t>
       </w:r>
     </w:p>
     <w:p>
@@ -5852,8 +6558,53 @@
         </w:rPr>
         <w:t xml:space="preserve"> Ante la pregunta legítima de si se puede seguir ajustando el modelo para mejorar el porcentaje, se diseñaron cinco pruebas independientes entre sí. </w:t>
       </w:r>
-      <w:r>
-        <w:t>Ninguna logró una mejora apreciable sobre el holdout real:</w:t>
+      <w:proofErr w:type="spellStart"/>
+      <w:r>
+        <w:t>Ninguna</w:t>
+      </w:r>
+      <w:proofErr w:type="spellEnd"/>
+      <w:r>
+        <w:t xml:space="preserve"> </w:t>
+      </w:r>
+      <w:proofErr w:type="spellStart"/>
+      <w:r>
+        <w:t>logró</w:t>
+      </w:r>
+      <w:proofErr w:type="spellEnd"/>
+      <w:r>
+        <w:t xml:space="preserve"> </w:t>
+      </w:r>
+      <w:proofErr w:type="spellStart"/>
+      <w:r>
+        <w:t>una</w:t>
+      </w:r>
+      <w:proofErr w:type="spellEnd"/>
+      <w:r>
+        <w:t xml:space="preserve"> </w:t>
+      </w:r>
+      <w:proofErr w:type="spellStart"/>
+      <w:r>
+        <w:t>mejora</w:t>
+      </w:r>
+      <w:proofErr w:type="spellEnd"/>
+      <w:r>
+        <w:t xml:space="preserve"> </w:t>
+      </w:r>
+      <w:proofErr w:type="spellStart"/>
+      <w:r>
+        <w:t>apreciable</w:t>
+      </w:r>
+      <w:proofErr w:type="spellEnd"/>
+      <w:r>
+        <w:t xml:space="preserve"> </w:t>
+      </w:r>
+      <w:proofErr w:type="spellStart"/>
+      <w:r>
+        <w:t>sobre</w:t>
+      </w:r>
+      <w:proofErr w:type="spellEnd"/>
+      <w:r>
+        <w:t xml:space="preserve"> el holdout real:</w:t>
       </w:r>
     </w:p>
     <w:tbl>
@@ -5877,12 +6628,14 @@
             <w:tcW w:w="0" w:type="auto"/>
           </w:tcPr>
           <w:p>
+            <w:proofErr w:type="spellStart"/>
             <w:r>
               <w:rPr>
                 <w:b/>
               </w:rPr>
               <w:t>Verificación</w:t>
             </w:r>
+            <w:proofErr w:type="spellEnd"/>
           </w:p>
         </w:tc>
         <w:tc>
@@ -5890,12 +6643,14 @@
             <w:tcW w:w="0" w:type="auto"/>
           </w:tcPr>
           <w:p>
+            <w:proofErr w:type="spellStart"/>
             <w:r>
               <w:rPr>
                 <w:b/>
               </w:rPr>
               <w:t>Variación</w:t>
             </w:r>
+            <w:proofErr w:type="spellEnd"/>
           </w:p>
         </w:tc>
         <w:tc>
@@ -5903,11 +6658,33 @@
             <w:tcW w:w="0" w:type="auto"/>
           </w:tcPr>
           <w:p>
+            <w:proofErr w:type="spellStart"/>
             <w:r>
               <w:rPr>
                 <w:b/>
               </w:rPr>
-              <w:t>Resultado sobre el holdout 2024</w:t>
+              <w:t>Resultado</w:t>
+            </w:r>
+            <w:proofErr w:type="spellEnd"/>
+            <w:r>
+              <w:rPr>
+                <w:b/>
+              </w:rPr>
+              <w:t xml:space="preserve"> </w:t>
+            </w:r>
+            <w:proofErr w:type="spellStart"/>
+            <w:r>
+              <w:rPr>
+                <w:b/>
+              </w:rPr>
+              <w:t>sobre</w:t>
+            </w:r>
+            <w:proofErr w:type="spellEnd"/>
+            <w:r>
+              <w:rPr>
+                <w:b/>
+              </w:rPr>
+              <w:t xml:space="preserve"> el holdout 2024</w:t>
             </w:r>
           </w:p>
         </w:tc>
@@ -5919,8 +6696,21 @@
           </w:tcPr>
           <w:p>
             <w:r>
-              <w:t>1. Hiperparámetros genéricos</w:t>
-            </w:r>
+              <w:t xml:space="preserve">1. </w:t>
+            </w:r>
+            <w:proofErr w:type="spellStart"/>
+            <w:r>
+              <w:t>Hiperparámetros</w:t>
+            </w:r>
+            <w:proofErr w:type="spellEnd"/>
+            <w:r>
+              <w:t xml:space="preserve"> </w:t>
+            </w:r>
+            <w:proofErr w:type="spellStart"/>
+            <w:r>
+              <w:t>genéricos</w:t>
+            </w:r>
+            <w:proofErr w:type="spellEnd"/>
           </w:p>
         </w:tc>
         <w:tc>
@@ -5928,15 +6718,22 @@
             <w:tcW w:w="0" w:type="auto"/>
           </w:tcPr>
           <w:p>
+            <w:proofErr w:type="spellStart"/>
             <w:r>
               <w:rPr>
                 <w:rStyle w:val="ClarkdownCode"/>
               </w:rPr>
               <w:t>RandomizedSearchCV</w:t>
             </w:r>
-            <w:r>
-              <w:t>, 25 × 5-fold = 125 ajustes</w:t>
-            </w:r>
+            <w:proofErr w:type="spellEnd"/>
+            <w:r>
+              <w:t xml:space="preserve">, 25 × 5-fold = 125 </w:t>
+            </w:r>
+            <w:proofErr w:type="spellStart"/>
+            <w:r>
+              <w:t>ajustes</w:t>
+            </w:r>
+            <w:proofErr w:type="spellEnd"/>
           </w:p>
         </w:tc>
         <w:tc>
@@ -5945,8 +6742,21 @@
           </w:tcPr>
           <w:p>
             <w:r>
-              <w:t>Sin mejora apreciable</w:t>
-            </w:r>
+              <w:t xml:space="preserve">Sin </w:t>
+            </w:r>
+            <w:proofErr w:type="spellStart"/>
+            <w:r>
+              <w:t>mejora</w:t>
+            </w:r>
+            <w:proofErr w:type="spellEnd"/>
+            <w:r>
+              <w:t xml:space="preserve"> </w:t>
+            </w:r>
+            <w:proofErr w:type="spellStart"/>
+            <w:r>
+              <w:t>apreciable</w:t>
+            </w:r>
+            <w:proofErr w:type="spellEnd"/>
           </w:p>
         </w:tc>
       </w:tr>
@@ -5957,8 +6767,13 @@
           </w:tcPr>
           <w:p>
             <w:r>
-              <w:t>2. Variables nuevas</w:t>
-            </w:r>
+              <w:t xml:space="preserve">2. Variables </w:t>
+            </w:r>
+            <w:proofErr w:type="spellStart"/>
+            <w:r>
+              <w:t>nuevas</w:t>
+            </w:r>
+            <w:proofErr w:type="spellEnd"/>
           </w:p>
         </w:tc>
         <w:tc>
@@ -5993,7 +6808,21 @@
               <w:rPr>
                 <w:lang w:val="es-GT"/>
               </w:rPr>
-              <w:t>V de Cramér 0.008 y 0.001; ninguna métrica se movió</w:t>
+              <w:t xml:space="preserve">V de </w:t>
+            </w:r>
+            <w:proofErr w:type="spellStart"/>
+            <w:r>
+              <w:rPr>
+                <w:lang w:val="es-GT"/>
+              </w:rPr>
+              <w:t>Cramér</w:t>
+            </w:r>
+            <w:proofErr w:type="spellEnd"/>
+            <w:r>
+              <w:rPr>
+                <w:lang w:val="es-GT"/>
+              </w:rPr>
+              <w:t xml:space="preserve"> 0.008 y 0.001; ninguna métrica se movió</w:t>
             </w:r>
           </w:p>
         </w:tc>
@@ -6005,8 +6834,21 @@
           </w:tcPr>
           <w:p>
             <w:r>
-              <w:t>3. Hiperparámetros nativos</w:t>
-            </w:r>
+              <w:t xml:space="preserve">3. </w:t>
+            </w:r>
+            <w:proofErr w:type="spellStart"/>
+            <w:r>
+              <w:t>Hiperparámetros</w:t>
+            </w:r>
+            <w:proofErr w:type="spellEnd"/>
+            <w:r>
+              <w:t xml:space="preserve"> </w:t>
+            </w:r>
+            <w:proofErr w:type="spellStart"/>
+            <w:r>
+              <w:t>nativos</w:t>
+            </w:r>
+            <w:proofErr w:type="spellEnd"/>
           </w:p>
         </w:tc>
         <w:tc>
@@ -6014,15 +6856,38 @@
             <w:tcW w:w="0" w:type="auto"/>
           </w:tcPr>
           <w:p>
+            <w:proofErr w:type="spellStart"/>
             <w:r>
               <w:rPr>
                 <w:rStyle w:val="ClarkdownCode"/>
               </w:rPr>
               <w:t>RandomizedSearchCV</w:t>
             </w:r>
-            <w:r>
-              <w:t xml:space="preserve"> sobre LightGBM, 60 × 5-fold = 300 ajustes</w:t>
-            </w:r>
+            <w:proofErr w:type="spellEnd"/>
+            <w:r>
+              <w:t xml:space="preserve"> </w:t>
+            </w:r>
+            <w:proofErr w:type="spellStart"/>
+            <w:r>
+              <w:t>sobre</w:t>
+            </w:r>
+            <w:proofErr w:type="spellEnd"/>
+            <w:r>
+              <w:t xml:space="preserve"> </w:t>
+            </w:r>
+            <w:proofErr w:type="spellStart"/>
+            <w:r>
+              <w:t>LightGBM</w:t>
+            </w:r>
+            <w:proofErr w:type="spellEnd"/>
+            <w:r>
+              <w:t xml:space="preserve">, 60 × 5-fold = 300 </w:t>
+            </w:r>
+            <w:proofErr w:type="spellStart"/>
+            <w:r>
+              <w:t>ajustes</w:t>
+            </w:r>
+            <w:proofErr w:type="spellEnd"/>
           </w:p>
         </w:tc>
         <w:tc>
@@ -6031,7 +6896,15 @@
           </w:tcPr>
           <w:p>
             <w:r>
-              <w:t>ROC-AUC 0.741 · Recall 66.0% · F1 0.461</w:t>
+              <w:t xml:space="preserve">ROC-AUC 0.741 · Recall </w:t>
+            </w:r>
+            <w:proofErr w:type="gramStart"/>
+            <w:r>
+              <w:t>66.0% ·</w:t>
+            </w:r>
+            <w:proofErr w:type="gramEnd"/>
+            <w:r>
+              <w:t xml:space="preserve"> F1 0.461</w:t>
             </w:r>
           </w:p>
         </w:tc>
@@ -6043,8 +6916,13 @@
           </w:tcPr>
           <w:p>
             <w:r>
-              <w:t>4. Modelo reducido</w:t>
-            </w:r>
+              <w:t xml:space="preserve">4. Modelo </w:t>
+            </w:r>
+            <w:proofErr w:type="spellStart"/>
+            <w:r>
+              <w:t>reducido</w:t>
+            </w:r>
+            <w:proofErr w:type="spellEnd"/>
           </w:p>
         </w:tc>
         <w:tc>
@@ -6071,7 +6949,15 @@
           </w:tcPr>
           <w:p>
             <w:r>
-              <w:t>ROC-AUC 0.734 · Recall 66.8% · F1 0.460</w:t>
+              <w:t xml:space="preserve">ROC-AUC 0.734 · Recall </w:t>
+            </w:r>
+            <w:proofErr w:type="gramStart"/>
+            <w:r>
+              <w:t>66.8% ·</w:t>
+            </w:r>
+            <w:proofErr w:type="gramEnd"/>
+            <w:r>
+              <w:t xml:space="preserve"> F1 0.460</w:t>
             </w:r>
           </w:p>
         </w:tc>
@@ -6083,8 +6969,21 @@
           </w:tcPr>
           <w:p>
             <w:r>
-              <w:t>5. Búsqueda bayesiana</w:t>
-            </w:r>
+              <w:t xml:space="preserve">5. </w:t>
+            </w:r>
+            <w:proofErr w:type="spellStart"/>
+            <w:r>
+              <w:t>Búsqueda</w:t>
+            </w:r>
+            <w:proofErr w:type="spellEnd"/>
+            <w:r>
+              <w:t xml:space="preserve"> </w:t>
+            </w:r>
+            <w:proofErr w:type="spellStart"/>
+            <w:r>
+              <w:t>bayesiana</w:t>
+            </w:r>
+            <w:proofErr w:type="spellEnd"/>
           </w:p>
         </w:tc>
         <w:tc>
@@ -6097,11 +6996,33 @@
                 <w:lang w:val="es-GT"/>
               </w:rPr>
             </w:pPr>
+            <w:proofErr w:type="spellStart"/>
             <w:r>
               <w:rPr>
                 <w:lang w:val="es-GT"/>
               </w:rPr>
-              <w:t>Optuna (TPE), mismo espacio y presupuesto que la n.º 3</w:t>
+              <w:t>Optuna</w:t>
+            </w:r>
+            <w:proofErr w:type="spellEnd"/>
+            <w:r>
+              <w:rPr>
+                <w:lang w:val="es-GT"/>
+              </w:rPr>
+              <w:t xml:space="preserve"> (TPE), mismo espacio y presupuesto que </w:t>
+            </w:r>
+            <w:proofErr w:type="gramStart"/>
+            <w:r>
+              <w:rPr>
+                <w:lang w:val="es-GT"/>
+              </w:rPr>
+              <w:t>la n.º</w:t>
+            </w:r>
+            <w:proofErr w:type="gramEnd"/>
+            <w:r>
+              <w:rPr>
+                <w:lang w:val="es-GT"/>
+              </w:rPr>
+              <w:t xml:space="preserve"> 3</w:t>
             </w:r>
           </w:p>
         </w:tc>
@@ -6111,7 +7032,15 @@
           </w:tcPr>
           <w:p>
             <w:r>
-              <w:t>ROC-AUC 0.738 · Recall 66.3% · F1 0.462</w:t>
+              <w:t xml:space="preserve">ROC-AUC 0.738 · Recall </w:t>
+            </w:r>
+            <w:proofErr w:type="gramStart"/>
+            <w:r>
+              <w:t>66.3% ·</w:t>
+            </w:r>
+            <w:proofErr w:type="gramEnd"/>
+            <w:r>
+              <w:t xml:space="preserve"> F1 0.462</w:t>
             </w:r>
           </w:p>
         </w:tc>
@@ -6127,7 +7056,21 @@
               <w:rPr>
                 <w:b/>
               </w:rPr>
-              <w:t>Modelo final (referencia)</w:t>
+              <w:t>Modelo final (</w:t>
+            </w:r>
+            <w:proofErr w:type="spellStart"/>
+            <w:r>
+              <w:rPr>
+                <w:b/>
+              </w:rPr>
+              <w:t>referencia</w:t>
+            </w:r>
+            <w:proofErr w:type="spellEnd"/>
+            <w:r>
+              <w:rPr>
+                <w:b/>
+              </w:rPr>
+              <w:t>)</w:t>
             </w:r>
           </w:p>
         </w:tc>
@@ -6137,12 +7080,56 @@
             <w:shd w:val="clear" w:color="auto" w:fill="EAF2FB"/>
           </w:tcPr>
           <w:p>
+            <w:proofErr w:type="spellStart"/>
             <w:r>
               <w:rPr>
                 <w:b/>
               </w:rPr>
-              <w:t>LightGBM, hiperparámetros por defecto</w:t>
-            </w:r>
+              <w:t>LightGBM</w:t>
+            </w:r>
+            <w:proofErr w:type="spellEnd"/>
+            <w:r>
+              <w:rPr>
+                <w:b/>
+              </w:rPr>
+              <w:t xml:space="preserve">, </w:t>
+            </w:r>
+            <w:proofErr w:type="spellStart"/>
+            <w:r>
+              <w:rPr>
+                <w:b/>
+              </w:rPr>
+              <w:t>hiperparámetros</w:t>
+            </w:r>
+            <w:proofErr w:type="spellEnd"/>
+            <w:r>
+              <w:rPr>
+                <w:b/>
+              </w:rPr>
+              <w:t xml:space="preserve"> </w:t>
+            </w:r>
+            <w:proofErr w:type="spellStart"/>
+            <w:r>
+              <w:rPr>
+                <w:b/>
+              </w:rPr>
+              <w:t>por</w:t>
+            </w:r>
+            <w:proofErr w:type="spellEnd"/>
+            <w:r>
+              <w:rPr>
+                <w:b/>
+              </w:rPr>
+              <w:t xml:space="preserve"> </w:t>
+            </w:r>
+            <w:proofErr w:type="spellStart"/>
+            <w:r>
+              <w:rPr>
+                <w:b/>
+              </w:rPr>
+              <w:t>defecto</w:t>
+            </w:r>
+            <w:proofErr w:type="spellEnd"/>
           </w:p>
         </w:tc>
         <w:tc>
@@ -6155,7 +7142,21 @@
               <w:rPr>
                 <w:b/>
               </w:rPr>
-              <w:t>ROC-AUC 0.740 · Recall 67.8% · F1 0.467</w:t>
+              <w:t xml:space="preserve">ROC-AUC 0.740 · Recall </w:t>
+            </w:r>
+            <w:proofErr w:type="gramStart"/>
+            <w:r>
+              <w:rPr>
+                <w:b/>
+              </w:rPr>
+              <w:t>67.8% ·</w:t>
+            </w:r>
+            <w:proofErr w:type="gramEnd"/>
+            <w:r>
+              <w:rPr>
+                <w:b/>
+              </w:rPr>
+              <w:t xml:space="preserve"> F1 0.467</w:t>
             </w:r>
           </w:p>
         </w:tc>
@@ -6171,20 +7172,127 @@
         <w:rPr>
           <w:lang w:val="es-GT"/>
         </w:rPr>
-        <w:t xml:space="preserve">Las dos búsquedas profundas de hiperparámetros (verificaciones 3 y 5) sí mejoraron la validación cruzada —de 0.773 a 0.777—, pero esa ventaja se desvanece sobre el holdout: las tres variantes de LightGBM caen dentro de un rango de tres milésimas de ROC-AUC, y la que más profundizó en el espacio de hiperparámetros (Optuna) es, de hecho, la que peor generalizó fuera de tiempo. Por eso la memoria reporta el modelo con </w:t>
-      </w:r>
-      <w:r>
-        <w:rPr>
-          <w:b/>
-          <w:lang w:val="es-GT"/>
-        </w:rPr>
-        <w:t>hiperparámetros por defecto</w:t>
-      </w:r>
-      <w:r>
-        <w:rPr>
-          <w:lang w:val="es-GT"/>
-        </w:rPr>
-        <w:t>: iguala al ajustado en discriminación, lo supera en recall sobre la clase fatal (67.8% vs. 66.0%) y no obliga a justificar una configuración más compleja. Los hiperparámetros exactos de cada búsqueda se detallan en el Anexo D.</w:t>
+        <w:t xml:space="preserve">Las dos búsquedas profundas de </w:t>
+      </w:r>
+      <w:proofErr w:type="spellStart"/>
+      <w:r>
+        <w:rPr>
+          <w:lang w:val="es-GT"/>
+        </w:rPr>
+        <w:t>hiperparámetros</w:t>
+      </w:r>
+      <w:proofErr w:type="spellEnd"/>
+      <w:r>
+        <w:rPr>
+          <w:lang w:val="es-GT"/>
+        </w:rPr>
+        <w:t xml:space="preserve"> (verificaciones 3 y 5) sí mejoraron la validación cruzada —de 0.773 a 0.777—, pero esa ventaja se desvanece sobre el </w:t>
+      </w:r>
+      <w:proofErr w:type="spellStart"/>
+      <w:r>
+        <w:rPr>
+          <w:lang w:val="es-GT"/>
+        </w:rPr>
+        <w:t>holdout</w:t>
+      </w:r>
+      <w:proofErr w:type="spellEnd"/>
+      <w:r>
+        <w:rPr>
+          <w:lang w:val="es-GT"/>
+        </w:rPr>
+        <w:t xml:space="preserve">: las tres variantes de </w:t>
+      </w:r>
+      <w:proofErr w:type="spellStart"/>
+      <w:r>
+        <w:rPr>
+          <w:lang w:val="es-GT"/>
+        </w:rPr>
+        <w:t>LightGBM</w:t>
+      </w:r>
+      <w:proofErr w:type="spellEnd"/>
+      <w:r>
+        <w:rPr>
+          <w:lang w:val="es-GT"/>
+        </w:rPr>
+        <w:t xml:space="preserve"> caen dentro de un rango de tres milésimas de ROC-AUC, y la que más profundizó en el espacio de </w:t>
+      </w:r>
+      <w:proofErr w:type="spellStart"/>
+      <w:r>
+        <w:rPr>
+          <w:lang w:val="es-GT"/>
+        </w:rPr>
+        <w:t>hiperparámetros</w:t>
+      </w:r>
+      <w:proofErr w:type="spellEnd"/>
+      <w:r>
+        <w:rPr>
+          <w:lang w:val="es-GT"/>
+        </w:rPr>
+        <w:t xml:space="preserve"> (</w:t>
+      </w:r>
+      <w:proofErr w:type="spellStart"/>
+      <w:r>
+        <w:rPr>
+          <w:lang w:val="es-GT"/>
+        </w:rPr>
+        <w:t>Optuna</w:t>
+      </w:r>
+      <w:proofErr w:type="spellEnd"/>
+      <w:r>
+        <w:rPr>
+          <w:lang w:val="es-GT"/>
+        </w:rPr>
+        <w:t xml:space="preserve">) es, de hecho, la que peor generalizó fuera de tiempo. Por eso la memoria reporta el modelo con </w:t>
+      </w:r>
+      <w:proofErr w:type="spellStart"/>
+      <w:r>
+        <w:rPr>
+          <w:b/>
+          <w:lang w:val="es-GT"/>
+        </w:rPr>
+        <w:t>hiperparámetros</w:t>
+      </w:r>
+      <w:proofErr w:type="spellEnd"/>
+      <w:r>
+        <w:rPr>
+          <w:b/>
+          <w:lang w:val="es-GT"/>
+        </w:rPr>
+        <w:t xml:space="preserve"> por defecto</w:t>
+      </w:r>
+      <w:r>
+        <w:rPr>
+          <w:lang w:val="es-GT"/>
+        </w:rPr>
+        <w:t xml:space="preserve">: iguala al ajustado en discriminación, lo supera en </w:t>
+      </w:r>
+      <w:proofErr w:type="spellStart"/>
+      <w:r>
+        <w:rPr>
+          <w:lang w:val="es-GT"/>
+        </w:rPr>
+        <w:t>recall</w:t>
+      </w:r>
+      <w:proofErr w:type="spellEnd"/>
+      <w:r>
+        <w:rPr>
+          <w:lang w:val="es-GT"/>
+        </w:rPr>
+        <w:t xml:space="preserve"> sobre la clase fatal (67.8% vs. 66.0%) y no obliga a justificar una configuración más compleja. Los </w:t>
+      </w:r>
+      <w:proofErr w:type="spellStart"/>
+      <w:r>
+        <w:rPr>
+          <w:lang w:val="es-GT"/>
+        </w:rPr>
+        <w:t>hiperparámetros</w:t>
+      </w:r>
+      <w:proofErr w:type="spellEnd"/>
+      <w:r>
+        <w:rPr>
+          <w:lang w:val="es-GT"/>
+        </w:rPr>
+        <w:t xml:space="preserve"> exactos de cada búsqueda se detallan en el Anexo D.</w:t>
       </w:r>
     </w:p>
     <w:p>
@@ -6204,7 +7312,21 @@
           <w:lang w:val="es-GT"/>
         </w:rPr>
         <w:lastRenderedPageBreak/>
-        <w:t>modelo, ni la variante de boosting elegida, ni lo sofisticado del algoritmo de búsqueda. El margen de mejora real está en incorporar variables nuevas, no en seguir optimizando sobre las actuales (Capítulo 7.2).</w:t>
+        <w:t xml:space="preserve">modelo, ni la variante de </w:t>
+      </w:r>
+      <w:proofErr w:type="spellStart"/>
+      <w:r>
+        <w:rPr>
+          <w:lang w:val="es-GT"/>
+        </w:rPr>
+        <w:t>boosting</w:t>
+      </w:r>
+      <w:proofErr w:type="spellEnd"/>
+      <w:r>
+        <w:rPr>
+          <w:lang w:val="es-GT"/>
+        </w:rPr>
+        <w:t xml:space="preserve"> elegida, ni lo sofisticado del algoritmo de búsqueda. El margen de mejora real está en incorporar variables nuevas, no en seguir optimizando sobre las actuales (Capítulo 7.2).</w:t>
       </w:r>
     </w:p>
     <w:p>
@@ -6220,7 +7342,49 @@
         <w:rPr>
           <w:lang w:val="es-GT"/>
         </w:rPr>
-        <w:t>4.4. Evaluación final sobre el holdout Out-of-Time (2024)</w:t>
+        <w:t xml:space="preserve">4.4. Evaluación final sobre el </w:t>
+      </w:r>
+      <w:proofErr w:type="spellStart"/>
+      <w:r>
+        <w:rPr>
+          <w:lang w:val="es-GT"/>
+        </w:rPr>
+        <w:t>holdout</w:t>
+      </w:r>
+      <w:proofErr w:type="spellEnd"/>
+      <w:r>
+        <w:rPr>
+          <w:lang w:val="es-GT"/>
+        </w:rPr>
+        <w:t xml:space="preserve"> </w:t>
+      </w:r>
+      <w:proofErr w:type="spellStart"/>
+      <w:r>
+        <w:rPr>
+          <w:lang w:val="es-GT"/>
+        </w:rPr>
+        <w:t>Out</w:t>
+      </w:r>
+      <w:proofErr w:type="spellEnd"/>
+      <w:r>
+        <w:rPr>
+          <w:lang w:val="es-GT"/>
+        </w:rPr>
+        <w:t>-</w:t>
+      </w:r>
+      <w:proofErr w:type="spellStart"/>
+      <w:r>
+        <w:rPr>
+          <w:lang w:val="es-GT"/>
+        </w:rPr>
+        <w:t>of</w:t>
+      </w:r>
+      <w:proofErr w:type="spellEnd"/>
+      <w:r>
+        <w:rPr>
+          <w:lang w:val="es-GT"/>
+        </w:rPr>
+        <w:t>-Time (2024)</w:t>
       </w:r>
       <w:bookmarkEnd w:id="39"/>
       <w:bookmarkEnd w:id="40"/>
@@ -6235,7 +7399,21 @@
         <w:rPr>
           <w:lang w:val="es-GT"/>
         </w:rPr>
-        <w:t xml:space="preserve">El modelo ganador (LightGBM, con las variables de feriado/temporada alta vial ya incluidas) se reentrenó con la totalidad de 2018–2023 y se evaluó </w:t>
+        <w:t>El modelo ganador (</w:t>
+      </w:r>
+      <w:proofErr w:type="spellStart"/>
+      <w:r>
+        <w:rPr>
+          <w:lang w:val="es-GT"/>
+        </w:rPr>
+        <w:t>LightGBM</w:t>
+      </w:r>
+      <w:proofErr w:type="spellEnd"/>
+      <w:r>
+        <w:rPr>
+          <w:lang w:val="es-GT"/>
+        </w:rPr>
+        <w:t xml:space="preserve">, con las variables de feriado/temporada alta vial ya incluidas) se reentrenó con la totalidad de 2018–2023 y se evaluó </w:t>
       </w:r>
       <w:r>
         <w:rPr>
@@ -6282,7 +7460,77 @@
                   <w:rPr>
                     <w:b/>
                   </w:rPr>
-                  <w:t>ROC-AUC: 0.740 · PR-AUC: 0.469 · Recall (Fallecido): 67.8% · Precision (Fallecido): 35.7% · F1 (Fallecido): 0.467</w:t>
+                  <w:t>ROC-AUC: 0.740 · PR-AUC: 0.469 · Recall (</w:t>
+                </w:r>
+                <w:proofErr w:type="spellStart"/>
+                <w:r>
+                  <w:rPr>
+                    <w:b/>
+                  </w:rPr>
+                  <w:t>Fallecido</w:t>
+                </w:r>
+                <w:proofErr w:type="spellEnd"/>
+                <w:r>
+                  <w:rPr>
+                    <w:b/>
+                  </w:rPr>
+                  <w:t xml:space="preserve">): </w:t>
+                </w:r>
+                <w:proofErr w:type="gramStart"/>
+                <w:r>
+                  <w:rPr>
+                    <w:b/>
+                  </w:rPr>
+                  <w:t>67.8% ·</w:t>
+                </w:r>
+                <w:proofErr w:type="gramEnd"/>
+                <w:r>
+                  <w:rPr>
+                    <w:b/>
+                  </w:rPr>
+                  <w:t xml:space="preserve"> Precision (</w:t>
+                </w:r>
+                <w:proofErr w:type="spellStart"/>
+                <w:r>
+                  <w:rPr>
+                    <w:b/>
+                  </w:rPr>
+                  <w:t>Fallecido</w:t>
+                </w:r>
+                <w:proofErr w:type="spellEnd"/>
+                <w:r>
+                  <w:rPr>
+                    <w:b/>
+                  </w:rPr>
+                  <w:t xml:space="preserve">): </w:t>
+                </w:r>
+                <w:proofErr w:type="gramStart"/>
+                <w:r>
+                  <w:rPr>
+                    <w:b/>
+                  </w:rPr>
+                  <w:t>35.7% ·</w:t>
+                </w:r>
+                <w:proofErr w:type="gramEnd"/>
+                <w:r>
+                  <w:rPr>
+                    <w:b/>
+                  </w:rPr>
+                  <w:t xml:space="preserve"> F1 (</w:t>
+                </w:r>
+                <w:proofErr w:type="spellStart"/>
+                <w:r>
+                  <w:rPr>
+                    <w:b/>
+                  </w:rPr>
+                  <w:t>Fallecido</w:t>
+                </w:r>
+                <w:proofErr w:type="spellEnd"/>
+                <w:r>
+                  <w:rPr>
+                    <w:b/>
+                  </w:rPr>
+                  <w:t>): 0.467</w:t>
                 </w:r>
               </w:p>
             </w:sdtContent>
@@ -6344,7 +7592,49 @@
         <w:rPr>
           <w:lang w:val="es-GT"/>
         </w:rPr>
-        <w:t>La matriz de confusión hace tangibles esas métricas sobre los 11,272 casos del holdout: de los 2,365 siniestros realmente fatales, el modelo detecta 1,603 (el 67.8% de recall) y deja pasar 762 como falsos negativos; de los 4,494 casos que el modelo marca como de alto riesgo, 1,603 en efecto lo eran (35.7% de precisión) y 2,891 resultaron ser falsos positivos — el costo operacional de priorizar el recall, discutido más abajo.</w:t>
+        <w:t xml:space="preserve">La matriz de confusión hace tangibles esas métricas sobre los 11,272 casos del </w:t>
+      </w:r>
+      <w:proofErr w:type="spellStart"/>
+      <w:r>
+        <w:rPr>
+          <w:lang w:val="es-GT"/>
+        </w:rPr>
+        <w:t>holdout</w:t>
+      </w:r>
+      <w:proofErr w:type="spellEnd"/>
+      <w:r>
+        <w:rPr>
+          <w:lang w:val="es-GT"/>
+        </w:rPr>
+        <w:t xml:space="preserve">: de los 2,365 siniestros realmente fatales, el modelo detecta 1,603 (el 67.8% de </w:t>
+      </w:r>
+      <w:proofErr w:type="spellStart"/>
+      <w:r>
+        <w:rPr>
+          <w:lang w:val="es-GT"/>
+        </w:rPr>
+        <w:t>recall</w:t>
+      </w:r>
+      <w:proofErr w:type="spellEnd"/>
+      <w:r>
+        <w:rPr>
+          <w:lang w:val="es-GT"/>
+        </w:rPr>
+        <w:t xml:space="preserve">) y deja pasar 762 como falsos negativos; de los 4,494 casos que el modelo marca como de alto riesgo, 1,603 en efecto lo eran (35.7% de precisión) y 2,891 resultaron ser falsos positivos — el costo operacional de priorizar el </w:t>
+      </w:r>
+      <w:proofErr w:type="spellStart"/>
+      <w:r>
+        <w:rPr>
+          <w:lang w:val="es-GT"/>
+        </w:rPr>
+        <w:t>recall</w:t>
+      </w:r>
+      <w:proofErr w:type="spellEnd"/>
+      <w:r>
+        <w:rPr>
+          <w:lang w:val="es-GT"/>
+        </w:rPr>
+        <w:t>, discutido más abajo.</w:t>
       </w:r>
     </w:p>
     <w:p>
@@ -6370,7 +7660,21 @@
         <w:rPr>
           <w:lang w:val="es-GT"/>
         </w:rPr>
-        <w:t xml:space="preserve">Para contextualizar estos números: un ROC-AUC de 0.5 equivale a azar puro y 1.0 a un clasificador perfecto; en aplicaciones de scoring de riesgo sobre datos administrativos (sin </w:t>
+        <w:t xml:space="preserve">Para contextualizar estos números: un ROC-AUC de 0.5 equivale a azar puro y 1.0 a un clasificador perfecto; en aplicaciones de </w:t>
+      </w:r>
+      <w:proofErr w:type="spellStart"/>
+      <w:r>
+        <w:rPr>
+          <w:lang w:val="es-GT"/>
+        </w:rPr>
+        <w:t>scoring</w:t>
+      </w:r>
+      <w:proofErr w:type="spellEnd"/>
+      <w:r>
+        <w:rPr>
+          <w:lang w:val="es-GT"/>
+        </w:rPr>
+        <w:t xml:space="preserve"> de riesgo sobre datos administrativos (sin </w:t>
       </w:r>
       <w:r>
         <w:rPr>
@@ -6390,7 +7694,21 @@
         <w:rPr>
           <w:lang w:val="es-GT"/>
         </w:rPr>
-        <w:t>El balance recall/precisión (67.8% / 35.7%) es una decisión operacional deliberada, no una debilidad: para una herramienta orientada a priorizar recursos de prevención vial, el costo de no detectar un caso de alto riesgo (falso negativo) es considerablemente mayor que el costo de revisar de más un caso que no resultó fatal (falso positivo).</w:t>
+        <w:t xml:space="preserve">El balance </w:t>
+      </w:r>
+      <w:proofErr w:type="spellStart"/>
+      <w:r>
+        <w:rPr>
+          <w:lang w:val="es-GT"/>
+        </w:rPr>
+        <w:t>recall</w:t>
+      </w:r>
+      <w:proofErr w:type="spellEnd"/>
+      <w:r>
+        <w:rPr>
+          <w:lang w:val="es-GT"/>
+        </w:rPr>
+        <w:t>/precisión (67.8% / 35.7%) es una decisión operacional deliberada, no una debilidad: para una herramienta orientada a priorizar recursos de prevención vial, el costo de no detectar un caso de alto riesgo (falso negativo) es considerablemente mayor que el costo de revisar de más un caso que no resultó fatal (falso positivo).</w:t>
       </w:r>
     </w:p>
     <w:p>
@@ -6420,7 +7738,21 @@
           <w:lang w:val="es-GT"/>
         </w:rPr>
         <w:lastRenderedPageBreak/>
-        <w:t>Capítulo 5: Interpretabilidad y Explicabilidad del Modelo (XAI)</w:t>
+        <w:t xml:space="preserve">Capítulo 5: Interpretabilidad y </w:t>
+      </w:r>
+      <w:proofErr w:type="spellStart"/>
+      <w:r>
+        <w:rPr>
+          <w:lang w:val="es-GT"/>
+        </w:rPr>
+        <w:t>Explicabilidad</w:t>
+      </w:r>
+      <w:proofErr w:type="spellEnd"/>
+      <w:r>
+        <w:rPr>
+          <w:lang w:val="es-GT"/>
+        </w:rPr>
+        <w:t xml:space="preserve"> del Modelo (XAI)</w:t>
       </w:r>
       <w:bookmarkEnd w:id="41"/>
       <w:bookmarkEnd w:id="42"/>
@@ -6483,7 +7815,27 @@
         <w:rPr>
           <w:lang w:val="es-GT"/>
         </w:rPr>
-        <w:t>5.2. Explicatividad global: importancia de variables</w:t>
+        <w:t xml:space="preserve">5.2. </w:t>
+      </w:r>
+      <w:proofErr w:type="spellStart"/>
+      <w:r>
+        <w:rPr>
+          <w:lang w:val="es-GT"/>
+        </w:rPr>
+        <w:t>Explic</w:t>
+      </w:r>
+      <w:r>
+        <w:rPr>
+          <w:lang w:val="es-GT"/>
+        </w:rPr>
+        <w:t>abilidad</w:t>
+      </w:r>
+      <w:proofErr w:type="spellEnd"/>
+      <w:r>
+        <w:rPr>
+          <w:lang w:val="es-GT"/>
+        </w:rPr>
+        <w:t xml:space="preserve"> global: importancia de variables</w:t>
       </w:r>
       <w:bookmarkEnd w:id="45"/>
       <w:bookmarkEnd w:id="46"/>
@@ -6500,6 +7852,7 @@
         </w:rPr>
         <w:t xml:space="preserve">Tras la codificación descrita en el Capítulo 3, el modelo final trabaja con 84 columnas. Los valores SHAP se calcularon con </w:t>
       </w:r>
+      <w:proofErr w:type="spellStart"/>
       <w:r>
         <w:rPr>
           <w:rStyle w:val="ClarkdownCode"/>
@@ -6507,24 +7860,48 @@
         </w:rPr>
         <w:t>TreeExplainer</w:t>
       </w:r>
+      <w:proofErr w:type="spellEnd"/>
       <w:r>
         <w:rPr>
           <w:lang w:val="es-GT"/>
         </w:rPr>
         <w:t xml:space="preserve"> sobre el </w:t>
       </w:r>
-      <w:r>
-        <w:rPr>
-          <w:b/>
-          <w:lang w:val="es-GT"/>
-        </w:rPr>
-        <w:t>holdout 2024 completo</w:t>
-      </w:r>
-      <w:r>
-        <w:rPr>
-          <w:lang w:val="es-GT"/>
-        </w:rPr>
-        <w:t xml:space="preserve"> (11,272 casos). El gráfico (Figura 5.1) ordena cada columna por el valor absoluto medio de su SHAP value; las de mayor impacto son </w:t>
+      <w:proofErr w:type="spellStart"/>
+      <w:r>
+        <w:rPr>
+          <w:b/>
+          <w:lang w:val="es-GT"/>
+        </w:rPr>
+        <w:t>holdout</w:t>
+      </w:r>
+      <w:proofErr w:type="spellEnd"/>
+      <w:r>
+        <w:rPr>
+          <w:b/>
+          <w:lang w:val="es-GT"/>
+        </w:rPr>
+        <w:t xml:space="preserve"> 2024 completo</w:t>
+      </w:r>
+      <w:r>
+        <w:rPr>
+          <w:lang w:val="es-GT"/>
+        </w:rPr>
+        <w:t xml:space="preserve"> (11,272 casos). El gráfico (Figura 5.1) ordena cada columna por el valor absoluto medio de su SHAP </w:t>
+      </w:r>
+      <w:proofErr w:type="spellStart"/>
+      <w:r>
+        <w:rPr>
+          <w:lang w:val="es-GT"/>
+        </w:rPr>
+        <w:t>value</w:t>
+      </w:r>
+      <w:proofErr w:type="spellEnd"/>
+      <w:r>
+        <w:rPr>
+          <w:lang w:val="es-GT"/>
+        </w:rPr>
+        <w:t xml:space="preserve">; las de mayor impacto son </w:t>
       </w:r>
       <w:r>
         <w:rPr>
@@ -6617,6 +7994,7 @@
         </w:rPr>
         <w:t>, la codificación cíclica de la hora (</w:t>
       </w:r>
+      <w:proofErr w:type="spellStart"/>
       <w:r>
         <w:rPr>
           <w:rStyle w:val="ClarkdownCode"/>
@@ -6624,6 +8002,7 @@
         </w:rPr>
         <w:t>hora_cos</w:t>
       </w:r>
+      <w:proofErr w:type="spellEnd"/>
       <w:r>
         <w:rPr>
           <w:lang w:val="es-GT"/>
@@ -6641,7 +8020,21 @@
         <w:rPr>
           <w:lang w:val="es-GT"/>
         </w:rPr>
-        <w:t>. Ninguna de las dos variables de feriado/temporada alta aparece entre las 15 más influyentes — coherente con su V de Cramér casi nula (Capítulo 3.3) y con que no movieron ninguna métrica (Capítulo 4.3).</w:t>
+        <w:t xml:space="preserve">. Ninguna de las dos variables de feriado/temporada alta aparece entre las 15 más influyentes — coherente con su V de </w:t>
+      </w:r>
+      <w:proofErr w:type="spellStart"/>
+      <w:r>
+        <w:rPr>
+          <w:lang w:val="es-GT"/>
+        </w:rPr>
+        <w:t>Cramér</w:t>
+      </w:r>
+      <w:proofErr w:type="spellEnd"/>
+      <w:r>
+        <w:rPr>
+          <w:lang w:val="es-GT"/>
+        </w:rPr>
+        <w:t xml:space="preserve"> casi nula (Capítulo 3.3) y con que no movieron ninguna métrica (Capítulo 4.3).</w:t>
       </w:r>
     </w:p>
     <w:p>
@@ -6873,7 +8266,14 @@
           <w:b/>
           <w:lang w:val="es-GT"/>
         </w:rPr>
-        <w:t>Aseguradora — suscripción y tarificación (exploratorio): que el tipo de evento y el departamento pesen más que el tipo de vehículo es un punto de partida razonable para explorar tarificación por zona geográfica y tipo de cobertura, en línea con la brecha de mercado del Capítulo 1.2 — sujeto a que cada aseguradora lo valide sobre su propia cartera.</w:t>
+        <w:t xml:space="preserve">Aseguradora — suscripción y tarificación (exploratorio): </w:t>
+      </w:r>
+      <w:r>
+        <w:rPr>
+          <w:bCs/>
+          <w:lang w:val="es-GT"/>
+        </w:rPr>
+        <w:t>que el tipo de evento y el departamento pesen más que el tipo de vehículo es un punto de partida razonable para explorar tarificación por zona geográfica y tipo de cobertura, en línea con la brecha de mercado del Capítulo 1.2 — sujeto a que cada aseguradora lo valide sobre su propia cartera.</w:t>
       </w:r>
     </w:p>
     <w:p>
@@ -6893,7 +8293,23 @@
           <w:lang w:val="es-GT"/>
         </w:rPr>
         <w:lastRenderedPageBreak/>
-        <w:t>Aseguradora — triage de siniestros:</w:t>
+        <w:t xml:space="preserve">Aseguradora — </w:t>
+      </w:r>
+      <w:proofErr w:type="spellStart"/>
+      <w:r>
+        <w:rPr>
+          <w:b/>
+          <w:lang w:val="es-GT"/>
+        </w:rPr>
+        <w:t>triage</w:t>
+      </w:r>
+      <w:proofErr w:type="spellEnd"/>
+      <w:r>
+        <w:rPr>
+          <w:b/>
+          <w:lang w:val="es-GT"/>
+        </w:rPr>
+        <w:t xml:space="preserve"> de siniestros:</w:t>
       </w:r>
       <w:r>
         <w:rPr>
@@ -6954,10 +8370,18 @@
           <w:lang w:val="es-GT"/>
         </w:rPr>
         <w:lastRenderedPageBreak/>
-        <w:t>Capítulo 6: Productivización</w:t>
+        <w:t xml:space="preserve">Capítulo 6: </w:t>
+      </w:r>
+      <w:proofErr w:type="spellStart"/>
+      <w:r>
+        <w:rPr>
+          <w:lang w:val="es-GT"/>
+        </w:rPr>
+        <w:t>Productivización</w:t>
       </w:r>
       <w:bookmarkEnd w:id="49"/>
       <w:bookmarkEnd w:id="50"/>
+      <w:proofErr w:type="spellEnd"/>
     </w:p>
     <w:p>
       <w:pPr>
@@ -6993,7 +8417,119 @@
         <w:rPr>
           <w:lang w:val="es-GT"/>
         </w:rPr>
-        <w:t xml:space="preserve"> Ambas aplicaciones están desplegadas en Streamlit Community Cloud y son accesibles sin instalar nada: el simulador en tfm-siniestros-viales-guatemala-estimador.streamlit.app y el prototipo de captura en tfm-siniestros-viales-guatemala-reporte.streamlit.app. Corren en contenedores gratuitos que se suspenden tras un periodo de inactividad, por lo que la primera carga puede tardar cerca de un minuto en reactivarse.</w:t>
+        <w:t xml:space="preserve"> Ambas aplicaciones están desplegadas en </w:t>
+      </w:r>
+      <w:proofErr w:type="spellStart"/>
+      <w:r>
+        <w:rPr>
+          <w:lang w:val="es-GT"/>
+        </w:rPr>
+        <w:t>Streamlit</w:t>
+      </w:r>
+      <w:proofErr w:type="spellEnd"/>
+      <w:r>
+        <w:rPr>
+          <w:lang w:val="es-GT"/>
+        </w:rPr>
+        <w:t xml:space="preserve"> </w:t>
+      </w:r>
+      <w:proofErr w:type="spellStart"/>
+      <w:r>
+        <w:rPr>
+          <w:lang w:val="es-GT"/>
+        </w:rPr>
+        <w:t>Community</w:t>
+      </w:r>
+      <w:proofErr w:type="spellEnd"/>
+      <w:r>
+        <w:rPr>
+          <w:lang w:val="es-GT"/>
+        </w:rPr>
+        <w:t xml:space="preserve"> Cloud y son accesibles sin instalar nada: el simulador en </w:t>
+      </w:r>
+      <w:proofErr w:type="spellStart"/>
+      <w:r>
+        <w:rPr>
+          <w:lang w:val="es-GT"/>
+        </w:rPr>
+        <w:t>tfm</w:t>
+      </w:r>
+      <w:proofErr w:type="spellEnd"/>
+      <w:r>
+        <w:rPr>
+          <w:lang w:val="es-GT"/>
+        </w:rPr>
+        <w:t>-siniestros-viales-</w:t>
+      </w:r>
+      <w:proofErr w:type="spellStart"/>
+      <w:r>
+        <w:rPr>
+          <w:lang w:val="es-GT"/>
+        </w:rPr>
+        <w:t>guatemala</w:t>
+      </w:r>
+      <w:proofErr w:type="spellEnd"/>
+      <w:r>
+        <w:rPr>
+          <w:lang w:val="es-GT"/>
+        </w:rPr>
+        <w:t>-</w:t>
+      </w:r>
+      <w:proofErr w:type="spellStart"/>
+      <w:r>
+        <w:rPr>
+          <w:lang w:val="es-GT"/>
+        </w:rPr>
+        <w:t>estimador.streamlit.app</w:t>
+      </w:r>
+      <w:proofErr w:type="spellEnd"/>
+      <w:r>
+        <w:rPr>
+          <w:lang w:val="es-GT"/>
+        </w:rPr>
+        <w:t xml:space="preserve"> y el prototipo de captura en </w:t>
+      </w:r>
+      <w:proofErr w:type="spellStart"/>
+      <w:r>
+        <w:rPr>
+          <w:lang w:val="es-GT"/>
+        </w:rPr>
+        <w:t>tfm</w:t>
+      </w:r>
+      <w:proofErr w:type="spellEnd"/>
+      <w:r>
+        <w:rPr>
+          <w:lang w:val="es-GT"/>
+        </w:rPr>
+        <w:t>-siniestros-viales-</w:t>
+      </w:r>
+      <w:proofErr w:type="spellStart"/>
+      <w:r>
+        <w:rPr>
+          <w:lang w:val="es-GT"/>
+        </w:rPr>
+        <w:t>guatemala</w:t>
+      </w:r>
+      <w:proofErr w:type="spellEnd"/>
+      <w:r>
+        <w:rPr>
+          <w:lang w:val="es-GT"/>
+        </w:rPr>
+        <w:t>-</w:t>
+      </w:r>
+      <w:proofErr w:type="spellStart"/>
+      <w:r>
+        <w:rPr>
+          <w:lang w:val="es-GT"/>
+        </w:rPr>
+        <w:t>reporte.streamlit.app</w:t>
+      </w:r>
+      <w:proofErr w:type="spellEnd"/>
+      <w:r>
+        <w:rPr>
+          <w:lang w:val="es-GT"/>
+        </w:rPr>
+        <w:t>. Corren en contenedores gratuitos que se suspenden tras un periodo de inactividad, por lo que la primera carga puede tardar cerca de un minuto en reactivarse.</w:t>
       </w:r>
     </w:p>
     <w:p>
@@ -7055,7 +8591,14 @@
           <w:b/>
           <w:lang w:val="es-GT"/>
         </w:rPr>
-        <w:t>Exclusión deliberada de "Ignorado": sexo, tipo de vehículo, tipo de evento y marca traen en los datos del INE una categoría "Ignorado" para el dato faltante en campo. El modelo la sigue manejando si aparece, pero se excluyó del simulador: no tiene sentido construir a propósito un escenario con una variable desconocida.</w:t>
+        <w:t xml:space="preserve">Exclusión deliberada de "Ignorado": </w:t>
+      </w:r>
+      <w:r>
+        <w:rPr>
+          <w:bCs/>
+          <w:lang w:val="es-GT"/>
+        </w:rPr>
+        <w:t>sexo, tipo de vehículo, tipo de evento y marca traen en los datos del INE una categoría "Ignorado" para el dato faltante en campo. El modelo la sigue manejando si aparece, pero se excluyó del simulador: no tiene sentido construir a propósito un escenario con una variable desconocida.</w:t>
       </w:r>
     </w:p>
     <w:p>
@@ -7066,28 +8609,50 @@
           <w:numId w:val="12"/>
         </w:numPr>
         <w:rPr>
-          <w:lang w:val="es-GT"/>
-        </w:rPr>
-      </w:pPr>
-      <w:r>
-        <w:rPr>
-          <w:b/>
-          <w:lang w:val="es-GT"/>
-        </w:rPr>
-        <w:t>Score de severidad y banda de riesgo: probabilidad de fatalidad agrupada en tres niveles (Bajo &lt;20%, Moderado 20–50%, Alto &gt;50%). Los cortes no son convencionales: el 20% coincide con la tasa base del periodo (19.1%), de modo que "Bajo" significa riesgo por debajo del promedio histórico, y el 50% marca el punto en que el desenlace fatal pasa a ser más probable que el no fatal. Junto al score se muestran las métricas reales del modelo, leídas del archivo que genera el propio notebook.</w:t>
-      </w:r>
-    </w:p>
-    <w:p>
-      <w:pPr>
-        <w:rPr>
-          <w:lang w:val="es-GT"/>
-        </w:rPr>
-      </w:pPr>
-      <w:r>
-        <w:rPr>
-          <w:lang w:val="es-GT"/>
-        </w:rPr>
-        <w:t>Ambas aplicaciones comparten un único módulo de scoring (scoring_tfm.py) que reproduce la ingeniería de características del Capítulo 3.3 y lee del propio artefacto la lista de columnas que el modelo espera. La centralización es deliberada: replicar esa transformación en cada app hace que, al incorporar una variable nueva, las copias se desincronicen en silencio.</w:t>
+          <w:bCs/>
+          <w:lang w:val="es-GT"/>
+        </w:rPr>
+      </w:pPr>
+      <w:r>
+        <w:rPr>
+          <w:b/>
+          <w:lang w:val="es-GT"/>
+        </w:rPr>
+        <w:t xml:space="preserve">Score de severidad y banda de riesgo: </w:t>
+      </w:r>
+      <w:r>
+        <w:rPr>
+          <w:bCs/>
+          <w:lang w:val="es-GT"/>
+        </w:rPr>
+        <w:t>probabilidad de fatalidad agrupada en tres niveles (Bajo &lt;20%, Moderado 20–50%, Alto &gt;50%). Los cortes no son convencionales: el 20% coincide con la tasa base del periodo (19.1%), de modo que "Bajo" significa riesgo por debajo del promedio histórico, y el 50% marca el punto en que el desenlace fatal pasa a ser más probable que el no fatal. Junto al score se muestran las métricas reales del modelo, leídas del archivo que genera el propio notebook.</w:t>
+      </w:r>
+    </w:p>
+    <w:p>
+      <w:pPr>
+        <w:rPr>
+          <w:lang w:val="es-GT"/>
+        </w:rPr>
+      </w:pPr>
+      <w:r>
+        <w:rPr>
+          <w:lang w:val="es-GT"/>
+        </w:rPr>
+        <w:t xml:space="preserve">Ambas aplicaciones comparten un único módulo de scoring (scoring_tfm.py) que reproduce la ingeniería de características del Capítulo 3.3 y lee del propio artefacto la lista de columnas que el modelo espera. La centralización es deliberada: replicar esa transformación en cada </w:t>
+      </w:r>
+      <w:proofErr w:type="gramStart"/>
+      <w:r>
+        <w:rPr>
+          <w:lang w:val="es-GT"/>
+        </w:rPr>
+        <w:t>app</w:t>
+      </w:r>
+      <w:proofErr w:type="gramEnd"/>
+      <w:r>
+        <w:rPr>
+          <w:lang w:val="es-GT"/>
+        </w:rPr>
+        <w:t xml:space="preserve"> hace que, al incorporar una variable nueva, las copias se desincronicen en silencio.</w:t>
       </w:r>
     </w:p>
     <w:p>
@@ -7235,7 +8800,14 @@
           <w:b/>
           <w:lang w:val="es-GT"/>
         </w:rPr>
-        <w:t>Su segunda función es la más relevante: sirve de maqueta de captura validada. El Capítulo 2.3 documentó defectos concretos —hora = 99, edad = 999, un registro con anio = 3, el 31.2% sin día de la semana— típicos de una captura con poca validación. El prototipo muestra cómo se evitan: listas cerradas en lugar de texto libre, ubicación y hora tomadas del dispositivo, y la categoría "Ignorado" excluida por diseño. Recoge además las seis variables de la capa 1 del Capítulo 7.4, intercaladas en la sección que por contenido les corresponde y señaladas una a una: el modelo actual no las usa, y la interfaz lo advierte. Ese principio de captura validada aplica igual — o más — al registro policial que origina la fuente oficial, cuyo instrumento en campo no está documentado públicamente (Capítulo 7.4).</w:t>
+        <w:t xml:space="preserve">Su segunda función es la más relevante: </w:t>
+      </w:r>
+      <w:r>
+        <w:rPr>
+          <w:bCs/>
+          <w:lang w:val="es-GT"/>
+        </w:rPr>
+        <w:t>sirve de maqueta de captura validada. El Capítulo 2.3 documentó defectos concretos —hora = 99, edad = 999, un registro con anio = 3, el 31.2% sin día de la semana— típicos de una captura con poca validación. El prototipo muestra cómo se evitan: listas cerradas en lugar de texto libre, ubicación y hora tomadas del dispositivo, y la categoría "Ignorado" excluida por diseño. Recoge además las seis variables de la capa 1 del Capítulo 7.4, intercaladas en la sección que por contenido les corresponde y señaladas una a una: el modelo actual no las usa, y la interfaz lo advierte. Ese principio de captura validada aplica igual — o más — al registro policial que origina la fuente oficial, cuyo instrumento en campo no está documentado públicamente (Capítulo 7.4).</w:t>
       </w:r>
     </w:p>
     <w:tbl>
@@ -7295,7 +8867,21 @@
         <w:rPr>
           <w:lang w:val="es-GT"/>
         </w:rPr>
-        <w:t>6.4. Automatización de la actualización de datos y reentrenamiento (Model Monitoring)</w:t>
+        <w:t xml:space="preserve">6.4. Automatización de la actualización de datos y reentrenamiento (Model </w:t>
+      </w:r>
+      <w:proofErr w:type="spellStart"/>
+      <w:r>
+        <w:rPr>
+          <w:lang w:val="es-GT"/>
+        </w:rPr>
+        <w:t>Monitoring</w:t>
+      </w:r>
+      <w:proofErr w:type="spellEnd"/>
+      <w:r>
+        <w:rPr>
+          <w:lang w:val="es-GT"/>
+        </w:rPr>
+        <w:t>)</w:t>
       </w:r>
       <w:bookmarkEnd w:id="57"/>
       <w:bookmarkEnd w:id="58"/>
@@ -7317,8 +8903,17 @@
           <w:i/>
           <w:lang w:val="es-GT"/>
         </w:rPr>
-        <w:t>Model Monitoring</w:t>
-      </w:r>
+        <w:t xml:space="preserve">Model </w:t>
+      </w:r>
+      <w:proofErr w:type="spellStart"/>
+      <w:r>
+        <w:rPr>
+          <w:i/>
+          <w:lang w:val="es-GT"/>
+        </w:rPr>
+        <w:t>Monitoring</w:t>
+      </w:r>
+      <w:proofErr w:type="spellEnd"/>
       <w:r>
         <w:rPr>
           <w:lang w:val="es-GT"/>
@@ -7349,7 +8944,35 @@
         <w:rPr>
           <w:lang w:val="es-GT"/>
         </w:rPr>
-        <w:t xml:space="preserve"> autodescubre los recursos vigentes del portal de datos abiertos del INE a través de su API pública de CKAN y descarga los archivos anuales que falten, con un conjunto de URLs de respaldo por si esa API no responde. Elimina la dependencia de que alguien descargue y coloque manualmente los </w:t>
+        <w:t xml:space="preserve"> </w:t>
+      </w:r>
+      <w:proofErr w:type="spellStart"/>
+      <w:r>
+        <w:rPr>
+          <w:lang w:val="es-GT"/>
+        </w:rPr>
+        <w:t>autodescubre</w:t>
+      </w:r>
+      <w:proofErr w:type="spellEnd"/>
+      <w:r>
+        <w:rPr>
+          <w:lang w:val="es-GT"/>
+        </w:rPr>
+        <w:t xml:space="preserve"> los recursos vigentes del portal de datos abiertos del INE a través de su API pública de CKAN y descarga los archivos anuales que falten, con un conjunto de </w:t>
+      </w:r>
+      <w:proofErr w:type="spellStart"/>
+      <w:r>
+        <w:rPr>
+          <w:lang w:val="es-GT"/>
+        </w:rPr>
+        <w:t>URLs</w:t>
+      </w:r>
+      <w:proofErr w:type="spellEnd"/>
+      <w:r>
+        <w:rPr>
+          <w:lang w:val="es-GT"/>
+        </w:rPr>
+        <w:t xml:space="preserve"> de respaldo por si esa API no responde. Elimina la dependencia de que alguien descargue y coloque manualmente los </w:t>
       </w:r>
       <w:r>
         <w:rPr>
@@ -7379,7 +9002,7 @@
           <w:b/>
           <w:lang w:val="es-GT"/>
         </w:rPr>
-        <w:t xml:space="preserve">reentrenar_modelo.py orquesta el ciclo completo: descarga los datos, respalda el modelo desplegado, reentrena el notebook de punta a punta y compara el ROC-AUC del modelo nuevo contra el anterior sobre su propio holdout. El modelo nuevo solo reemplaza al desplegado si se aprueba explícitamente (--promover) y su ROC-AUC no empeora más allá de una tolerancia configurable: para un modelo que informa </w:t>
+        <w:t>reentrenar_modelo.py</w:t>
       </w:r>
       <w:r>
         <w:rPr>
@@ -7387,8 +9010,53 @@
           <w:b/>
           <w:lang w:val="es-GT"/>
         </w:rPr>
-        <w:lastRenderedPageBreak/>
-        <w:t>decisiones de seguridad vial se prioriza que una persona confirme cada actualización. Cada corrida queda registrada en un log.</w:t>
+        <w:t>:</w:t>
+      </w:r>
+      <w:r>
+        <w:rPr>
+          <w:rStyle w:val="ClarkdownCode"/>
+          <w:b/>
+          <w:lang w:val="es-GT"/>
+        </w:rPr>
+        <w:t xml:space="preserve"> </w:t>
+      </w:r>
+      <w:r>
+        <w:rPr>
+          <w:rStyle w:val="ClarkdownCode"/>
+          <w:rFonts w:ascii="Arial" w:hAnsi="Arial"/>
+          <w:bCs/>
+          <w:sz w:val="22"/>
+          <w:szCs w:val="24"/>
+          <w:shd w:val="clear" w:color="auto" w:fill="auto"/>
+          <w:lang w:val="es-GT"/>
+        </w:rPr>
+        <w:t xml:space="preserve">orquesta el ciclo completo: descarga los datos, respalda el modelo desplegado, reentrena el notebook de punta a punta y compara el ROC-AUC del modelo nuevo contra el anterior sobre su propio </w:t>
+      </w:r>
+      <w:proofErr w:type="spellStart"/>
+      <w:r>
+        <w:rPr>
+          <w:rStyle w:val="ClarkdownCode"/>
+          <w:rFonts w:ascii="Arial" w:hAnsi="Arial"/>
+          <w:bCs/>
+          <w:sz w:val="22"/>
+          <w:szCs w:val="24"/>
+          <w:shd w:val="clear" w:color="auto" w:fill="auto"/>
+          <w:lang w:val="es-GT"/>
+        </w:rPr>
+        <w:t>holdout</w:t>
+      </w:r>
+      <w:proofErr w:type="spellEnd"/>
+      <w:r>
+        <w:rPr>
+          <w:rStyle w:val="ClarkdownCode"/>
+          <w:rFonts w:ascii="Arial" w:hAnsi="Arial"/>
+          <w:bCs/>
+          <w:sz w:val="22"/>
+          <w:szCs w:val="24"/>
+          <w:shd w:val="clear" w:color="auto" w:fill="auto"/>
+          <w:lang w:val="es-GT"/>
+        </w:rPr>
+        <w:t>. El modelo nuevo solo reemplaza al desplegado si se aprueba explícitamente (--promover) y su ROC-AUC no empeora más allá de una tolerancia configurable: para un modelo que informa decisiones de seguridad vial se prioriza que una persona confirme cada actualización. Cada corrida queda registrada en un log.</w:t>
       </w:r>
     </w:p>
     <w:tbl>
@@ -7460,7 +9128,21 @@
                   <w:rPr>
                     <w:lang w:val="es-GT"/>
                   </w:rPr>
-                  <w:t xml:space="preserve"> (hash SHA-256), y la vía de autodescubrimiento por API funcionó sin recurrir a las URLs de respaldo. El pipeline queda así reproducible de punta a punta desde la fuente oficial.</w:t>
+                  <w:t xml:space="preserve"> (hash SHA-256), y la vía de autodescubrimiento por API funcionó sin recurrir a las </w:t>
+                </w:r>
+                <w:proofErr w:type="spellStart"/>
+                <w:r>
+                  <w:rPr>
+                    <w:lang w:val="es-GT"/>
+                  </w:rPr>
+                  <w:t>URLs</w:t>
+                </w:r>
+                <w:proofErr w:type="spellEnd"/>
+                <w:r>
+                  <w:rPr>
+                    <w:lang w:val="es-GT"/>
+                  </w:rPr>
+                  <w:t xml:space="preserve"> de respaldo. El pipeline queda así reproducible de punta a punta desde la fuente oficial.</w:t>
                 </w:r>
               </w:p>
             </w:sdtContent>
@@ -7552,7 +9234,35 @@
         <w:rPr>
           <w:lang w:val="es-GT"/>
         </w:rPr>
-        <w:t xml:space="preserve"> casos que terminaron en fallecimiento sobre un año completo que nunca vio durante su entrenamiento — 2024 —, sin necesidad de recolectar ninguna variable nueva. En términos técnicos: Recall 67.8% y ROC-AUC 0.740, un rango que en scoring de riesgo sobre datos administrativos se considera operacionalmente útil.</w:t>
+        <w:t xml:space="preserve"> casos que terminaron en fallecimiento sobre un año completo que nunca vio durante su entrenamiento — 2024 —, sin necesidad de recolectar ninguna variable nueva. En términos técnicos: </w:t>
+      </w:r>
+      <w:proofErr w:type="spellStart"/>
+      <w:r>
+        <w:rPr>
+          <w:lang w:val="es-GT"/>
+        </w:rPr>
+        <w:t>Recall</w:t>
+      </w:r>
+      <w:proofErr w:type="spellEnd"/>
+      <w:r>
+        <w:rPr>
+          <w:lang w:val="es-GT"/>
+        </w:rPr>
+        <w:t xml:space="preserve"> 67.8% y ROC-AUC 0.740, un rango que en </w:t>
+      </w:r>
+      <w:proofErr w:type="spellStart"/>
+      <w:r>
+        <w:rPr>
+          <w:lang w:val="es-GT"/>
+        </w:rPr>
+        <w:t>scoring</w:t>
+      </w:r>
+      <w:proofErr w:type="spellEnd"/>
+      <w:r>
+        <w:rPr>
+          <w:lang w:val="es-GT"/>
+        </w:rPr>
+        <w:t xml:space="preserve"> de riesgo sobre datos administrativos se considera operacionalmente útil.</w:t>
       </w:r>
     </w:p>
     <w:p>
@@ -7577,7 +9287,21 @@
         <w:rPr>
           <w:lang w:val="es-GT"/>
         </w:rPr>
-        <w:t xml:space="preserve"> El departamento de Guatemala concentra el mayor volumen del país pero registra la tasa de fatalidad </w:t>
+        <w:t xml:space="preserve"> El departamento de Guatemala concentra el mayor volumen del </w:t>
+      </w:r>
+      <w:proofErr w:type="gramStart"/>
+      <w:r>
+        <w:rPr>
+          <w:lang w:val="es-GT"/>
+        </w:rPr>
+        <w:t>país</w:t>
+      </w:r>
+      <w:proofErr w:type="gramEnd"/>
+      <w:r>
+        <w:rPr>
+          <w:lang w:val="es-GT"/>
+        </w:rPr>
+        <w:t xml:space="preserve"> pero registra la tasa de fatalidad </w:t>
       </w:r>
       <w:r>
         <w:rPr>
@@ -7653,7 +9377,49 @@
         <w:rPr>
           <w:lang w:val="es-GT"/>
         </w:rPr>
-        <w:t xml:space="preserve"> Cinco verificaciones independientes —dos búsquedas de hiperparámetros, una búsqueda bayesiana con Optuna, un modelo reducido a 15 variables y el ensayo de dos variables nuevas— confirmaron que el desempeño actual está en el techo alcanzable con la información disponible: ninguna lo superó de forma apreciable, y las tres librerías de boosting evaluadas quedaron dentro de tres milésimas entre sí. El margen real de mejora está en capturar variables que hoy no se registran (Capítulo 7.4).</w:t>
+        <w:t xml:space="preserve"> Cinco verificaciones independientes —dos búsquedas de </w:t>
+      </w:r>
+      <w:proofErr w:type="spellStart"/>
+      <w:r>
+        <w:rPr>
+          <w:lang w:val="es-GT"/>
+        </w:rPr>
+        <w:t>hiperparámetros</w:t>
+      </w:r>
+      <w:proofErr w:type="spellEnd"/>
+      <w:r>
+        <w:rPr>
+          <w:lang w:val="es-GT"/>
+        </w:rPr>
+        <w:t xml:space="preserve">, una búsqueda bayesiana con </w:t>
+      </w:r>
+      <w:proofErr w:type="spellStart"/>
+      <w:r>
+        <w:rPr>
+          <w:lang w:val="es-GT"/>
+        </w:rPr>
+        <w:t>Optuna</w:t>
+      </w:r>
+      <w:proofErr w:type="spellEnd"/>
+      <w:r>
+        <w:rPr>
+          <w:lang w:val="es-GT"/>
+        </w:rPr>
+        <w:t xml:space="preserve">, un modelo reducido a 15 variables y el ensayo de dos variables nuevas— confirmaron que el desempeño actual está en el techo alcanzable con la información disponible: ninguna lo superó de forma apreciable, y las tres librerías de </w:t>
+      </w:r>
+      <w:proofErr w:type="spellStart"/>
+      <w:r>
+        <w:rPr>
+          <w:lang w:val="es-GT"/>
+        </w:rPr>
+        <w:t>boosting</w:t>
+      </w:r>
+      <w:proofErr w:type="spellEnd"/>
+      <w:r>
+        <w:rPr>
+          <w:lang w:val="es-GT"/>
+        </w:rPr>
+        <w:t xml:space="preserve"> evaluadas quedaron dentro de tres milésimas entre sí. El margen real de mejora está en capturar variables que hoy no se registran (Capítulo 7.4).</w:t>
       </w:r>
     </w:p>
     <w:p>
@@ -7688,10 +9454,15 @@
       <w:bookmarkStart w:id="63" w:name="_72_limitaciones"/>
       <w:bookmarkStart w:id="64" w:name="_Toc240103752"/>
       <w:r>
-        <w:t>7.2. Limitaciones</w:t>
+        <w:t xml:space="preserve">7.2. </w:t>
+      </w:r>
+      <w:proofErr w:type="spellStart"/>
+      <w:r>
+        <w:t>Limitaciones</w:t>
       </w:r>
       <w:bookmarkEnd w:id="63"/>
       <w:bookmarkEnd w:id="64"/>
+      <w:proofErr w:type="spellEnd"/>
     </w:p>
     <w:p>
       <w:pPr>
@@ -7715,14 +9486,98 @@
         <w:rPr>
           <w:lang w:val="es-GT"/>
         </w:rPr>
-        <w:t xml:space="preserve"> el dataset del INE/PNC es de naturaleza administrativa y no incluye variables de causalidad directa documentadas en la literatura de seguridad vial — </w:t>
+        <w:t xml:space="preserve"> el </w:t>
+      </w:r>
+      <w:proofErr w:type="spellStart"/>
+      <w:r>
+        <w:rPr>
+          <w:lang w:val="es-GT"/>
+        </w:rPr>
+        <w:t>dataset</w:t>
+      </w:r>
+      <w:proofErr w:type="spellEnd"/>
+      <w:r>
+        <w:rPr>
+          <w:lang w:val="es-GT"/>
+        </w:rPr>
+        <w:t xml:space="preserve"> del INE/PNC es de naturaleza administrativa y no incluye variables de causalidad directa documentadas en la literatura de seguridad vial — velocidad real, consumo de alcohol, condición climática o estado de la infraestructura. Los valores de asociación (V de </w:t>
+      </w:r>
+      <w:proofErr w:type="spellStart"/>
+      <w:r>
+        <w:rPr>
+          <w:lang w:val="es-GT"/>
+        </w:rPr>
+        <w:t>Cramér</w:t>
+      </w:r>
+      <w:proofErr w:type="spellEnd"/>
+      <w:r>
+        <w:rPr>
+          <w:lang w:val="es-GT"/>
+        </w:rPr>
+        <w:t xml:space="preserve">) obtenidos en el Capítulo 3, todos en el rango </w:t>
       </w:r>
       <w:r>
         <w:rPr>
           <w:lang w:val="es-GT"/>
         </w:rPr>
         <w:lastRenderedPageBreak/>
-        <w:t>velocidad real, consumo de alcohol, condición climática o estado de la infraestructura. Los valores de asociación (V de Cramér) obtenidos en el Capítulo 3, todos en el rango pequeño-moderado, son coherentes con esta ausencia: el techo de desempeño del modelo está condicionado por la información disponible, no por la técnica empleada — de hecho, tres implementaciones distintas de boosting (HistGradientBoosting, XGBoost, LightGBM) convergen al mismo techo (Capítulo 4.4), lo que refuerza esta conclusión.</w:t>
+        <w:t xml:space="preserve">pequeño-moderado, son coherentes con esta ausencia: el techo de desempeño del modelo está condicionado por la información disponible, no por la técnica empleada — de hecho, tres implementaciones distintas de </w:t>
+      </w:r>
+      <w:proofErr w:type="spellStart"/>
+      <w:r>
+        <w:rPr>
+          <w:lang w:val="es-GT"/>
+        </w:rPr>
+        <w:t>boosting</w:t>
+      </w:r>
+      <w:proofErr w:type="spellEnd"/>
+      <w:r>
+        <w:rPr>
+          <w:lang w:val="es-GT"/>
+        </w:rPr>
+        <w:t xml:space="preserve"> (</w:t>
+      </w:r>
+      <w:proofErr w:type="spellStart"/>
+      <w:r>
+        <w:rPr>
+          <w:lang w:val="es-GT"/>
+        </w:rPr>
+        <w:t>HistGradientBoosting</w:t>
+      </w:r>
+      <w:proofErr w:type="spellEnd"/>
+      <w:r>
+        <w:rPr>
+          <w:lang w:val="es-GT"/>
+        </w:rPr>
+        <w:t xml:space="preserve">, </w:t>
+      </w:r>
+      <w:proofErr w:type="spellStart"/>
+      <w:r>
+        <w:rPr>
+          <w:lang w:val="es-GT"/>
+        </w:rPr>
+        <w:t>XGBoost</w:t>
+      </w:r>
+      <w:proofErr w:type="spellEnd"/>
+      <w:r>
+        <w:rPr>
+          <w:lang w:val="es-GT"/>
+        </w:rPr>
+        <w:t xml:space="preserve">, </w:t>
+      </w:r>
+      <w:proofErr w:type="spellStart"/>
+      <w:r>
+        <w:rPr>
+          <w:lang w:val="es-GT"/>
+        </w:rPr>
+        <w:t>LightGBM</w:t>
+      </w:r>
+      <w:proofErr w:type="spellEnd"/>
+      <w:r>
+        <w:rPr>
+          <w:lang w:val="es-GT"/>
+        </w:rPr>
+        <w:t>) convergen al mismo techo (Capítulo 4.4), lo que refuerza esta conclusión.</w:t>
       </w:r>
     </w:p>
     <w:p>
@@ -7785,7 +9640,21 @@
         <w:rPr>
           <w:lang w:val="es-GT"/>
         </w:rPr>
-        <w:t xml:space="preserve"> mantenga su plataforma CKAN y una API pública compatible; un cambio de plataforma requeriría actualizar a mano las URLs de respaldo del script </w:t>
+        <w:t xml:space="preserve"> mantenga su plataforma CKAN y una API pública compatible; un cambio de plataforma requeriría actualizar a mano las </w:t>
+      </w:r>
+      <w:proofErr w:type="spellStart"/>
+      <w:r>
+        <w:rPr>
+          <w:lang w:val="es-GT"/>
+        </w:rPr>
+        <w:t>URLs</w:t>
+      </w:r>
+      <w:proofErr w:type="spellEnd"/>
+      <w:r>
+        <w:rPr>
+          <w:lang w:val="es-GT"/>
+        </w:rPr>
+        <w:t xml:space="preserve"> de respaldo del script </w:t>
       </w:r>
       <w:r>
         <w:rPr>
@@ -7833,10 +9702,23 @@
       <w:bookmarkStart w:id="65" w:name="_73_trabajo_futuro"/>
       <w:bookmarkStart w:id="66" w:name="_Toc240103753"/>
       <w:r>
-        <w:t>7.3. Trabajo futuro</w:t>
+        <w:t xml:space="preserve">7.3. </w:t>
+      </w:r>
+      <w:proofErr w:type="spellStart"/>
+      <w:r>
+        <w:t>Trabajo</w:t>
+      </w:r>
+      <w:proofErr w:type="spellEnd"/>
+      <w:r>
+        <w:t xml:space="preserve"> </w:t>
+      </w:r>
+      <w:proofErr w:type="spellStart"/>
+      <w:r>
+        <w:t>futuro</w:t>
       </w:r>
       <w:bookmarkEnd w:id="65"/>
       <w:bookmarkEnd w:id="66"/>
+      <w:proofErr w:type="spellEnd"/>
     </w:p>
     <w:p>
       <w:pPr>
@@ -8046,7 +9928,7 @@
           <w:bCs/>
           <w:lang w:val="es-GT"/>
         </w:rPr>
-        <w:t xml:space="preserve">La selección descansa en dos criterios. El externo: la nota descriptiva Road traffic injuries de la OMS (actualizada el 20 de julio de 2026) cuantifica los determinantes de severidad que estos microdatos no registran — el casco reduce el riesgo de muerte más de seis veces, el cinturón hasta un 50%, cada 1% de aumento en la velocidad media produce un 4% más de riesgo de siniestro mortal, y sobre la atención post-siniestro señala que "demoras de minutos pueden </w:t>
+        <w:t xml:space="preserve">La selección descansa en dos criterios. El externo: la nota descriptiva Road traffic injuries de la OMS (actualizada el 20 de julio de 2026) cuantifica los determinantes de severidad que estos microdatos no registran — el casco reduce el riesgo de muerte más de seis veces, el cinturón hasta un 50%, cada 1% de aumento en la velocidad media produce un 4% más de riesgo de siniestro mortal, y sobre la atención post-siniestro señala que "demoras de minutos pueden marcar la diferencia entre la vida y la muerte" (OMS, 2026). El interno: cada variable propuesta </w:t>
       </w:r>
       <w:r>
         <w:rPr>
@@ -8054,7 +9936,7 @@
           <w:lang w:val="es-GT"/>
         </w:rPr>
         <w:lastRenderedPageBreak/>
-        <w:t>marcar la diferencia entre la vida y la muerte" (OMS, 2026). El interno: cada variable propuesta responde a una hipótesis que este trabajo formuló y no pudo contrastar. Se agrupan según cómo se obtienen, porque eso determina su costo de recolección.</w:t>
+        <w:t>responde a una hipótesis que este trabajo formuló y no pudo contrastar. Se agrupan según cómo se obtienen, porque eso determina su costo de recolección.</w:t>
       </w:r>
     </w:p>
     <w:p>
@@ -8162,7 +10044,21 @@
         <w:rPr>
           <w:lang w:val="es-GT"/>
         </w:rPr>
-        <w:t xml:space="preserve"> El pico de fatalidad de las 4:00 (~30% frente a ~13% al mediodía) admite dos explicaciones que el dataset no separa —menor visibilidad y menor auxilio disponible—; esta variable aísla la primera.</w:t>
+        <w:t xml:space="preserve"> El pico de fatalidad de las 4:00 (~30% frente a ~13% al mediodía) admite dos explicaciones que el </w:t>
+      </w:r>
+      <w:proofErr w:type="spellStart"/>
+      <w:r>
+        <w:rPr>
+          <w:lang w:val="es-GT"/>
+        </w:rPr>
+        <w:t>dataset</w:t>
+      </w:r>
+      <w:proofErr w:type="spellEnd"/>
+      <w:r>
+        <w:rPr>
+          <w:lang w:val="es-GT"/>
+        </w:rPr>
+        <w:t xml:space="preserve"> no separa —menor visibilidad y menor auxilio disponible—; esta variable aísla la primera.</w:t>
       </w:r>
     </w:p>
     <w:p>
@@ -8448,29 +10344,44 @@
         <w:rPr>
           <w:lang w:val="es-GT"/>
         </w:rPr>
-        <w:t xml:space="preserve"> — se probaron aquí y su aporte fue nulo (V de Cramér 0.008 y 0.001).</w:t>
-      </w:r>
-    </w:p>
-    <w:p>
-      <w:pPr>
-        <w:rPr>
-          <w:lang w:val="es-GT"/>
-        </w:rPr>
-      </w:pPr>
-      <w:r>
-        <w:rPr>
-          <w:b/>
-          <w:lang w:val="es-GT"/>
-        </w:rPr>
-        <w:t xml:space="preserve">El proceso importa tanto como las variables. El manual de procesos del INE documenta la cadena actual: las comisarías trasladan los hechos al Departamento de Estadística de la </w:t>
-      </w:r>
-      <w:r>
-        <w:rPr>
-          <w:b/>
+        <w:t xml:space="preserve"> — se probaron aquí y su aporte fue nulo (V de </w:t>
+      </w:r>
+      <w:proofErr w:type="spellStart"/>
+      <w:r>
+        <w:rPr>
+          <w:lang w:val="es-GT"/>
+        </w:rPr>
+        <w:t>Cramér</w:t>
+      </w:r>
+      <w:proofErr w:type="spellEnd"/>
+      <w:r>
+        <w:rPr>
+          <w:lang w:val="es-GT"/>
+        </w:rPr>
+        <w:t xml:space="preserve"> 0.008 y 0.001).</w:t>
+      </w:r>
+    </w:p>
+    <w:p>
+      <w:pPr>
+        <w:rPr>
+          <w:bCs/>
+          <w:lang w:val="es-GT"/>
+        </w:rPr>
+      </w:pPr>
+      <w:r>
+        <w:rPr>
+          <w:bCs/>
+          <w:lang w:val="es-GT"/>
+        </w:rPr>
+        <w:t xml:space="preserve">El proceso importa tanto como las variables. El manual de procesos del INE documenta la cadena actual: las comisarías trasladan los hechos al Departamento de Estadística de la PNC, que remite la información mensualmente al INE en hojas de Excel por correo, donde se recodifica en SPSS </w:t>
+      </w:r>
+      <w:r>
+        <w:rPr>
+          <w:bCs/>
           <w:lang w:val="es-GT"/>
         </w:rPr>
         <w:lastRenderedPageBreak/>
-        <w:t>PNC, que remite la información mensualmente al INE en hojas de Excel por correo, donde se recodifica en SPSS antes de publicarse (INE, 2022). El instrumento de captura en el lugar del hecho no aparece documentado en las fuentes públicas consultadas. Esa cadena de validación mínima es consistente con los defectos del Capítulo 2.3 y apunta a tres mejoras: validar en el punto de captura, reducir la categoría "Ignorado" con mejor protocolo de levantamiento, e interoperar con INACIF y MSPAS para depurar el subregistro. Publicar en formatos abiertos y con menor rezago cierra la cadena.</w:t>
+        <w:t>antes de publicarse (INE, 2022). El instrumento de captura en el lugar del hecho no aparece documentado en las fuentes públicas consultadas. Esa cadena de validación mínima es consistente con los defectos del Capítulo 2.3 y apunta a tres mejoras: validar en el punto de captura, reducir la categoría "Ignorado" con mejor protocolo de levantamiento, e interoperar con INACIF y MSPAS para depurar el subregistro. Publicar en formatos abiertos y con menor rezago cierra la cadena.</w:t>
       </w:r>
     </w:p>
     <w:p>
@@ -8505,11 +10416,21 @@
       </w:pPr>
       <w:bookmarkStart w:id="69" w:name="referencias_bibliogrficas"/>
       <w:bookmarkStart w:id="70" w:name="_Toc240103755"/>
-      <w:r>
-        <w:t>Referencias Bibliográficas</w:t>
+      <w:proofErr w:type="spellStart"/>
+      <w:r>
+        <w:t>Referencias</w:t>
+      </w:r>
+      <w:proofErr w:type="spellEnd"/>
+      <w:r>
+        <w:t xml:space="preserve"> </w:t>
+      </w:r>
+      <w:proofErr w:type="spellStart"/>
+      <w:r>
+        <w:t>Bibliográficas</w:t>
       </w:r>
       <w:bookmarkEnd w:id="69"/>
       <w:bookmarkEnd w:id="70"/>
+      <w:proofErr w:type="spellEnd"/>
     </w:p>
     <w:p>
       <w:pPr>
@@ -8604,7 +10525,23 @@
           <w:i/>
           <w:lang w:val="es-GT"/>
         </w:rPr>
-        <w:t>Guía para el Trabajo Fin de Máster — Big Data, Data Science e IA (semipresencial).</w:t>
+        <w:t xml:space="preserve">Guía para el Trabajo Fin de Máster — Big Data, Data </w:t>
+      </w:r>
+      <w:proofErr w:type="spellStart"/>
+      <w:r>
+        <w:rPr>
+          <w:i/>
+          <w:lang w:val="es-GT"/>
+        </w:rPr>
+        <w:t>Science</w:t>
+      </w:r>
+      <w:proofErr w:type="spellEnd"/>
+      <w:r>
+        <w:rPr>
+          <w:i/>
+          <w:lang w:val="es-GT"/>
+        </w:rPr>
+        <w:t xml:space="preserve"> e IA (semipresencial).</w:t>
       </w:r>
     </w:p>
     <w:p>
@@ -8715,11 +10652,47 @@
           <w:numId w:val="23"/>
         </w:numPr>
       </w:pPr>
-      <w:r>
-        <w:rPr>
-          <w:lang w:val="es-GT"/>
-        </w:rPr>
-        <w:t xml:space="preserve">Grinsztajn, L., Oyallon, E., &amp; Varoquaux, G. (2022). </w:t>
+      <w:proofErr w:type="spellStart"/>
+      <w:r>
+        <w:rPr>
+          <w:lang w:val="es-GT"/>
+        </w:rPr>
+        <w:t>Grinsztajn</w:t>
+      </w:r>
+      <w:proofErr w:type="spellEnd"/>
+      <w:r>
+        <w:rPr>
+          <w:lang w:val="es-GT"/>
+        </w:rPr>
+        <w:t xml:space="preserve">, L., </w:t>
+      </w:r>
+      <w:proofErr w:type="spellStart"/>
+      <w:r>
+        <w:rPr>
+          <w:lang w:val="es-GT"/>
+        </w:rPr>
+        <w:t>Oyallon</w:t>
+      </w:r>
+      <w:proofErr w:type="spellEnd"/>
+      <w:r>
+        <w:rPr>
+          <w:lang w:val="es-GT"/>
+        </w:rPr>
+        <w:t xml:space="preserve">, E., &amp; </w:t>
+      </w:r>
+      <w:proofErr w:type="spellStart"/>
+      <w:r>
+        <w:rPr>
+          <w:lang w:val="es-GT"/>
+        </w:rPr>
+        <w:t>Varoquaux</w:t>
+      </w:r>
+      <w:proofErr w:type="spellEnd"/>
+      <w:r>
+        <w:rPr>
+          <w:lang w:val="es-GT"/>
+        </w:rPr>
+        <w:t xml:space="preserve">, G. (2022). </w:t>
       </w:r>
       <w:r>
         <w:rPr>
@@ -8780,7 +10753,21 @@
         <w:rPr>
           <w:lang w:val="es-GT"/>
         </w:rPr>
-        <w:t xml:space="preserve"> cuantomecuesta.com/gt/seguro-vehicular/.</w:t>
+        <w:t xml:space="preserve"> cuantomecuesta.com/</w:t>
+      </w:r>
+      <w:proofErr w:type="spellStart"/>
+      <w:r>
+        <w:rPr>
+          <w:lang w:val="es-GT"/>
+        </w:rPr>
+        <w:t>gt</w:t>
+      </w:r>
+      <w:proofErr w:type="spellEnd"/>
+      <w:r>
+        <w:rPr>
+          <w:lang w:val="es-GT"/>
+        </w:rPr>
+        <w:t>/seguro-vehicular/.</w:t>
       </w:r>
     </w:p>
     <w:p>
@@ -8810,11 +10797,13 @@
       </w:pPr>
       <w:bookmarkStart w:id="71" w:name="anexos"/>
       <w:bookmarkStart w:id="72" w:name="_Toc240103756"/>
+      <w:proofErr w:type="spellStart"/>
       <w:r>
         <w:t>Anexos</w:t>
       </w:r>
       <w:bookmarkEnd w:id="71"/>
       <w:bookmarkEnd w:id="72"/>
+      <w:proofErr w:type="spellEnd"/>
     </w:p>
     <w:p>
       <w:pPr>
@@ -8840,6 +10829,7 @@
         </w:rPr>
         <w:t xml:space="preserve"> Notebook completo (</w:t>
       </w:r>
+      <w:proofErr w:type="spellStart"/>
       <w:r>
         <w:rPr>
           <w:rStyle w:val="ClarkdownCode0"/>
@@ -8847,11 +10837,40 @@
         </w:rPr>
         <w:t>TFM_Analisis_Completo.ipynb</w:t>
       </w:r>
-      <w:r>
-        <w:rPr>
-          <w:lang w:val="es-GT"/>
-        </w:rPr>
-        <w:t>) — descarga de datos, ETL, EDA, feature engineering, modelado, evaluación e interpretabilidad, ejecutable de principio a fin, con la salida completa de la validación cruzada por pliegue. Detecta automáticamente qué librerías opcionales están instaladas y degrada de forma controlada si alguna falta.</w:t>
+      <w:proofErr w:type="spellEnd"/>
+      <w:r>
+        <w:rPr>
+          <w:lang w:val="es-GT"/>
+        </w:rPr>
+        <w:t xml:space="preserve">) — descarga de datos, ETL, EDA, </w:t>
+      </w:r>
+      <w:proofErr w:type="spellStart"/>
+      <w:r>
+        <w:rPr>
+          <w:lang w:val="es-GT"/>
+        </w:rPr>
+        <w:t>feature</w:t>
+      </w:r>
+      <w:proofErr w:type="spellEnd"/>
+      <w:r>
+        <w:rPr>
+          <w:lang w:val="es-GT"/>
+        </w:rPr>
+        <w:t xml:space="preserve"> </w:t>
+      </w:r>
+      <w:proofErr w:type="spellStart"/>
+      <w:r>
+        <w:rPr>
+          <w:lang w:val="es-GT"/>
+        </w:rPr>
+        <w:t>engineering</w:t>
+      </w:r>
+      <w:proofErr w:type="spellEnd"/>
+      <w:r>
+        <w:rPr>
+          <w:lang w:val="es-GT"/>
+        </w:rPr>
+        <w:t>, modelado, evaluación e interpretabilidad, ejecutable de principio a fin, con la salida completa de la validación cruzada por pliegue. Detecta automáticamente qué librerías opcionales están instaladas y degrada de forma controlada si alguna falta.</w:t>
       </w:r>
     </w:p>
     <w:p>
@@ -8992,7 +11011,63 @@
         <w:rPr>
           <w:lang w:val="es-GT"/>
         </w:rPr>
-        <w:t xml:space="preserve"> como subconjunto mínimo para desplegar las aplicaciones) e hiperparámetros completos de cada búsqueda del Capítulo 4.3, incluidas las versiones de XGBoost, LightGBM y Optuna usadas para los resultados finales.</w:t>
+        <w:t xml:space="preserve"> como subconjunto mínimo para desplegar las aplicaciones) e </w:t>
+      </w:r>
+      <w:proofErr w:type="spellStart"/>
+      <w:r>
+        <w:rPr>
+          <w:lang w:val="es-GT"/>
+        </w:rPr>
+        <w:t>hiperparámetros</w:t>
+      </w:r>
+      <w:proofErr w:type="spellEnd"/>
+      <w:r>
+        <w:rPr>
+          <w:lang w:val="es-GT"/>
+        </w:rPr>
+        <w:t xml:space="preserve"> completos de cada búsqueda del Capítulo 4.3, incluidas las versiones de </w:t>
+      </w:r>
+      <w:proofErr w:type="spellStart"/>
+      <w:r>
+        <w:rPr>
+          <w:lang w:val="es-GT"/>
+        </w:rPr>
+        <w:t>XGBoost</w:t>
+      </w:r>
+      <w:proofErr w:type="spellEnd"/>
+      <w:r>
+        <w:rPr>
+          <w:lang w:val="es-GT"/>
+        </w:rPr>
+        <w:t xml:space="preserve">, </w:t>
+      </w:r>
+      <w:proofErr w:type="spellStart"/>
+      <w:r>
+        <w:rPr>
+          <w:lang w:val="es-GT"/>
+        </w:rPr>
+        <w:t>LightGBM</w:t>
+      </w:r>
+      <w:proofErr w:type="spellEnd"/>
+      <w:r>
+        <w:rPr>
+          <w:lang w:val="es-GT"/>
+        </w:rPr>
+        <w:t xml:space="preserve"> y </w:t>
+      </w:r>
+      <w:proofErr w:type="spellStart"/>
+      <w:r>
+        <w:rPr>
+          <w:lang w:val="es-GT"/>
+        </w:rPr>
+        <w:t>Optuna</w:t>
+      </w:r>
+      <w:proofErr w:type="spellEnd"/>
+      <w:r>
+        <w:rPr>
+          <w:lang w:val="es-GT"/>
+        </w:rPr>
+        <w:t xml:space="preserve"> usadas para los resultados finales.</w:t>
       </w:r>
     </w:p>
     <w:p>
@@ -9017,7 +11092,21 @@
         <w:rPr>
           <w:lang w:val="es-GT"/>
         </w:rPr>
-        <w:t xml:space="preserve"> Módulo de scoring compartido y scripts de automatización (</w:t>
+        <w:t xml:space="preserve"> Módulo de </w:t>
+      </w:r>
+      <w:proofErr w:type="spellStart"/>
+      <w:r>
+        <w:rPr>
+          <w:lang w:val="es-GT"/>
+        </w:rPr>
+        <w:t>scoring</w:t>
+      </w:r>
+      <w:proofErr w:type="spellEnd"/>
+      <w:r>
+        <w:rPr>
+          <w:lang w:val="es-GT"/>
+        </w:rPr>
+        <w:t xml:space="preserve"> compartido y scripts de automatización (</w:t>
       </w:r>
       <w:r>
         <w:rPr>
@@ -9124,7 +11213,21 @@
         <w:rPr>
           <w:lang w:val="es-GT"/>
         </w:rPr>
-        <w:t>. Las tres que sostienen directamente un argumento del texto —tasa de fatalidad por hora, matriz de confusión del holdout y resumen SHAP— están en el cuerpo de la memoria; aquí se recogen las restantes.</w:t>
+        <w:t xml:space="preserve">. Las tres que sostienen directamente un argumento del texto —tasa de fatalidad por hora, matriz de confusión del </w:t>
+      </w:r>
+      <w:proofErr w:type="spellStart"/>
+      <w:r>
+        <w:rPr>
+          <w:lang w:val="es-GT"/>
+        </w:rPr>
+        <w:t>holdout</w:t>
+      </w:r>
+      <w:proofErr w:type="spellEnd"/>
+      <w:r>
+        <w:rPr>
+          <w:lang w:val="es-GT"/>
+        </w:rPr>
+        <w:t xml:space="preserve"> y resumen SHAP— están en el cuerpo de la memoria; aquí se recogen las restantes.</w:t>
       </w:r>
     </w:p>
     <w:p>
@@ -9208,7 +11311,21 @@
         <w:rPr>
           <w:lang w:val="es-GT"/>
         </w:rPr>
-        <w:t xml:space="preserve"> De 15.6% en 2018 a 21.0% en 2024 — la razón por la que el holdout se fijó fuera de tiempo y no de forma aleatoria (Capítulo 2.4).</w:t>
+        <w:t xml:space="preserve"> De 15.6% en 2018 a 21.0% en 2024 — la razón por la que el </w:t>
+      </w:r>
+      <w:proofErr w:type="spellStart"/>
+      <w:r>
+        <w:rPr>
+          <w:lang w:val="es-GT"/>
+        </w:rPr>
+        <w:t>holdout</w:t>
+      </w:r>
+      <w:proofErr w:type="spellEnd"/>
+      <w:r>
+        <w:rPr>
+          <w:lang w:val="es-GT"/>
+        </w:rPr>
+        <w:t xml:space="preserve"> se fijó fuera de tiempo y no de forma aleatoria (Capítulo 2.4).</w:t>
       </w:r>
     </w:p>
     <w:p>
@@ -9626,7 +11743,21 @@
         <w:rPr>
           <w:lang w:val="es-GT"/>
         </w:rPr>
-        <w:t xml:space="preserve"> Claude, de Anthropic, empleado entre el 29 de agosto y el 11 de septiembre de 2026 a través de su aplicación de escritorio. Los modelos configurados durante el trabajo fueron Claude Sonnet 5 y, en la fase final, Claude Opus 5.</w:t>
+        <w:t xml:space="preserve"> Claude, de </w:t>
+      </w:r>
+      <w:proofErr w:type="spellStart"/>
+      <w:r>
+        <w:rPr>
+          <w:lang w:val="es-GT"/>
+        </w:rPr>
+        <w:t>Anthropic</w:t>
+      </w:r>
+      <w:proofErr w:type="spellEnd"/>
+      <w:r>
+        <w:rPr>
+          <w:lang w:val="es-GT"/>
+        </w:rPr>
+        <w:t>, empleado entre el 29 de agosto y el 11 de septiembre de 2026 a través de su aplicación de escritorio. Los modelos configurados durante el trabajo fueron Claude Sonnet 5 y, en la fase final, Claude Opus 5.</w:t>
       </w:r>
     </w:p>
     <w:p>
@@ -9697,7 +11828,35 @@
         <w:rPr>
           <w:lang w:val="es-GT"/>
         </w:rPr>
-        <w:t xml:space="preserve"> apoyo en la consolidación del notebook, depuración de errores, construcción del módulo de scoring compartido, los scripts de automatización y las dos aplicaciones de Streamlit, y la organización final del repositorio.</w:t>
+        <w:t xml:space="preserve"> apoyo en la consolidación del notebook, depuración de errores, construcción del módulo de </w:t>
+      </w:r>
+      <w:proofErr w:type="spellStart"/>
+      <w:r>
+        <w:rPr>
+          <w:lang w:val="es-GT"/>
+        </w:rPr>
+        <w:t>scoring</w:t>
+      </w:r>
+      <w:proofErr w:type="spellEnd"/>
+      <w:r>
+        <w:rPr>
+          <w:lang w:val="es-GT"/>
+        </w:rPr>
+        <w:t xml:space="preserve"> compartido, los scripts de automatización y las dos aplicaciones de </w:t>
+      </w:r>
+      <w:proofErr w:type="spellStart"/>
+      <w:r>
+        <w:rPr>
+          <w:lang w:val="es-GT"/>
+        </w:rPr>
+        <w:t>Streamlit</w:t>
+      </w:r>
+      <w:proofErr w:type="spellEnd"/>
+      <w:r>
+        <w:rPr>
+          <w:lang w:val="es-GT"/>
+        </w:rPr>
+        <w:t>, y la organización final del repositorio.</w:t>
       </w:r>
     </w:p>
     <w:p>
@@ -9747,7 +11906,21 @@
         <w:rPr>
           <w:lang w:val="es-GT"/>
         </w:rPr>
-        <w:t xml:space="preserve"> exploración de alternativas —algoritmos, estrategias de búsqueda de hiperparámetros, diseño de la propuesta de recolección— cuya adopción o descarte decidió el autor.</w:t>
+        <w:t xml:space="preserve"> exploración de alternativas —algoritmos, estrategias de búsqueda de </w:t>
+      </w:r>
+      <w:proofErr w:type="spellStart"/>
+      <w:r>
+        <w:rPr>
+          <w:lang w:val="es-GT"/>
+        </w:rPr>
+        <w:t>hiperparámetros</w:t>
+      </w:r>
+      <w:proofErr w:type="spellEnd"/>
+      <w:r>
+        <w:rPr>
+          <w:lang w:val="es-GT"/>
+        </w:rPr>
+        <w:t>, diseño de la propuesta de recolección— cuya adopción o descarte decidió el autor.</w:t>
       </w:r>
     </w:p>
     <w:p>
@@ -9767,21 +11940,70 @@
         <w:rPr>
           <w:lang w:val="es-GT"/>
         </w:rPr>
-        <w:t xml:space="preserve"> La elección del tema y de la fuente de datos, la definición de los objetivos, las decisiones metodológicas —incluida la de mantener LightGBM como modelo final pese a que HistGradientBoosting obtiene un valor ligeramente superior en el holdout—, la ejecución de todos los experimentos y la interpretación de los resultados corresponden al autor. Ninguna cifra de esta memoria procede de la herramienta: todas se leyeron de las salidas del notebook ejecutado en el equipo del autor.</w:t>
-      </w:r>
-    </w:p>
-    <w:p>
-      <w:pPr>
-        <w:rPr>
-          <w:lang w:val="es-GT"/>
-        </w:rPr>
-      </w:pPr>
-      <w:r>
-        <w:rPr>
-          <w:b/>
-          <w:lang w:val="es-GT"/>
-        </w:rPr>
-        <w:t>Reflexión crítica sobre su aporte y sus limitaciones. El uso resultó productivo en dos frentes: aceleró la redacción, y ayudó a resolver problemas de compatibilidad en librerías.</w:t>
+        <w:t xml:space="preserve"> La elección del tema y de la fuente de datos, la definición de los objetivos, las decisiones metodológicas —incluida la de mantener </w:t>
+      </w:r>
+      <w:proofErr w:type="spellStart"/>
+      <w:r>
+        <w:rPr>
+          <w:lang w:val="es-GT"/>
+        </w:rPr>
+        <w:t>LightGBM</w:t>
+      </w:r>
+      <w:proofErr w:type="spellEnd"/>
+      <w:r>
+        <w:rPr>
+          <w:lang w:val="es-GT"/>
+        </w:rPr>
+        <w:t xml:space="preserve"> como modelo final pese a que </w:t>
+      </w:r>
+      <w:proofErr w:type="spellStart"/>
+      <w:r>
+        <w:rPr>
+          <w:lang w:val="es-GT"/>
+        </w:rPr>
+        <w:t>HistGradientBoosting</w:t>
+      </w:r>
+      <w:proofErr w:type="spellEnd"/>
+      <w:r>
+        <w:rPr>
+          <w:lang w:val="es-GT"/>
+        </w:rPr>
+        <w:t xml:space="preserve"> obtiene un valor ligeramente superior en el </w:t>
+      </w:r>
+      <w:proofErr w:type="spellStart"/>
+      <w:r>
+        <w:rPr>
+          <w:lang w:val="es-GT"/>
+        </w:rPr>
+        <w:t>holdout</w:t>
+      </w:r>
+      <w:proofErr w:type="spellEnd"/>
+      <w:r>
+        <w:rPr>
+          <w:lang w:val="es-GT"/>
+        </w:rPr>
+        <w:t>—, la ejecución de todos los experimentos y la interpretación de los resultados corresponden al autor. Ninguna cifra de esta memoria procede de la herramienta: todas se leyeron de las salidas del notebook ejecutado en el equipo del autor.</w:t>
+      </w:r>
+    </w:p>
+    <w:p>
+      <w:pPr>
+        <w:rPr>
+          <w:lang w:val="es-GT"/>
+        </w:rPr>
+      </w:pPr>
+      <w:r>
+        <w:rPr>
+          <w:b/>
+          <w:lang w:val="es-GT"/>
+        </w:rPr>
+        <w:t xml:space="preserve">Reflexión crítica sobre su aporte y sus limitaciones. </w:t>
+      </w:r>
+      <w:r>
+        <w:rPr>
+          <w:bCs/>
+          <w:lang w:val="es-GT"/>
+        </w:rPr>
+        <w:t>El uso resultó productivo en dos frentes: aceleró la redacción, y ayudó a resolver problemas de compatibilidad en librerías.</w:t>
       </w:r>
     </w:p>
     <w:p>
@@ -9796,6 +12018,7 @@
         </w:rPr>
         <w:t xml:space="preserve">Sus limitaciones se manifestaron con igual claridad. La herramienta introdujo errores propios que hubo que corregir, como una cifra de </w:t>
       </w:r>
+      <w:proofErr w:type="spellStart"/>
       <w:r>
         <w:rPr>
           <w:i/>
@@ -9803,6 +12026,7 @@
         </w:rPr>
         <w:t>recall</w:t>
       </w:r>
+      <w:proofErr w:type="spellEnd"/>
       <w:r>
         <w:rPr>
           <w:lang w:val="es-GT"/>

</xml_diff>